<commit_message>
Polish report sentence by sentence and update downloadable documents
</commit_message>
<xml_diff>
--- a/data/report.docx
+++ b/data/report.docx
@@ -87,7 +87,7 @@
           <w:szCs w:val="32"/>
           <w:lang w:val="en-US" w:eastAsia="zh-CN" w:bidi="ar"/>
         </w:rPr>
-        <w:t>摘要：本研究设计了一套结合年级和班级出发时间的校园就餐方案，目的是缩短高中学生的平均就餐排队时间。研究先比较不实行错峰、仅按年级错峰、年级与班级结合错峰三种安排，再比较相邻班组采用不同出发间隔的效果。软件根据学生出发、到达、打饭和用餐的先后过程计算等待时间，通过三维回放和图表展示结果，并生成班级放行表。比较结果表明，在年级错峰的基础上进一步分散各班出发时间，可以减少窗口前集中排队。选择班组间隔时，还应结合完整用时和末批学生返回教室的时刻，使排队改善与午间安排相协调。</w:t>
+        <w:t>摘要：本研究针对高中学生午餐排队问题，设计了一套按年级和班级安排出发时间的就餐方案，目的是缩短学生在打饭窗口前的平均排队时间。研究在相同人数和食堂资源条件下，比较不实行错峰、仅按年级错峰、年级与班级结合错峰三种安排，再比较相邻班级按不同时间间隔出发的效果。配套开发的仿真软件用于计算各环节用时、展示三维就餐过程，并生成班级放行表。结果显示，在年级错峰的基础上进一步错开各班的出发时间，能够缩短学生在窗口前的平均排队时间。学校可根据就餐人数和窗口接待速度确定出发间隔，再结合午间可用时间调整安排，让学生少站队、按时返回教室。</w:t>
       </w:r>
     </w:p>
     <w:p>
@@ -214,7 +214,7 @@
           <w:szCs w:val="32"/>
           <w:lang w:val="en-US" w:eastAsia="zh-CN" w:bidi="ar"/>
         </w:rPr>
-        <w:t>高中学生通常按班级上课，午餐又集中在相近时段。下课后，多个班同时走向食堂，打饭窗口需要连续接待大量学生。即使食堂有多个窗口，短时间内到达的人数超过接待速度，仍会形成较长的队伍。</w:t>
+        <w:t>高中午餐时间，多个班的学生往往在下课后同时前往食堂。即使开放多个打饭窗口，只要同一时段到达的学生人数超过这些窗口能够接待的人数，队伍就会逐渐变长。</w:t>
       </w:r>
     </w:p>
     <w:p>
@@ -255,7 +255,7 @@
           <w:szCs w:val="32"/>
           <w:lang w:val="en-US" w:eastAsia="zh-CN" w:bidi="ar"/>
         </w:rPr>
-        <w:t>部分学校已在公开管理方案中安排不同年级错时就餐[1]，也有学校将同一年级分为不同班组，在不同时刻用餐[2]。年级错峰可以分散不同年级的学生，但同一年级的多个班若一起出发，仍可能集中到达。因此，可以在年级安排的基础上，进一步比较各班出发顺序和间隔。</w:t>
+        <w:t>部分学校已在公开方案中规定不同年级错时就餐[1]，也有学校将同一年级的各班分成几批，安排在不同时刻用餐[2]。按年级错峰能错开不同年级的就餐时间，但同一年级的多个班一起出发，仍可能在食堂集中排队。因此，本研究进一步考虑各班什么时候出发，以及前后两个班应相隔多久。</w:t>
       </w:r>
     </w:p>
     <w:p>
@@ -296,7 +296,7 @@
           <w:szCs w:val="32"/>
           <w:lang w:val="en-US" w:eastAsia="zh-CN" w:bidi="ar"/>
         </w:rPr>
-        <w:t>评价学生就餐方案的关键，是看学生的平均就餐排队时间是否缩短，同时检查从允许出发到返回教室的完整用时。推迟班级出发时间，可能缩短到达食堂后的排队时间，但出发前的等待同样占用午间时间。把这部分等待计入比较，才能看清方案调整带来的实际变化。</w:t>
+        <w:t>评价学生就餐方案的关键，是看全体学生的平均就餐排队时间能否缩短。同时，还要计算从统一的午餐起始时刻到学生返回教室一共需要多久。推迟出发可能缩短学生在食堂的排队时间，却也增加了他们在教室等待出发的时间。因此，比较方案时要把出发前的等待一并计入，才能判断整个午餐安排是否合适。</w:t>
       </w:r>
     </w:p>
     <w:p>
@@ -382,7 +382,7 @@
           <w:szCs w:val="32"/>
           <w:lang w:val="en-US" w:eastAsia="zh-CN" w:bidi="ar"/>
         </w:rPr>
-        <w:t>本研究希望回答两个问题：第一，在相同人数和食堂资源条件下，不实行错峰、仅按年级错峰、年级与班级结合错峰，哪种安排的平均就餐排队时间更短；第二，在年级与班级结合错峰的安排中，相邻两组间隔多少秒更合适。根据计算结果形成具体的班级放行表，并说明学校实际调整方案时应记录哪些情况。</w:t>
+        <w:t>本研究需要回答两个问题：在就餐人数、开放窗口数量和座位数量相同的条件下，三种就餐安排中，哪一种能让学生的平均排队时间更短；采用年级与班级结合错峰时，连续出发的两个班相隔多久更合适。根据比较结果编制班级放行表，列出各班的出发时刻，供学校调整就餐安排时参考。</w:t>
       </w:r>
     </w:p>
     <w:p>
@@ -468,7 +468,7 @@
           <w:szCs w:val="32"/>
           <w:lang w:val="en-US" w:eastAsia="zh-CN" w:bidi="ar"/>
         </w:rPr>
-        <w:t>研究通过网络检索整理学校公开用餐方案和中文食堂排队研究。公开方案用于了解已有的年级错峰和班组分批做法；高渝淳等整理了排队、寻找座位和食堂资源之间的关系[3]，何恒等比较了餐厅不同环节的衔接[4]，刘兴果等研究了到餐人数随时段变化及窗口排队问题[5]。这些资料为出发安排、窗口接待和座位使用的比较提供了参考。</w:t>
+        <w:t>本研究通过网络检索，查阅了学校公开的用餐管理方案和国内有关食堂排队的论文。学校公开方案提供了按年级错时、按班级分批的安排实例。高渝淳等梳理了排队、寻找座位以及窗口和座位安排等问题[3]；何恒等比较了快餐厅流程调整前后的变化[4]；刘兴果等研究了不同时段到餐人数变化对窗口排队的影响[5]。本研究参考这些资料，比较各班的出发安排，并记录排队和等座时间。</w:t>
       </w:r>
     </w:p>
     <w:p>
@@ -509,7 +509,7 @@
           <w:szCs w:val="32"/>
           <w:lang w:val="en-US" w:eastAsia="zh-CN" w:bidi="ar"/>
         </w:rPr>
-        <w:t>为便于直接比较，本研究设定一个三个年级共1610人的高中就餐示例：高一580人、高二530人、高三500人，分别分为12、11、10组，用每组约50人代表一个班。人数、窗口数、座位数和相关时间均为示例参数；学校在实际进行学生就餐方案调整时，可按实际班级人数和食堂记录替换。</w:t>
+        <w:t>本研究设置三个年级共1610人参加午餐的示例，其中高一580人、高二530人、高三500人，分别分为12、11、10组。每组约50人，在软件中代表一个班；下文的“相邻组间隔”，就是连续出发的两个班之间的时间间隔。人数、窗口数量、座位数量和各环节用时均作为示例参数。学校在实际进行学生就餐方案调整时，可按本校班级人数和食堂记录修改这些参数。</w:t>
       </w:r>
     </w:p>
     <w:p>
@@ -595,7 +595,7 @@
           <w:szCs w:val="32"/>
           <w:lang w:val="en-US" w:eastAsia="zh-CN" w:bidi="ar"/>
         </w:rPr>
-        <w:t>将一次午餐分为等待出发、走到食堂、排队打饭、取餐后入座、用餐和返程几个环节。三种方案只改变出发安排，其他条件保持一致。这样，排队时间的差别就能对应到学生何时到达食堂，而不会混入人数或窗口数量变化的影响。</w:t>
+        <w:t>软件将一次午餐分为等待出发、步行到食堂、排队打饭、取餐后入座、用餐和返回教室几个环节。比较三种方案时，只改变各班的出发时刻，其他条件保持一致。这样才能看出，改变出发安排会对排队时间产生什么影响。</w:t>
       </w:r>
     </w:p>
     <w:p>
@@ -718,7 +718,7 @@
           <w:szCs w:val="32"/>
           <w:lang w:val="en-US" w:eastAsia="zh-CN" w:bidi="ar"/>
         </w:rPr>
-        <w:t>先用一组明确的规则比较三种安排，再保持年级顺序不变，逐一改变相邻班组的出发间隔。选择方案时以全体学生的平均排队时间为主要指标，同时查看等座、完整用时和末批返回时刻。软件把每一步计算记录下来，并把选中的方案转成班级放行表。</w:t>
+        <w:t>研究分两步展开：先比较三种安排，再固定年级顺序，比较不同的相邻组间隔。选择方案的主要依据是全体学生的平均排队时间，同时查看取餐后等座的时间、从午餐开始到返回教室的总用时，以及最后一名学生返回教室的时刻。软件保存各次计算结果，并按所选方案生成班级放行表。</w:t>
       </w:r>
     </w:p>
     <w:p>
@@ -1234,7 +1234,7 @@
                 <w:color w:val="000000"/>
                 <w:sz w:val="24"/>
               </w:rPr>
-              <w:t>共同允许出发</w:t>
+              <w:t>午餐起始时刻</w:t>
             </w:r>
           </w:p>
         </w:tc>
@@ -1448,7 +1448,7 @@
           <w:szCs w:val="32"/>
           <w:lang w:val="en-US" w:eastAsia="zh-CN" w:bidi="ar"/>
         </w:rPr>
-        <w:t>各窗口的平均打饭时间相同，每名学生实际打饭和用餐时间仍有随机波动。同一轮比较让同一名学生保持相同的集合、步行、打饭和用餐条件。每组计算30次，避免由某一次快慢差异决定结论。</w:t>
+        <w:t>示例中，各窗口平均每20秒为一名学生打好饭，但每名学生的打饭和用餐时间会有快慢差异。比较不同方案或间隔时，程序为同一名学生使用相同的集合时间、走到食堂所需的时间、打饭时间和用餐时间，只改变其所在班级的出发时刻。每种方案或间隔都重复计算30次，再比较平均结果，以减少偶然快慢造成的影响。第一阶段、第二阶段和最终复核使用不同批次的随机用时。</w:t>
       </w:r>
     </w:p>
     <w:p>
@@ -1538,7 +1538,7 @@
           <w:szCs w:val="32"/>
           <w:lang w:val="en-US" w:eastAsia="zh-CN" w:bidi="ar"/>
         </w:rPr>
-        <w:t>软件按“设置参数—计算就餐过程—比较结果—生成放行表”的顺序组织。参数设置页填写各年级人数、开放窗口数量、可用座位数量和各环节用时；方案比较页先运行三种安排，再切换到出发间隔比较。两步共用同一套计算方法，修改人数或资源后需要重新计算。</w:t>
+        <w:t>使用软件时，先填写各年级人数、开放窗口数量、可用座位数量和各环节用时，再进入“方案比较”页面。这个页面先比较三种安排，再比较不同的出发间隔，最后生成班级放行表。两步使用相同的计算方法；人数、窗口或座位数量改变后，应重新比较。</w:t>
       </w:r>
     </w:p>
     <w:p>
@@ -1661,7 +1661,7 @@
           <w:szCs w:val="32"/>
           <w:lang w:val="en-US" w:eastAsia="zh-CN" w:bidi="ar"/>
         </w:rPr>
-        <w:t>网页界面、就餐计算和三维回放使用JavaScript编写，放行表整理与核对使用Python。JavaScript根据每名学生到达、开始打饭、取餐结束、入座和返回的时刻，计算排队及完整用时；三维页面读取同一份记录，展示学生从窗口端盘走到餐桌并入座的过程。</w:t>
+        <w:t>网页界面、就餐过程计算和三维回放均用JavaScript编写。另外编写了Python工具，独立生成放行表，并与网页导出的放行表核对。网页程序记录每名学生到达窗口、开始打饭、取餐结束、入座和返回教室的时刻，据此计算排队时间和完整用时。三维页面使用这些记录，展示学生排队、取餐、端盘走到餐桌和入座的过程，使计算结果更容易理解。</w:t>
       </w:r>
     </w:p>
     <w:p>
@@ -1784,7 +1784,7 @@
           <w:szCs w:val="32"/>
           <w:lang w:val="en-US" w:eastAsia="zh-CN" w:bidi="ar"/>
         </w:rPr>
-        <w:t>Python放行表工具使用两层for循环：外层按轮次排列，内层按年级顺序排列。if语句判断该年级是否还有未出发的班级；有班级时，用“出发位置×相邻组间隔”计算出发秒数。下面节选实际运行的代码：</w:t>
+        <w:t>Python放行表工具用两层for循环安排各班的出发时刻。外层循环表示第几轮，内层循环则按高三、高二、高一的顺序，每次安排一个班。if语句用来判断该年级是否还有班级未出发；如果有，就计算这个班比统一起始时刻晚出发多少秒，并将结果加入放行表。相关代码如下：</w:t>
       </w:r>
     </w:p>
     <w:p>
@@ -2071,7 +2071,7 @@
           <w:szCs w:val="32"/>
           <w:lang w:val="en-US" w:eastAsia="zh-CN" w:bidi="ar"/>
         </w:rPr>
-        <w:t>其中，class_counts保存各年级的班组数，order保存年级顺序，gap_seconds表示相邻组间隔。range和enumerate分别用于逐轮循环和同时取得年级及其位置。最后用列表的append方法保存年级、班序和出发时间。Python生成的33行放行表与网页导出的结果逐行一致。</w:t>
+        <w:t>代码中，class_counts保存各年级的班级数，order保存年级顺序，gap_seconds表示相邻组间隔，单位为秒。round_index从0开始计数，表示当前轮次；position同样从0开始，表示该年级在一轮中的位置。将轮次乘以年级数，再加上年级所在的位置，就得到这个班从0起算的出发序号；出发序号乘以相邻组间隔，便得到它相对起始时刻的出发秒数。range用于生成轮次，enumerate用于同时取出年级及其位置，append则把年级、班序和出发秒数加入列表。Python生成的33行放行表已与网页导出的结果逐行核对，内容一致。</w:t>
       </w:r>
     </w:p>
     <w:p>
@@ -2161,7 +2161,7 @@
           <w:szCs w:val="32"/>
           <w:lang w:val="en-US" w:eastAsia="zh-CN" w:bidi="ar"/>
         </w:rPr>
-        <w:t>平均就餐排队时间用全体学生的排队时间之和除以就餐人数。三个年级人数不同，所以先把每名学生的时间相加，再除以总人数，不直接平均三个年级的平均值。</w:t>
+        <w:t>每名学生从加入窗口队伍到开始打饭所经过的时间，就是他的排队时间。将所有学生的排队时间相加，再除以就餐总人数，就得到平均就餐排队时间。由于三个年级人数不同，应按每名学生计算，再求全体平均值。</w:t>
       </w:r>
     </w:p>
     <w:p>
@@ -2243,7 +2243,7 @@
           <w:szCs w:val="32"/>
           <w:lang w:val="en-US" w:eastAsia="zh-CN" w:bidi="ar"/>
         </w:rPr>
-        <w:t>选择窗口时，同时考虑正在打饭的人还需多久、前方等候人数和窗口平均打饭时间。设前方有q人等待，每人平均打饭需要m秒，当前服务预计还需r秒，则本人预计取到饭还需要：</w:t>
+        <w:t>学生到达食堂后，软件会估算他在各个窗口取到饭所需的时间，并选择预计取餐更快的窗口。设某窗口当前一名学生还需r秒打好饭，另有q人在排队，每人平均打饭需要m秒。那么，新到的学生预计还需等待前面的人打完饭，再用m秒完成自己的取餐，所需时间为：</w:t>
       </w:r>
     </w:p>
     <w:p>
@@ -2325,7 +2325,7 @@
           <w:szCs w:val="32"/>
           <w:lang w:val="en-US" w:eastAsia="zh-CN" w:bidi="ar"/>
         </w:rPr>
-        <w:t>例如，甲窗口空闲，每份饭需30秒；乙窗口当前服务还需5秒，每份饭需10秒，后面没有人等候。此时本人在甲窗口预计需30秒，在乙窗口预计需15秒。软件按预计完成取餐更早的窗口选择队伍，见图4。</w:t>
+        <w:t>例如，甲窗口空闲，为一名学生打饭需要30秒；乙窗口正在为一名学生打饭，预计再过5秒完成，且没有其他人排队，之后每人打饭需要10秒。新到的学生若选甲窗口，预计30秒取到饭；若选乙窗口，预计5＋10＝15秒取到饭。因此，软件会选择乙窗口，见图4。</w:t>
       </w:r>
     </w:p>
     <w:p>
@@ -2448,7 +2448,7 @@
           <w:szCs w:val="32"/>
           <w:lang w:val="en-US" w:eastAsia="zh-CN" w:bidi="ar"/>
         </w:rPr>
-        <w:t>完整用时从共同允许出发的11:50算到学生返回教室，包括延后出发、集合、步行、排队、打饭、等座、端盘入座、用餐和返程。末名返回时刻取每轮最后一名学生的返回时刻，与平均完整用时分别记录。</w:t>
+        <w:t>本研究将11:50设为统一的午餐起始时刻。每名学生从这一时刻到返回教室所经过的时间称为“完整用时”，包括等待出发、集合、步行、排队、打饭、等座、端盘入座、用餐和返程。将全体学生的完整用时相加，再除以总人数，得到平均完整用时。此外，每次计算还单独记录最后一名学生返回教室的时刻，用来检查是否晚于13:00。</w:t>
       </w:r>
     </w:p>
     <w:p>
@@ -2489,7 +2489,7 @@
           <w:szCs w:val="32"/>
           <w:lang w:val="en-US" w:eastAsia="zh-CN" w:bidi="ar"/>
         </w:rPr>
-        <w:t>一个窗口平均20秒完成一份饭，每分钟约接待60÷20＝3人，16个窗口每分钟约接待48人。一组约50人完成取餐约需50÷48≈1.04分钟，因此先用60秒作为班组间隔，再比较更短和更长的间隔。走路时间也可用高中物理中的“时间＝路程÷平均速度”核对。</w:t>
+        <w:t>一个窗口平均20秒为一名学生打好饭，每分钟约可接待60÷20＝3人，16个窗口合计每分钟约可接待48人。如果16个窗口都持续打饭，处理约50人的取餐需求需要50÷48≈1.04分钟。根据这个估算，先取60秒作为相邻组间隔，再比较更短和更长的间隔。步行用时则可用高中物理中的“时间＝路程÷平均速度”估算和核对。</w:t>
       </w:r>
     </w:p>
     <w:p>
@@ -2683,7 +2683,7 @@
                 <w:color w:val="000000"/>
                 <w:sz w:val="24"/>
               </w:rPr>
-              <w:t>三个年级的所有班组均在11:50允许出发</w:t>
+              <w:t>三个年级的所有班级均可在11:50出发</w:t>
             </w:r>
           </w:p>
         </w:tc>
@@ -2805,7 +2805,7 @@
                 <w:color w:val="000000"/>
                 <w:sz w:val="24"/>
               </w:rPr>
-              <w:t>按高三、高二、高一轮流出发，每次一组，相邻组初始间隔60秒</w:t>
+              <w:t>高三、高二、高一各出发一个班，再重复这一顺序；相邻组初始间隔60秒</w:t>
             </w:r>
           </w:p>
         </w:tc>
@@ -2930,7 +2930,7 @@
           <w:szCs w:val="32"/>
           <w:lang w:val="en-US" w:eastAsia="zh-CN" w:bidi="ar"/>
         </w:rPr>
-        <w:t>一个年级约500人，按每分钟48人的接待速度，取餐约需10分钟，因此年级间隔先取10分钟，再用5分钟、15分钟进行比较，检查结果是否只来自某一个间隔。三种方案的最早允许时刻和学生步行规则相同，同时允许出发也不等于同时到达窗口。</w:t>
+        <w:t>一个年级约500人，按16个窗口合计每分钟接待48人估算，让这个年级的学生都取到饭约需10分钟。因此，先将相邻年级的出发间隔设为10分钟，再补充比较5分钟和15分钟，查看年级间隔改变后，排队时间会怎样变化。三种方案都以11:50为最早出发时刻，集合和步行用时的设置也相同。各班即使同时出发，学生也会因集合和步行快慢不同而先后到达窗口。</w:t>
       </w:r>
     </w:p>
     <w:tbl>
@@ -3640,7 +3640,7 @@
           <w:szCs w:val="32"/>
           <w:lang w:val="en-US" w:eastAsia="zh-CN" w:bidi="ar"/>
         </w:rPr>
-        <w:t>初步比较中，平均排队时间由不实行错峰的15.29分钟，降到仅按年级错峰的5.09分钟，进一步分散到各班后为1.15分钟。按年级分开了几批较大的人群，按班级继续分散后，每次到达的人数更少，窗口能够接着处理后续班组。图中细线表示30次结果的最小值至最大值。</w:t>
+        <w:t>初步比较结果表明，不实行错峰时，学生平均排队15.29分钟；仅按年级错峰时，平均排队5.09分钟；按年级和班级共同安排出发时刻后，平均排队1.15分钟。年级错峰先错开了三个年级的到达时间，班级错峰又进一步减少了同一时段到达的学生人数，因此窗口前的队伍更短。图中横向细线表示30次计算中平均排队时间的最小值到最大值。</w:t>
       </w:r>
     </w:p>
     <w:p>
@@ -3730,7 +3730,7 @@
           <w:szCs w:val="32"/>
           <w:lang w:val="en-US" w:eastAsia="zh-CN" w:bidi="ar"/>
         </w:rPr>
-        <w:t>三个年级的先后顺序共有以下6种。本阶段固定高三、高二、高一的顺序，只改变相邻组间隔，使比较集中在间隔数值本身。</w:t>
+        <w:t>三个年级的先后顺序共有6种，可以用高中数学中的排列知识计算。本阶段固定高三、高二、高一的顺序，只改变相邻组间隔，以比较不同间隔对排队时间的影响。</w:t>
       </w:r>
     </w:p>
     <w:p>
@@ -3833,7 +3833,7 @@
           <w:szCs w:val="32"/>
           <w:lang w:val="en-US" w:eastAsia="zh-CN" w:bidi="ar"/>
         </w:rPr>
-        <w:t>先比较0、15、30、45、60、75、90、105、120秒九个间隔，再在满足返回目标且平均排队最短的初步结果附近补充50、55、65、70秒，共比较13个间隔。每个间隔计算30次。选择时先检查每轮末名学生是否都在13:00前返回，再从满足这一目标的候选中选平均排队时间最短的一项。</w:t>
+        <w:t>先比较0、15、30、45、60、75、90、105、120秒这9个间隔，每个间隔重复计算30次。先保留30次计算中均能让所有学生在13:00前返回的安排，再比较它们的平均排队时间。初步结果中，60秒的平均排队时间最短。于是，再比较它附近的50、55、65、70秒，共比较13个间隔。最后，仍按相同标准选择：先检查每次计算中所有学生能否按时返回，再从符合要求的间隔中选择平均排队时间最短的一项。</w:t>
       </w:r>
     </w:p>
     <w:tbl>
@@ -5713,7 +5713,7 @@
           <w:szCs w:val="32"/>
           <w:lang w:val="en-US" w:eastAsia="zh-CN" w:bidi="ar"/>
         </w:rPr>
-        <w:t>间隔从60秒增至70秒时，平均排队由1.07分钟降到0.53分钟，平均完整用时由34.92分钟增至36.86分钟。70秒时，30次中最晚返回为12:59:02，仍在本次返回目标内。75秒虽然排队更少，但最晚返回为13:01:40。因此，本次13个候选中选择70秒，并用另一组随机条件重新核对三种安排。</w:t>
+        <w:t>相邻组间隔由60秒增加到70秒时，平均排队时间从1.07分钟减少到0.53分钟，平均完整用时则从34.92分钟增加到36.86分钟。间隔为70秒时，30次计算中最后一名学生最晚在12:59:02返回教室，早于13:00；间隔为75秒时，排队时间更短，但最晚返回教室的时刻为13:01:40，已超过13:00。因此，在本次比较的13个间隔中选择70秒。随后重新生成全体学生的集合、步行、打饭和用餐时间，再计算三种方案，检查结果是否仍然成立。</w:t>
       </w:r>
     </w:p>
     <w:p>
@@ -6388,7 +6388,7 @@
           <w:szCs w:val="32"/>
           <w:lang w:val="en-US" w:eastAsia="zh-CN" w:bidi="ar"/>
         </w:rPr>
-        <w:t>最终复核中，仅按年级错峰的平均排队时间为5.05分钟，年级与班级结合错峰为0.54分钟，减少4.51分钟，约减少89.4%。对应平均完整用时增加3.53分钟。班级延后出发把一部分等待留在教室，窗口前排队明显减少，但整次就餐的平均完成时间有所延后。</w:t>
+        <w:t>重新计算后，仅按年级错峰时，学生平均排队5.05分钟；年级与班级结合错峰时，平均排队0.54分钟。两者相比，平均排队时间减少4.51分钟，约减少89.4%，平均完整用时增加3.53分钟。这是因为部分班级需要更晚出发：学生在食堂站队的时间缩短了，在教室等待出发的时间却增加了，返回教室的平均时刻也随之推后。</w:t>
       </w:r>
     </w:p>
     <w:tbl>
@@ -7016,7 +7016,7 @@
           <w:szCs w:val="32"/>
           <w:lang w:val="en-US" w:eastAsia="zh-CN" w:bidi="ar"/>
         </w:rPr>
-        <w:t>在另一组年级间隔检查中，仅按年级错峰的间隔取5、10、15分钟时，平均排队分别为10.21、5.03、4.31分钟。把年级间隔拉长也能减少排队，但每个年级仍会集中到达一批学生。本研究增加班级层面的间隔，是进一步分散这批人数。</w:t>
+        <w:t>另外，仅按年级错峰时，将相邻年级的出发间隔分别设为5、10、15分钟，得到的平均排队时间分别为10.21、5.03、4.31分钟。这说明，拉大年级间隔也能减少排队。不过，同一年级的各班仍在同一时刻出发，到达食堂的时间较为集中。再将出发安排细化到各班，可以进一步错开这部分学生的到达时间。</w:t>
       </w:r>
     </w:p>
     <w:tbl>
@@ -7638,7 +7638,7 @@
           <w:szCs w:val="32"/>
           <w:lang w:val="en-US" w:eastAsia="zh-CN" w:bidi="ar"/>
         </w:rPr>
-        <w:t>相邻两组间隔70秒，一个完整轮次为210秒，也就是3分30秒。同一年级相邻两组间隔3分30秒。某年级已经全部出发后，其余年级仍按表中原定时刻出发，保留空出的时段。完整33组放行表及全部660次计算记录随报告保存。</w:t>
+        <w:t>从高三第一个班出发，到高三第二个班出发，中间还安排高二、高一各一个班。按相邻两组间隔70秒计算，两次高三班级出发的间隔为3×70＝210秒，即3分30秒。同一年级其他相邻班级也按这一间隔出发。如果某个年级的所有班级已经出发，其余年级仍按原定时刻出发，不提前填补空出的时段。完整的33组放行表和660次计算记录与报告一同保存。</w:t>
       </w:r>
     </w:p>
     <w:p>
@@ -7724,7 +7724,7 @@
           <w:szCs w:val="32"/>
           <w:lang w:val="en-US" w:eastAsia="zh-CN" w:bidi="ar"/>
         </w:rPr>
-        <w:t>学校在实际进行学生就餐方案调整时，应先记录各年级实际就餐人数、各班下课时刻、开放窗口数量、打饭速度和可用座位数量。记录学生加入队伍与开始打饭的时刻，两者之差就是排队时间；同时记录末批学生开始用餐和返回教室的时刻。</w:t>
+        <w:t>学校在实际进行学生就餐方案调整时，应先记录各年级实际就餐人数、各班下课时刻、开放窗口数量、平均打饭时间和可用座位数量。观察排队时，要记录学生加入队伍和开始打饭的时刻，二者之差就是排队时间。同时记录末批学生何时开始用餐、何时返回教室，用来判断午餐安排是否过于紧张。</w:t>
       </w:r>
     </w:p>
     <w:p>
@@ -7765,7 +7765,7 @@
           <w:szCs w:val="32"/>
           <w:lang w:val="en-US" w:eastAsia="zh-CN" w:bidi="ar"/>
         </w:rPr>
-        <w:t>将记录输入软件后，按同样顺序比较三种安排，再比较班级间隔。选定方案后，在就餐人数、菜品和开放窗口相近的午餐中比较调整前后的记录。若末批返回过晚，可适当缩短班组间隔，或在集中到餐时段增开窗口；若主要在取餐后等座，应先检查座位周转。</w:t>
+        <w:t>将人数、窗口、座位和用时等参数输入软件后，先比较三种安排，再比较不同的相邻组间隔。选定方案并试行后，选择就餐人数、菜品和开放窗口数量相近的午餐日，比较调整前后的排队时间和返回时刻。如果末批学生返回过晚，可适当缩短出发间隔，或在学生集中到达的时段增开窗口；如果学生主要在取餐后等待座位，则应检查座位是否不足、已有座位能否及时腾出。</w:t>
       </w:r>
     </w:p>
     <w:p>
@@ -7851,7 +7851,7 @@
           <w:szCs w:val="32"/>
           <w:lang w:val="en-US" w:eastAsia="zh-CN" w:bidi="ar"/>
         </w:rPr>
-        <w:t>把错峰安排从年级进一步细化到班级，可以减少学生在打饭窗口前集中排队。在本次示例条件下，三种方案最终复核的平均排队时间依次为15.34、5.05和0.54分钟。年级与班级结合错峰的排队时间最短，能够作为学校细化就餐出发安排的一种思路。</w:t>
+        <w:t>本研究的比较结果表明，在年级错峰的基础上继续错开各班的出发时刻，可以减少学生在打饭窗口前的排队时间。最终复核中，不实行错峰、仅按年级错峰、年级与班级结合错峰的平均排队时间分别为15.34、5.05和0.54分钟。其中，年级与班级结合错峰的排队时间最短，可供学校安排各班就餐时参考。</w:t>
       </w:r>
     </w:p>
     <w:p>
@@ -7892,7 +7892,7 @@
           <w:szCs w:val="32"/>
           <w:lang w:val="en-US" w:eastAsia="zh-CN" w:bidi="ar"/>
         </w:rPr>
-        <w:t>出发间隔应同时考虑窗口接待速度和午间可用时间。本次13个候选中，相邻组间隔70秒在满足13:00返回目标的候选里平均排队最短，独立复核的最晚返回为12:56:34。相比仅按年级错峰，平均完整用时增加3.53分钟，说明减少食堂排队也需要安排好出发前的时间。</w:t>
+        <w:t>确定相邻班级的出发间隔时，应同时考虑窗口接待速度和午间可用时间。本次比较了13个间隔，选择70秒后，重新计算时最后一名学生最晚在12:56:34返回教室，符合13:00前返回的目标。相比仅按年级错峰，平均完整用时增加3.53分钟。因此，学校在缩短食堂排队时间的同时，也要给等待出发、用餐和返回教室留出足够时间。</w:t>
       </w:r>
     </w:p>
     <w:p>
@@ -7933,7 +7933,7 @@
           <w:szCs w:val="32"/>
           <w:lang w:val="en-US" w:eastAsia="zh-CN" w:bidi="ar"/>
         </w:rPr>
-        <w:t>学校可先根据实际人数和窗口速度估算班组间隔，再通过就餐记录逐步调整。开放窗口数量与班组出发安排应相互配合，使每批到达的人数与窗口接待能力接近。最终检查平均排队、取餐后等座和末批返回时刻。</w:t>
+        <w:t>学校可先用每班人数和窗口平均打饭时间估算出发间隔，再根据实际就餐记录调整。在前后两个班出发的间隔内，各窗口能接待的学生总数应与一个班的人数大致相当。调整后，应检查平均排队时间是否缩短、学生取餐后是否需要等座，以及最后一批学生能否按时返回教室。</w:t>
       </w:r>
     </w:p>
     <w:p>
@@ -7974,7 +7974,7 @@
           <w:szCs w:val="32"/>
           <w:lang w:val="en-US" w:eastAsia="zh-CN" w:bidi="ar"/>
         </w:rPr>
-        <w:t>软件可作为全国高中调整就餐安排的辅助工具，通过公开网页和Windows版本使用。学校填写本校各年级与各班人数、开放窗口数量、打饭速度和座位数量，再输入允许出发和返回目标时刻，即可按相同流程比较三种安排、选择班组间隔并导出放行表。学校无需修改代码，便能把示例参数换成自己的就餐条件。规模较大的学校可先选择一个相对独立的供餐区域开展比较。</w:t>
+        <w:t>全国各高中可通过公开网页或Windows软件使用这套工具。学校先填入本校各年级和各班人数、开放窗口数量、平均打饭时间及座位数量，再设置允许出发和要求返回教室的时刻。填好后，就能比较三种安排，选择出发间隔，并导出班级放行表。这些参数都能在页面中修改，不需要学校重新编写程序。规模较大的学校可先选一个相对独立的供餐区域，按照该区域的实际条件进行比较。</w:t>
       </w:r>
     </w:p>
     <w:p>
@@ -8015,7 +8015,7 @@
           <w:szCs w:val="32"/>
           <w:lang w:val="en-US" w:eastAsia="zh-CN" w:bidi="ar"/>
         </w:rPr>
-        <w:t>推广时可将软件、使用指南、空白记录表和示例结果一同提供给学校，由年级教师与食堂工作人员共同确定出发时刻。放行表可张贴在班级或通过校内通知发布，让学生清楚自己何时出发。根据每天的排队与末批返回记录调整间隔，比只凭窗口前看起来拥挤与否判断更具体。</w:t>
+        <w:t>推广时，可将软件、使用指南、空白记录表和示例结果一起提供给学校。年级教师和食堂工作人员共同商定各班的出发时刻后，将放行表张贴在班级，或通过校内通知发布。各班按表依次前往食堂，再根据每天记录的排队时间和末批学生返回时刻调整间隔，使安排更符合本校的实际情况。</w:t>
       </w:r>
     </w:p>
     <w:p>
@@ -8056,14 +8056,14 @@
           <w:szCs w:val="32"/>
           <w:lang w:val="en-US" w:eastAsia="zh-CN" w:bidi="ar"/>
         </w:rPr>
-        <w:t>实际应用希望减少学生在窗口前集中站队，把出发前的时间安排得更有秩序，从而改善就餐组织效率。更清楚的出发安排和较短的站队等待，也有助于减少长时间排队带来的烦躁感。应用后可比较调整前后的平均排队时间、末批返回时刻，并用简短匿名反馈了解学生对等待和就餐秩序的感受，使方案的作用体现在学生每天的就餐体验中。</w:t>
+        <w:t>推广这套方案的目的，是缩短学生在食堂站队的时间，让学生清楚本班何时前往食堂，从而改善就餐秩序，减少长时间排队带来的烦躁感。应用后，学校可以比较平均排队时间和末批学生返回时刻，也可以通过简短的匿名反馈，了解学生是否觉得等待更短、就餐更有秩序。这样，方案的效果既有时间记录可查，也能从学生每天的就餐感受中得到检验。</w:t>
       </w:r>
     </w:p>
     <w:p>
       <w:pPr>
         <w:keepNext/>
         <w:keepLines w:val="0"/>
-        <w:pageBreakBefore w:val="0"/>
+        <w:pageBreakBefore/>
         <w:widowControl/>
         <w:numPr>
           <w:ilvl w:val="0"/>

</xml_diff>

<commit_message>
Simplify the app to three steps and deliver clear report figures
</commit_message>
<xml_diff>
--- a/data/report.docx
+++ b/data/report.docx
@@ -1295,7 +1295,9 @@
                 <w:color w:val="000000"/>
                 <w:sz w:val="24"/>
               </w:rPr>
-              <w:t>返回目标</w:t>
+              <w:t>返回教室的</w:t>
+              <w:br/>
+              <w:t>最晚时刻</w:t>
             </w:r>
           </w:p>
         </w:tc>
@@ -1538,7 +1540,7 @@
           <w:szCs w:val="32"/>
           <w:lang w:val="en-US" w:eastAsia="zh-CN" w:bidi="ar"/>
         </w:rPr>
-        <w:t>使用软件时，先填写各年级人数、开放窗口数量、可用座位数量和各环节用时，再进入“方案比较”页面。这个页面先比较三种安排，再比较不同的出发间隔，最后生成班级放行表。两步使用相同的计算方法；人数、窗口或座位数量改变后，应重新比较。</w:t>
+        <w:t>软件按“选择方案—过程展示—结果展示”三个步骤组织。使用者先选择一种预设安排，填写各年级人数、班级数、开放窗口数量和可用座位数量，也可微调出发间隔。点击“查看就餐过程”后，软件按所填参数计算并展示学生就餐过程；再点击“查看结果”，即可查看平均排队时间、各年级结果和排队人数曲线。结果页还提供三种安排比较和出发间隔比较，选定方案后可导出班级放行表。</w:t>
       </w:r>
     </w:p>
     <w:p>
@@ -1550,7 +1552,7 @@
       <w:r>
         <w:drawing>
           <wp:inline xmlns:a="http://schemas.openxmlformats.org/drawingml/2006/main" xmlns:pic="http://schemas.openxmlformats.org/drawingml/2006/picture">
-            <wp:extent cx="5472000" cy="4474033"/>
+            <wp:extent cx="5472000" cy="6213803"/>
             <wp:docPr id="2" name="Picture 2"/>
             <wp:cNvGraphicFramePr>
               <a:graphicFrameLocks noChangeAspect="1"/>
@@ -1571,7 +1573,7 @@
                   <pic:spPr>
                     <a:xfrm>
                       <a:off x="0" y="0"/>
-                      <a:ext cx="5472000" cy="4474033"/>
+                      <a:ext cx="5472000" cy="6213803"/>
                     </a:xfrm>
                     <a:prstGeom prst="rect"/>
                   </pic:spPr>
@@ -1620,7 +1622,7 @@
           <w:szCs w:val="32"/>
           <w:lang w:val="en-US" w:eastAsia="zh-CN" w:bidi="ar"/>
         </w:rPr>
-        <w:t>图2  第一阶段的共同条件与错峰参数设置页面</w:t>
+        <w:t>图2  软件方案选择与参数设置页面</w:t>
       </w:r>
     </w:p>
     <w:p>
@@ -1673,7 +1675,7 @@
       <w:r>
         <w:drawing>
           <wp:inline xmlns:a="http://schemas.openxmlformats.org/drawingml/2006/main" xmlns:pic="http://schemas.openxmlformats.org/drawingml/2006/picture">
-            <wp:extent cx="5472000" cy="2559680"/>
+            <wp:extent cx="5472000" cy="4612704"/>
             <wp:docPr id="3" name="Picture 3"/>
             <wp:cNvGraphicFramePr>
               <a:graphicFrameLocks noChangeAspect="1"/>
@@ -1694,7 +1696,7 @@
                   <pic:spPr>
                     <a:xfrm>
                       <a:off x="0" y="0"/>
-                      <a:ext cx="5472000" cy="2559680"/>
+                      <a:ext cx="5472000" cy="4612704"/>
                     </a:xfrm>
                     <a:prstGeom prst="rect"/>
                   </pic:spPr>
@@ -7892,7 +7894,7 @@
           <w:szCs w:val="32"/>
           <w:lang w:val="en-US" w:eastAsia="zh-CN" w:bidi="ar"/>
         </w:rPr>
-        <w:t>确定相邻班级的出发间隔时，应同时考虑窗口接待速度和午间可用时间。本次比较了13个间隔，选择70秒后，重新计算时最后一名学生最晚在12:56:34返回教室，符合13:00前返回的目标。相比仅按年级错峰，平均完整用时增加3.53分钟。因此，学校在缩短食堂排队时间的同时，也要给等待出发、用餐和返回教室留出足够时间。</w:t>
+        <w:t>确定相邻班级的出发间隔时，应同时考虑窗口接待速度和午间可用时间。本次比较了13个间隔，选择70秒后，重新计算时最后一名学生最晚在12:56:34返回教室，早于本次设定的13:00。相比仅按年级错峰，平均完整用时增加3.53分钟。因此，学校在缩短食堂排队时间的同时，也要给等待出发、用餐和返回教室留出足够时间。</w:t>
       </w:r>
     </w:p>
     <w:p>
@@ -7974,7 +7976,7 @@
           <w:szCs w:val="32"/>
           <w:lang w:val="en-US" w:eastAsia="zh-CN" w:bidi="ar"/>
         </w:rPr>
-        <w:t>全国各高中可通过公开网页或Windows软件使用这套工具。学校先填入本校各年级和各班人数、开放窗口数量、平均打饭时间及座位数量，再设置允许出发和要求返回教室的时刻。填好后，就能比较三种安排，选择出发间隔，并导出班级放行表。这些参数都能在页面中修改，不需要学校重新编写程序。规模较大的学校可先选一个相对独立的供餐区域，按照该区域的实际条件进行比较。</w:t>
+        <w:t>全国各高中可通过公开网页或Windows软件使用这套工具。学校先填入本校各年级和各班人数、开放窗口数量、平均打饭时间及座位数量，再设置允许出发的时刻和返回教室的最晚时刻。填好后，就能比较三种安排，选择出发间隔，并导出班级放行表。这些参数都能在页面中修改，不需要学校重新编写程序。规模较大的学校可先选一个相对独立的供餐区域，按照该区域的实际条件进行比较。</w:t>
       </w:r>
     </w:p>
     <w:p>

</xml_diff>

<commit_message>
Rebuild the visual workspace and interactive 3D dining hall
</commit_message>
<xml_diff>
--- a/data/report.docx
+++ b/data/report.docx
@@ -1552,7 +1552,7 @@
       <w:r>
         <w:drawing>
           <wp:inline xmlns:a="http://schemas.openxmlformats.org/drawingml/2006/main" xmlns:pic="http://schemas.openxmlformats.org/drawingml/2006/picture">
-            <wp:extent cx="5472000" cy="6213803"/>
+            <wp:extent cx="5472000" cy="4280362"/>
             <wp:docPr id="2" name="Picture 2"/>
             <wp:cNvGraphicFramePr>
               <a:graphicFrameLocks noChangeAspect="1"/>
@@ -1573,7 +1573,7 @@
                   <pic:spPr>
                     <a:xfrm>
                       <a:off x="0" y="0"/>
-                      <a:ext cx="5472000" cy="6213803"/>
+                      <a:ext cx="5472000" cy="4280362"/>
                     </a:xfrm>
                     <a:prstGeom prst="rect"/>
                   </pic:spPr>
@@ -1663,7 +1663,7 @@
           <w:szCs w:val="32"/>
           <w:lang w:val="en-US" w:eastAsia="zh-CN" w:bidi="ar"/>
         </w:rPr>
-        <w:t>网页界面、就餐过程计算和三维回放均用JavaScript编写。另外编写了Python工具，独立生成放行表，并与网页导出的放行表核对。网页程序记录每名学生到达窗口、开始打饭、取餐结束、入座和返回教室的时刻，据此计算排队时间和完整用时。三维页面使用这些记录，展示学生排队、取餐、端盘走到餐桌和入座的过程，使计算结果更容易理解。</w:t>
+        <w:t>网页界面、就餐过程计算和三维回放均用JavaScript编写。另外编写了Python工具，独立生成放行表，并与网页导出的放行表核对。网页程序记录每名学生到达窗口、开始打饭、取餐结束、入座和返回教室的时刻，据此计算排队时间和完整用时。三维页面使用这些记录，展示学生排队、取餐、端盘走到餐桌和入座的过程，使计算结果更容易理解。使用者可点击画面中的人物，或输入模拟学生编号，查看该学生的就餐记录和轨迹。</w:t>
       </w:r>
     </w:p>
     <w:p>
@@ -1675,7 +1675,7 @@
       <w:r>
         <w:drawing>
           <wp:inline xmlns:a="http://schemas.openxmlformats.org/drawingml/2006/main" xmlns:pic="http://schemas.openxmlformats.org/drawingml/2006/picture">
-            <wp:extent cx="5472000" cy="4612704"/>
+            <wp:extent cx="5472000" cy="3569968"/>
             <wp:docPr id="3" name="Picture 3"/>
             <wp:cNvGraphicFramePr>
               <a:graphicFrameLocks noChangeAspect="1"/>
@@ -1696,7 +1696,7 @@
                   <pic:spPr>
                     <a:xfrm>
                       <a:off x="0" y="0"/>
-                      <a:ext cx="5472000" cy="4612704"/>
+                      <a:ext cx="5472000" cy="3569968"/>
                     </a:xfrm>
                     <a:prstGeom prst="rect"/>
                   </pic:spPr>
@@ -1745,7 +1745,7 @@
           <w:szCs w:val="32"/>
           <w:lang w:val="en-US" w:eastAsia="zh-CN" w:bidi="ar"/>
         </w:rPr>
-        <w:t>图3  软件三维就餐回放页面</w:t>
+        <w:t>图3  软件三维就餐回放场景</w:t>
       </w:r>
     </w:p>
     <w:p>

</xml_diff>

<commit_message>
Polish visual hierarchy, fix student picking and return walking pace
</commit_message>
<xml_diff>
--- a/data/report.docx
+++ b/data/report.docx
@@ -255,7 +255,7 @@
           <w:szCs w:val="32"/>
           <w:lang w:val="en-US" w:eastAsia="zh-CN" w:bidi="ar"/>
         </w:rPr>
-        <w:t>部分学校已在公开方案中规定不同年级错时就餐[1]，也有学校将同一年级的各班分成几批，安排在不同时刻用餐[2]。按年级错峰能错开不同年级的就餐时间，但同一年级的多个班一起出发，仍可能在食堂集中排队。因此，本研究进一步考虑各班什么时候出发，以及前后两个班应相隔多久。</w:t>
+        <w:t>按年级错峰，可以错开不同年级前往食堂的时间。但同一年级的多个班一起出发，学生仍可能集中到达窗口。因此，本研究进一步考虑各班什么时候出发，以及前后两个班应相隔多久。</w:t>
       </w:r>
     </w:p>
     <w:p>
@@ -468,7 +468,7 @@
           <w:szCs w:val="32"/>
           <w:lang w:val="en-US" w:eastAsia="zh-CN" w:bidi="ar"/>
         </w:rPr>
-        <w:t>本研究通过网络检索，查阅了学校公开的用餐管理方案和国内有关食堂排队的论文。学校公开方案提供了按年级错时、按班级分批的安排实例。高渝淳等梳理了排队、寻找座位以及窗口和座位安排等问题[3]；何恒等比较了快餐厅流程调整前后的变化[4]；刘兴果等研究了不同时段到餐人数变化对窗口排队的影响[5]。本研究参考这些资料，比较各班的出发安排，并记录排队和等座时间。</w:t>
+        <w:t>比较就餐方案，需要先整理各年级人数、班级数、开放窗口数量、座位数量，以及集合、步行、打饭和用餐所需的时间。这些参数共同决定学生何时到达食堂、窗口能接待多少人，以及餐桌何时空出。本研究采用一组统一的示例参数，按相同条件计算三种方案，并保存每名学生各环节的时间记录。</w:t>
       </w:r>
     </w:p>
     <w:p>
@@ -815,6 +815,47 @@
         <w:t>（一）参数设置</w:t>
       </w:r>
     </w:p>
+    <w:p>
+      <w:pPr>
+        <w:keepNext/>
+        <w:keepLines w:val="0"/>
+        <w:pageBreakBefore w:val="0"/>
+        <w:widowControl/>
+        <w:suppressLineNumbers w:val="0"/>
+        <w:kinsoku/>
+        <w:wordWrap/>
+        <w:overflowPunct/>
+        <w:topLinePunct w:val="0"/>
+        <w:autoSpaceDE/>
+        <w:autoSpaceDN/>
+        <w:bidi w:val="0"/>
+        <w:adjustRightInd/>
+        <w:snapToGrid/>
+        <w:spacing w:line="400" w:lineRule="exact" w:after="120"/>
+        <w:ind w:firstLine="0" w:firstLineChars="0" w:left="0" w:right="0" w:leftChars="0" w:rightChars="0" w:start="0" w:end="0"/>
+        <w:jc w:val="center"/>
+        <w:textAlignment w:val="auto"/>
+        <w:rPr>
+          <w:rFonts w:hint="eastAsia" w:ascii="Times New Roman" w:hAnsi="Times New Roman" w:eastAsia="仿宋" w:cs="仿宋"/>
+          <w:color w:val="000000"/>
+          <w:kern w:val="0"/>
+          <w:sz w:val="32"/>
+          <w:szCs w:val="32"/>
+          <w:lang w:val="en-US" w:eastAsia="zh-CN" w:bidi="ar"/>
+        </w:rPr>
+      </w:pPr>
+      <w:r>
+        <w:rPr>
+          <w:rFonts w:hint="eastAsia" w:ascii="Times New Roman" w:hAnsi="Times New Roman" w:eastAsia="仿宋" w:cs="仿宋"/>
+          <w:color w:val="000000"/>
+          <w:kern w:val="0"/>
+          <w:sz w:val="24"/>
+          <w:szCs w:val="32"/>
+          <w:lang w:val="en-US" w:eastAsia="zh-CN" w:bidi="ar"/>
+        </w:rPr>
+        <w:t>表1  三种方案共同采用的参数</w:t>
+      </w:r>
+    </w:p>
     <w:tbl>
       <w:tblPr>
         <w:tblW w:type="auto" w:w="0"/>
@@ -1201,7 +1242,7 @@
                 <w:color w:val="000000"/>
                 <w:sz w:val="24"/>
               </w:rPr>
-              <w:t>端盘步行速度1.1米/秒，返程3分钟</w:t>
+              <w:t>室内步行速度1.1米/秒，返程3分钟</w:t>
             </w:r>
           </w:p>
         </w:tc>
@@ -1284,7 +1325,7 @@
           </w:tcPr>
           <w:p>
             <w:pPr>
-              <w:keepNext/>
+              <w:keepNext w:val="0"/>
               <w:spacing w:line="360" w:lineRule="exact" w:after="40"/>
               <w:ind w:firstLine="0" w:firstLineChars="0" w:left="0" w:right="0" w:leftChars="0" w:rightChars="0" w:start="0" w:end="0"/>
               <w:jc w:val="left"/>
@@ -1314,7 +1355,7 @@
           </w:tcPr>
           <w:p>
             <w:pPr>
-              <w:keepNext/>
+              <w:keepNext w:val="0"/>
               <w:spacing w:line="360" w:lineRule="exact" w:after="40"/>
               <w:ind w:firstLine="0" w:firstLineChars="0" w:left="0" w:right="0" w:leftChars="0" w:rightChars="0" w:start="0" w:end="0"/>
               <w:jc w:val="center"/>
@@ -1333,7 +1374,7 @@
     </w:tbl>
     <w:p>
       <w:pPr>
-        <w:keepNext/>
+        <w:keepNext w:val="0"/>
         <w:keepLines w:val="0"/>
         <w:pageBreakBefore w:val="0"/>
         <w:widowControl/>
@@ -1369,47 +1410,6 @@
           <w:szCs w:val="32"/>
           <w:lang w:val="en-US" w:eastAsia="zh-CN" w:bidi="ar"/>
         </w:rPr>
-      </w:r>
-    </w:p>
-    <w:p>
-      <w:pPr>
-        <w:keepNext w:val="0"/>
-        <w:keepLines w:val="0"/>
-        <w:pageBreakBefore w:val="0"/>
-        <w:widowControl/>
-        <w:suppressLineNumbers w:val="0"/>
-        <w:kinsoku/>
-        <w:wordWrap/>
-        <w:overflowPunct/>
-        <w:topLinePunct w:val="0"/>
-        <w:autoSpaceDE/>
-        <w:autoSpaceDN/>
-        <w:bidi w:val="0"/>
-        <w:adjustRightInd/>
-        <w:snapToGrid/>
-        <w:spacing w:line="400" w:lineRule="exact"/>
-        <w:ind w:firstLine="0" w:firstLineChars="0" w:left="0" w:right="0" w:leftChars="0" w:rightChars="0" w:start="0" w:end="0"/>
-        <w:jc w:val="center"/>
-        <w:textAlignment w:val="auto"/>
-        <w:rPr>
-          <w:rFonts w:hint="eastAsia" w:ascii="Times New Roman" w:hAnsi="Times New Roman" w:eastAsia="仿宋" w:cs="仿宋"/>
-          <w:color w:val="000000"/>
-          <w:kern w:val="0"/>
-          <w:sz w:val="32"/>
-          <w:szCs w:val="32"/>
-          <w:lang w:val="en-US" w:eastAsia="zh-CN" w:bidi="ar"/>
-        </w:rPr>
-      </w:pPr>
-      <w:r>
-        <w:rPr>
-          <w:rFonts w:hint="eastAsia" w:ascii="Times New Roman" w:hAnsi="Times New Roman" w:eastAsia="仿宋" w:cs="仿宋"/>
-          <w:color w:val="000000"/>
-          <w:kern w:val="0"/>
-          <w:sz w:val="24"/>
-          <w:szCs w:val="32"/>
-          <w:lang w:val="en-US" w:eastAsia="zh-CN" w:bidi="ar"/>
-        </w:rPr>
-        <w:t>表1  三种方案共同采用的参数</w:t>
       </w:r>
     </w:p>
     <w:p>
@@ -2543,6 +2543,47 @@
         <w:t>（四）第一阶段：三种就餐安排比较</w:t>
       </w:r>
     </w:p>
+    <w:p>
+      <w:pPr>
+        <w:keepNext/>
+        <w:keepLines w:val="0"/>
+        <w:pageBreakBefore w:val="0"/>
+        <w:widowControl/>
+        <w:suppressLineNumbers w:val="0"/>
+        <w:kinsoku/>
+        <w:wordWrap/>
+        <w:overflowPunct/>
+        <w:topLinePunct w:val="0"/>
+        <w:autoSpaceDE/>
+        <w:autoSpaceDN/>
+        <w:bidi w:val="0"/>
+        <w:adjustRightInd/>
+        <w:snapToGrid/>
+        <w:spacing w:line="400" w:lineRule="exact" w:after="120"/>
+        <w:ind w:firstLine="0" w:firstLineChars="0" w:left="0" w:right="0" w:leftChars="0" w:rightChars="0" w:start="0" w:end="0"/>
+        <w:jc w:val="center"/>
+        <w:textAlignment w:val="auto"/>
+        <w:rPr>
+          <w:rFonts w:hint="eastAsia" w:ascii="Times New Roman" w:hAnsi="Times New Roman" w:eastAsia="仿宋" w:cs="仿宋"/>
+          <w:color w:val="000000"/>
+          <w:kern w:val="0"/>
+          <w:sz w:val="32"/>
+          <w:szCs w:val="32"/>
+          <w:lang w:val="en-US" w:eastAsia="zh-CN" w:bidi="ar"/>
+        </w:rPr>
+      </w:pPr>
+      <w:r>
+        <w:rPr>
+          <w:rFonts w:hint="eastAsia" w:ascii="Times New Roman" w:hAnsi="Times New Roman" w:eastAsia="仿宋" w:cs="仿宋"/>
+          <w:color w:val="000000"/>
+          <w:kern w:val="0"/>
+          <w:sz w:val="24"/>
+          <w:szCs w:val="32"/>
+          <w:lang w:val="en-US" w:eastAsia="zh-CN" w:bidi="ar"/>
+        </w:rPr>
+        <w:t>表2  三种方案的初始出发规则</w:t>
+      </w:r>
+    </w:p>
     <w:tbl>
       <w:tblPr>
         <w:tblW w:type="auto" w:w="0"/>
@@ -2768,7 +2809,7 @@
           </w:tcPr>
           <w:p>
             <w:pPr>
-              <w:keepNext/>
+              <w:keepNext w:val="0"/>
               <w:spacing w:line="360" w:lineRule="exact" w:after="40"/>
               <w:ind w:firstLine="0" w:firstLineChars="0" w:left="0" w:right="0" w:leftChars="0" w:rightChars="0" w:start="0" w:end="0"/>
               <w:jc w:val="left"/>
@@ -2796,7 +2837,7 @@
           </w:tcPr>
           <w:p>
             <w:pPr>
-              <w:keepNext/>
+              <w:keepNext w:val="0"/>
               <w:spacing w:line="360" w:lineRule="exact" w:after="40"/>
               <w:ind w:firstLine="0" w:firstLineChars="0" w:left="0" w:right="0" w:leftChars="0" w:rightChars="0" w:start="0" w:end="0"/>
               <w:jc w:val="center"/>
@@ -2815,7 +2856,7 @@
     </w:tbl>
     <w:p>
       <w:pPr>
-        <w:keepNext/>
+        <w:keepNext w:val="0"/>
         <w:keepLines w:val="0"/>
         <w:pageBreakBefore w:val="0"/>
         <w:widowControl/>
@@ -2851,47 +2892,6 @@
           <w:szCs w:val="32"/>
           <w:lang w:val="en-US" w:eastAsia="zh-CN" w:bidi="ar"/>
         </w:rPr>
-      </w:r>
-    </w:p>
-    <w:p>
-      <w:pPr>
-        <w:keepNext w:val="0"/>
-        <w:keepLines w:val="0"/>
-        <w:pageBreakBefore w:val="0"/>
-        <w:widowControl/>
-        <w:suppressLineNumbers w:val="0"/>
-        <w:kinsoku/>
-        <w:wordWrap/>
-        <w:overflowPunct/>
-        <w:topLinePunct w:val="0"/>
-        <w:autoSpaceDE/>
-        <w:autoSpaceDN/>
-        <w:bidi w:val="0"/>
-        <w:adjustRightInd/>
-        <w:snapToGrid/>
-        <w:spacing w:line="400" w:lineRule="exact"/>
-        <w:ind w:firstLine="0" w:firstLineChars="0" w:left="0" w:right="0" w:leftChars="0" w:rightChars="0" w:start="0" w:end="0"/>
-        <w:jc w:val="center"/>
-        <w:textAlignment w:val="auto"/>
-        <w:rPr>
-          <w:rFonts w:hint="eastAsia" w:ascii="Times New Roman" w:hAnsi="Times New Roman" w:eastAsia="仿宋" w:cs="仿宋"/>
-          <w:color w:val="000000"/>
-          <w:kern w:val="0"/>
-          <w:sz w:val="32"/>
-          <w:szCs w:val="32"/>
-          <w:lang w:val="en-US" w:eastAsia="zh-CN" w:bidi="ar"/>
-        </w:rPr>
-      </w:pPr>
-      <w:r>
-        <w:rPr>
-          <w:rFonts w:hint="eastAsia" w:ascii="Times New Roman" w:hAnsi="Times New Roman" w:eastAsia="仿宋" w:cs="仿宋"/>
-          <w:color w:val="000000"/>
-          <w:kern w:val="0"/>
-          <w:sz w:val="24"/>
-          <w:szCs w:val="32"/>
-          <w:lang w:val="en-US" w:eastAsia="zh-CN" w:bidi="ar"/>
-        </w:rPr>
-        <w:t>表2  三种方案的初始出发规则</w:t>
       </w:r>
     </w:p>
     <w:p>
@@ -2933,6 +2933,47 @@
           <w:lang w:val="en-US" w:eastAsia="zh-CN" w:bidi="ar"/>
         </w:rPr>
         <w:t>一个年级约500人，按16个窗口合计每分钟接待48人估算，让这个年级的学生都取到饭约需10分钟。因此，先将相邻年级的出发间隔设为10分钟，再补充比较5分钟和15分钟，查看年级间隔改变后，排队时间会怎样变化。三种方案都以11:50为最早出发时刻，集合和步行用时的设置也相同。各班即使同时出发，学生也会因集合和步行快慢不同而先后到达窗口。</w:t>
+      </w:r>
+    </w:p>
+    <w:p>
+      <w:pPr>
+        <w:keepNext/>
+        <w:keepLines w:val="0"/>
+        <w:pageBreakBefore w:val="0"/>
+        <w:widowControl/>
+        <w:suppressLineNumbers w:val="0"/>
+        <w:kinsoku/>
+        <w:wordWrap/>
+        <w:overflowPunct/>
+        <w:topLinePunct w:val="0"/>
+        <w:autoSpaceDE/>
+        <w:autoSpaceDN/>
+        <w:bidi w:val="0"/>
+        <w:adjustRightInd/>
+        <w:snapToGrid/>
+        <w:spacing w:line="400" w:lineRule="exact" w:after="120"/>
+        <w:ind w:firstLine="0" w:firstLineChars="0" w:left="0" w:right="0" w:leftChars="0" w:rightChars="0" w:start="0" w:end="0"/>
+        <w:jc w:val="center"/>
+        <w:textAlignment w:val="auto"/>
+        <w:rPr>
+          <w:rFonts w:hint="eastAsia" w:ascii="Times New Roman" w:hAnsi="Times New Roman" w:eastAsia="仿宋" w:cs="仿宋"/>
+          <w:color w:val="000000"/>
+          <w:kern w:val="0"/>
+          <w:sz w:val="32"/>
+          <w:szCs w:val="32"/>
+          <w:lang w:val="en-US" w:eastAsia="zh-CN" w:bidi="ar"/>
+        </w:rPr>
+      </w:pPr>
+      <w:r>
+        <w:rPr>
+          <w:rFonts w:hint="eastAsia" w:ascii="Times New Roman" w:hAnsi="Times New Roman" w:eastAsia="仿宋" w:cs="仿宋"/>
+          <w:color w:val="000000"/>
+          <w:kern w:val="0"/>
+          <w:sz w:val="24"/>
+          <w:szCs w:val="32"/>
+          <w:lang w:val="en-US" w:eastAsia="zh-CN" w:bidi="ar"/>
+        </w:rPr>
+        <w:t>表3  三种初始方案各计算30次的平均结果</w:t>
       </w:r>
     </w:p>
     <w:tbl>
@@ -3340,7 +3381,7 @@
           </w:tcPr>
           <w:p>
             <w:pPr>
-              <w:keepNext/>
+              <w:keepNext w:val="0"/>
               <w:spacing w:line="360" w:lineRule="exact" w:after="40"/>
               <w:ind w:firstLine="0" w:firstLineChars="0" w:left="0" w:right="0" w:leftChars="0" w:rightChars="0" w:start="0" w:end="0"/>
               <w:jc w:val="left"/>
@@ -3368,7 +3409,7 @@
           </w:tcPr>
           <w:p>
             <w:pPr>
-              <w:keepNext/>
+              <w:keepNext w:val="0"/>
               <w:spacing w:line="360" w:lineRule="exact" w:after="40"/>
               <w:ind w:firstLine="0" w:firstLineChars="0" w:left="0" w:right="0" w:leftChars="0" w:rightChars="0" w:start="0" w:end="0"/>
               <w:jc w:val="center"/>
@@ -3396,7 +3437,7 @@
           </w:tcPr>
           <w:p>
             <w:pPr>
-              <w:keepNext/>
+              <w:keepNext w:val="0"/>
               <w:spacing w:line="360" w:lineRule="exact" w:after="40"/>
               <w:ind w:firstLine="0" w:firstLineChars="0" w:left="0" w:right="0" w:leftChars="0" w:rightChars="0" w:start="0" w:end="0"/>
               <w:jc w:val="center"/>
@@ -3424,7 +3465,7 @@
           </w:tcPr>
           <w:p>
             <w:pPr>
-              <w:keepNext/>
+              <w:keepNext w:val="0"/>
               <w:spacing w:line="360" w:lineRule="exact" w:after="40"/>
               <w:ind w:firstLine="0" w:firstLineChars="0" w:left="0" w:right="0" w:leftChars="0" w:rightChars="0" w:start="0" w:end="0"/>
               <w:jc w:val="center"/>
@@ -3443,7 +3484,7 @@
     </w:tbl>
     <w:p>
       <w:pPr>
-        <w:keepNext/>
+        <w:keepNext w:val="0"/>
         <w:keepLines w:val="0"/>
         <w:pageBreakBefore w:val="0"/>
         <w:widowControl/>
@@ -3479,47 +3520,6 @@
           <w:szCs w:val="32"/>
           <w:lang w:val="en-US" w:eastAsia="zh-CN" w:bidi="ar"/>
         </w:rPr>
-      </w:r>
-    </w:p>
-    <w:p>
-      <w:pPr>
-        <w:keepNext w:val="0"/>
-        <w:keepLines w:val="0"/>
-        <w:pageBreakBefore w:val="0"/>
-        <w:widowControl/>
-        <w:suppressLineNumbers w:val="0"/>
-        <w:kinsoku/>
-        <w:wordWrap/>
-        <w:overflowPunct/>
-        <w:topLinePunct w:val="0"/>
-        <w:autoSpaceDE/>
-        <w:autoSpaceDN/>
-        <w:bidi w:val="0"/>
-        <w:adjustRightInd/>
-        <w:snapToGrid/>
-        <w:spacing w:line="400" w:lineRule="exact"/>
-        <w:ind w:firstLine="0" w:firstLineChars="0" w:left="0" w:right="0" w:leftChars="0" w:rightChars="0" w:start="0" w:end="0"/>
-        <w:jc w:val="center"/>
-        <w:textAlignment w:val="auto"/>
-        <w:rPr>
-          <w:rFonts w:hint="eastAsia" w:ascii="Times New Roman" w:hAnsi="Times New Roman" w:eastAsia="仿宋" w:cs="仿宋"/>
-          <w:color w:val="000000"/>
-          <w:kern w:val="0"/>
-          <w:sz w:val="32"/>
-          <w:szCs w:val="32"/>
-          <w:lang w:val="en-US" w:eastAsia="zh-CN" w:bidi="ar"/>
-        </w:rPr>
-      </w:pPr>
-      <w:r>
-        <w:rPr>
-          <w:rFonts w:hint="eastAsia" w:ascii="Times New Roman" w:hAnsi="Times New Roman" w:eastAsia="仿宋" w:cs="仿宋"/>
-          <w:color w:val="000000"/>
-          <w:kern w:val="0"/>
-          <w:sz w:val="24"/>
-          <w:szCs w:val="32"/>
-          <w:lang w:val="en-US" w:eastAsia="zh-CN" w:bidi="ar"/>
-        </w:rPr>
-        <w:t>表3  三种初始方案各计算30次的平均结果</w:t>
       </w:r>
     </w:p>
     <w:p>
@@ -3838,6 +3838,47 @@
         <w:t>先比较0、15、30、45、60、75、90、105、120秒这9个间隔，每个间隔重复计算30次。先保留30次计算中均能让所有学生在13:00前返回的安排，再比较它们的平均排队时间。初步结果中，60秒的平均排队时间最短。于是，再比较它附近的50、55、65、70秒，共比较13个间隔。最后，仍按相同标准选择：先检查每次计算中所有学生能否按时返回，再从符合要求的间隔中选择平均排队时间最短的一项。</w:t>
       </w:r>
     </w:p>
+    <w:p>
+      <w:pPr>
+        <w:keepNext/>
+        <w:keepLines w:val="0"/>
+        <w:pageBreakBefore w:val="0"/>
+        <w:widowControl/>
+        <w:suppressLineNumbers w:val="0"/>
+        <w:kinsoku/>
+        <w:wordWrap/>
+        <w:overflowPunct/>
+        <w:topLinePunct w:val="0"/>
+        <w:autoSpaceDE/>
+        <w:autoSpaceDN/>
+        <w:bidi w:val="0"/>
+        <w:adjustRightInd/>
+        <w:snapToGrid/>
+        <w:spacing w:line="400" w:lineRule="exact" w:after="120"/>
+        <w:ind w:firstLine="0" w:firstLineChars="0" w:left="0" w:right="0" w:leftChars="0" w:rightChars="0" w:start="0" w:end="0"/>
+        <w:jc w:val="center"/>
+        <w:textAlignment w:val="auto"/>
+        <w:rPr>
+          <w:rFonts w:hint="eastAsia" w:ascii="Times New Roman" w:hAnsi="Times New Roman" w:eastAsia="仿宋" w:cs="仿宋"/>
+          <w:color w:val="000000"/>
+          <w:kern w:val="0"/>
+          <w:sz w:val="32"/>
+          <w:szCs w:val="32"/>
+          <w:lang w:val="en-US" w:eastAsia="zh-CN" w:bidi="ar"/>
+        </w:rPr>
+      </w:pPr>
+      <w:r>
+        <w:rPr>
+          <w:rFonts w:hint="eastAsia" w:ascii="Times New Roman" w:hAnsi="Times New Roman" w:eastAsia="仿宋" w:cs="仿宋"/>
+          <w:color w:val="000000"/>
+          <w:kern w:val="0"/>
+          <w:sz w:val="24"/>
+          <w:szCs w:val="32"/>
+          <w:lang w:val="en-US" w:eastAsia="zh-CN" w:bidi="ar"/>
+        </w:rPr>
+        <w:t>表4  不同相邻组间隔各计算30次的结果</w:t>
+      </w:r>
+    </w:p>
     <w:tbl>
       <w:tblPr>
         <w:tblW w:type="auto" w:w="0"/>
@@ -5413,7 +5454,7 @@
           </w:tcPr>
           <w:p>
             <w:pPr>
-              <w:keepNext/>
+              <w:keepNext w:val="0"/>
               <w:spacing w:line="360" w:lineRule="exact" w:after="40"/>
               <w:ind w:firstLine="0" w:firstLineChars="0" w:left="0" w:right="0" w:leftChars="0" w:rightChars="0" w:start="0" w:end="0"/>
               <w:jc w:val="left"/>
@@ -5441,7 +5482,7 @@
           </w:tcPr>
           <w:p>
             <w:pPr>
-              <w:keepNext/>
+              <w:keepNext w:val="0"/>
               <w:spacing w:line="360" w:lineRule="exact" w:after="40"/>
               <w:ind w:firstLine="0" w:firstLineChars="0" w:left="0" w:right="0" w:leftChars="0" w:rightChars="0" w:start="0" w:end="0"/>
               <w:jc w:val="center"/>
@@ -5469,7 +5510,7 @@
           </w:tcPr>
           <w:p>
             <w:pPr>
-              <w:keepNext/>
+              <w:keepNext w:val="0"/>
               <w:spacing w:line="360" w:lineRule="exact" w:after="40"/>
               <w:ind w:firstLine="0" w:firstLineChars="0" w:left="0" w:right="0" w:leftChars="0" w:rightChars="0" w:start="0" w:end="0"/>
               <w:jc w:val="center"/>
@@ -5497,7 +5538,7 @@
           </w:tcPr>
           <w:p>
             <w:pPr>
-              <w:keepNext/>
+              <w:keepNext w:val="0"/>
               <w:spacing w:line="360" w:lineRule="exact" w:after="40"/>
               <w:ind w:firstLine="0" w:firstLineChars="0" w:left="0" w:right="0" w:leftChars="0" w:rightChars="0" w:start="0" w:end="0"/>
               <w:jc w:val="center"/>
@@ -5516,7 +5557,7 @@
     </w:tbl>
     <w:p>
       <w:pPr>
-        <w:keepNext/>
+        <w:keepNext w:val="0"/>
         <w:keepLines w:val="0"/>
         <w:pageBreakBefore w:val="0"/>
         <w:widowControl/>
@@ -5552,47 +5593,6 @@
           <w:szCs w:val="32"/>
           <w:lang w:val="en-US" w:eastAsia="zh-CN" w:bidi="ar"/>
         </w:rPr>
-      </w:r>
-    </w:p>
-    <w:p>
-      <w:pPr>
-        <w:keepNext w:val="0"/>
-        <w:keepLines w:val="0"/>
-        <w:pageBreakBefore w:val="0"/>
-        <w:widowControl/>
-        <w:suppressLineNumbers w:val="0"/>
-        <w:kinsoku/>
-        <w:wordWrap/>
-        <w:overflowPunct/>
-        <w:topLinePunct w:val="0"/>
-        <w:autoSpaceDE/>
-        <w:autoSpaceDN/>
-        <w:bidi w:val="0"/>
-        <w:adjustRightInd/>
-        <w:snapToGrid/>
-        <w:spacing w:line="400" w:lineRule="exact"/>
-        <w:ind w:firstLine="0" w:firstLineChars="0" w:left="0" w:right="0" w:leftChars="0" w:rightChars="0" w:start="0" w:end="0"/>
-        <w:jc w:val="center"/>
-        <w:textAlignment w:val="auto"/>
-        <w:rPr>
-          <w:rFonts w:hint="eastAsia" w:ascii="Times New Roman" w:hAnsi="Times New Roman" w:eastAsia="仿宋" w:cs="仿宋"/>
-          <w:color w:val="000000"/>
-          <w:kern w:val="0"/>
-          <w:sz w:val="32"/>
-          <w:szCs w:val="32"/>
-          <w:lang w:val="en-US" w:eastAsia="zh-CN" w:bidi="ar"/>
-        </w:rPr>
-      </w:pPr>
-      <w:r>
-        <w:rPr>
-          <w:rFonts w:hint="eastAsia" w:ascii="Times New Roman" w:hAnsi="Times New Roman" w:eastAsia="仿宋" w:cs="仿宋"/>
-          <w:color w:val="000000"/>
-          <w:kern w:val="0"/>
-          <w:sz w:val="24"/>
-          <w:szCs w:val="32"/>
-          <w:lang w:val="en-US" w:eastAsia="zh-CN" w:bidi="ar"/>
-        </w:rPr>
-        <w:t>表4  不同相邻组间隔各计算30次的结果</w:t>
       </w:r>
     </w:p>
     <w:p>
@@ -5767,6 +5767,47 @@
         <w:t>（六）最终复核与放行表</w:t>
       </w:r>
     </w:p>
+    <w:p>
+      <w:pPr>
+        <w:keepNext/>
+        <w:keepLines w:val="0"/>
+        <w:pageBreakBefore w:val="0"/>
+        <w:widowControl/>
+        <w:suppressLineNumbers w:val="0"/>
+        <w:kinsoku/>
+        <w:wordWrap/>
+        <w:overflowPunct/>
+        <w:topLinePunct w:val="0"/>
+        <w:autoSpaceDE/>
+        <w:autoSpaceDN/>
+        <w:bidi w:val="0"/>
+        <w:adjustRightInd/>
+        <w:snapToGrid/>
+        <w:spacing w:line="400" w:lineRule="exact" w:after="120"/>
+        <w:ind w:firstLine="0" w:firstLineChars="0" w:left="0" w:right="0" w:leftChars="0" w:rightChars="0" w:start="0" w:end="0"/>
+        <w:jc w:val="center"/>
+        <w:textAlignment w:val="auto"/>
+        <w:rPr>
+          <w:rFonts w:hint="eastAsia" w:ascii="Times New Roman" w:hAnsi="Times New Roman" w:eastAsia="仿宋" w:cs="仿宋"/>
+          <w:color w:val="000000"/>
+          <w:kern w:val="0"/>
+          <w:sz w:val="32"/>
+          <w:szCs w:val="32"/>
+          <w:lang w:val="en-US" w:eastAsia="zh-CN" w:bidi="ar"/>
+        </w:rPr>
+      </w:pPr>
+      <w:r>
+        <w:rPr>
+          <w:rFonts w:hint="eastAsia" w:ascii="Times New Roman" w:hAnsi="Times New Roman" w:eastAsia="仿宋" w:cs="仿宋"/>
+          <w:color w:val="000000"/>
+          <w:kern w:val="0"/>
+          <w:sz w:val="24"/>
+          <w:szCs w:val="32"/>
+          <w:lang w:val="en-US" w:eastAsia="zh-CN" w:bidi="ar"/>
+        </w:rPr>
+        <w:t>表5  另一组随机条件下的三种方案复核结果</w:t>
+      </w:r>
+    </w:p>
     <w:tbl>
       <w:tblPr>
         <w:tblW w:type="auto" w:w="0"/>
@@ -6170,7 +6211,7 @@
           </w:tcPr>
           <w:p>
             <w:pPr>
-              <w:keepNext/>
+              <w:keepNext w:val="0"/>
               <w:spacing w:line="360" w:lineRule="exact" w:after="40"/>
               <w:ind w:firstLine="0" w:firstLineChars="0" w:left="0" w:right="0" w:leftChars="0" w:rightChars="0" w:start="0" w:end="0"/>
               <w:jc w:val="left"/>
@@ -6198,7 +6239,7 @@
           </w:tcPr>
           <w:p>
             <w:pPr>
-              <w:keepNext/>
+              <w:keepNext w:val="0"/>
               <w:spacing w:line="360" w:lineRule="exact" w:after="40"/>
               <w:ind w:firstLine="0" w:firstLineChars="0" w:left="0" w:right="0" w:leftChars="0" w:rightChars="0" w:start="0" w:end="0"/>
               <w:jc w:val="center"/>
@@ -6226,7 +6267,7 @@
           </w:tcPr>
           <w:p>
             <w:pPr>
-              <w:keepNext/>
+              <w:keepNext w:val="0"/>
               <w:spacing w:line="360" w:lineRule="exact" w:after="40"/>
               <w:ind w:firstLine="0" w:firstLineChars="0" w:left="0" w:right="0" w:leftChars="0" w:rightChars="0" w:start="0" w:end="0"/>
               <w:jc w:val="center"/>
@@ -6254,7 +6295,7 @@
           </w:tcPr>
           <w:p>
             <w:pPr>
-              <w:keepNext/>
+              <w:keepNext w:val="0"/>
               <w:spacing w:line="360" w:lineRule="exact" w:after="40"/>
               <w:ind w:firstLine="0" w:firstLineChars="0" w:left="0" w:right="0" w:leftChars="0" w:rightChars="0" w:start="0" w:end="0"/>
               <w:jc w:val="center"/>
@@ -6273,7 +6314,7 @@
     </w:tbl>
     <w:p>
       <w:pPr>
-        <w:keepNext/>
+        <w:keepNext w:val="0"/>
         <w:keepLines w:val="0"/>
         <w:pageBreakBefore w:val="0"/>
         <w:widowControl/>
@@ -6309,47 +6350,6 @@
           <w:szCs w:val="32"/>
           <w:lang w:val="en-US" w:eastAsia="zh-CN" w:bidi="ar"/>
         </w:rPr>
-      </w:r>
-    </w:p>
-    <w:p>
-      <w:pPr>
-        <w:keepNext w:val="0"/>
-        <w:keepLines w:val="0"/>
-        <w:pageBreakBefore w:val="0"/>
-        <w:widowControl/>
-        <w:suppressLineNumbers w:val="0"/>
-        <w:kinsoku/>
-        <w:wordWrap/>
-        <w:overflowPunct/>
-        <w:topLinePunct w:val="0"/>
-        <w:autoSpaceDE/>
-        <w:autoSpaceDN/>
-        <w:bidi w:val="0"/>
-        <w:adjustRightInd/>
-        <w:snapToGrid/>
-        <w:spacing w:line="400" w:lineRule="exact"/>
-        <w:ind w:firstLine="0" w:firstLineChars="0" w:left="0" w:right="0" w:leftChars="0" w:rightChars="0" w:start="0" w:end="0"/>
-        <w:jc w:val="center"/>
-        <w:textAlignment w:val="auto"/>
-        <w:rPr>
-          <w:rFonts w:hint="eastAsia" w:ascii="Times New Roman" w:hAnsi="Times New Roman" w:eastAsia="仿宋" w:cs="仿宋"/>
-          <w:color w:val="000000"/>
-          <w:kern w:val="0"/>
-          <w:sz w:val="32"/>
-          <w:szCs w:val="32"/>
-          <w:lang w:val="en-US" w:eastAsia="zh-CN" w:bidi="ar"/>
-        </w:rPr>
-      </w:pPr>
-      <w:r>
-        <w:rPr>
-          <w:rFonts w:hint="eastAsia" w:ascii="Times New Roman" w:hAnsi="Times New Roman" w:eastAsia="仿宋" w:cs="仿宋"/>
-          <w:color w:val="000000"/>
-          <w:kern w:val="0"/>
-          <w:sz w:val="24"/>
-          <w:szCs w:val="32"/>
-          <w:lang w:val="en-US" w:eastAsia="zh-CN" w:bidi="ar"/>
-        </w:rPr>
-        <w:t>表5  另一组随机条件下的三种方案复核结果</w:t>
       </w:r>
     </w:p>
     <w:p>
@@ -6391,6 +6391,47 @@
           <w:lang w:val="en-US" w:eastAsia="zh-CN" w:bidi="ar"/>
         </w:rPr>
         <w:t>重新计算后，仅按年级错峰时，学生平均排队5.05分钟；年级与班级结合错峰时，平均排队0.54分钟。两者相比，平均排队时间减少4.51分钟，约减少89.4%，平均完整用时增加3.53分钟。这是因为部分班级需要更晚出发：学生在食堂站队的时间缩短了，在教室等待出发的时间却增加了，返回教室的平均时刻也随之推后。</w:t>
+      </w:r>
+    </w:p>
+    <w:p>
+      <w:pPr>
+        <w:keepNext/>
+        <w:keepLines w:val="0"/>
+        <w:pageBreakBefore w:val="0"/>
+        <w:widowControl/>
+        <w:suppressLineNumbers w:val="0"/>
+        <w:kinsoku/>
+        <w:wordWrap/>
+        <w:overflowPunct/>
+        <w:topLinePunct w:val="0"/>
+        <w:autoSpaceDE/>
+        <w:autoSpaceDN/>
+        <w:bidi w:val="0"/>
+        <w:adjustRightInd/>
+        <w:snapToGrid/>
+        <w:spacing w:line="400" w:lineRule="exact" w:after="120"/>
+        <w:ind w:firstLine="0" w:firstLineChars="0" w:left="0" w:right="0" w:leftChars="0" w:rightChars="0" w:start="0" w:end="0"/>
+        <w:jc w:val="center"/>
+        <w:textAlignment w:val="auto"/>
+        <w:rPr>
+          <w:rFonts w:hint="eastAsia" w:ascii="Times New Roman" w:hAnsi="Times New Roman" w:eastAsia="仿宋" w:cs="仿宋"/>
+          <w:color w:val="000000"/>
+          <w:kern w:val="0"/>
+          <w:sz w:val="32"/>
+          <w:szCs w:val="32"/>
+          <w:lang w:val="en-US" w:eastAsia="zh-CN" w:bidi="ar"/>
+        </w:rPr>
+      </w:pPr>
+      <w:r>
+        <w:rPr>
+          <w:rFonts w:hint="eastAsia" w:ascii="Times New Roman" w:hAnsi="Times New Roman" w:eastAsia="仿宋" w:cs="仿宋"/>
+          <w:color w:val="000000"/>
+          <w:kern w:val="0"/>
+          <w:sz w:val="24"/>
+          <w:szCs w:val="32"/>
+          <w:lang w:val="en-US" w:eastAsia="zh-CN" w:bidi="ar"/>
+        </w:rPr>
+        <w:t>表6  最终复核的各年级平均排队时间</w:t>
       </w:r>
     </w:p>
     <w:tbl>
@@ -6798,7 +6839,7 @@
           </w:tcPr>
           <w:p>
             <w:pPr>
-              <w:keepNext/>
+              <w:keepNext w:val="0"/>
               <w:spacing w:line="360" w:lineRule="exact" w:after="40"/>
               <w:ind w:firstLine="0" w:firstLineChars="0" w:left="0" w:right="0" w:leftChars="0" w:rightChars="0" w:start="0" w:end="0"/>
               <w:jc w:val="left"/>
@@ -6826,7 +6867,7 @@
           </w:tcPr>
           <w:p>
             <w:pPr>
-              <w:keepNext/>
+              <w:keepNext w:val="0"/>
               <w:spacing w:line="360" w:lineRule="exact" w:after="40"/>
               <w:ind w:firstLine="0" w:firstLineChars="0" w:left="0" w:right="0" w:leftChars="0" w:rightChars="0" w:start="0" w:end="0"/>
               <w:jc w:val="center"/>
@@ -6854,7 +6895,7 @@
           </w:tcPr>
           <w:p>
             <w:pPr>
-              <w:keepNext/>
+              <w:keepNext w:val="0"/>
               <w:spacing w:line="360" w:lineRule="exact" w:after="40"/>
               <w:ind w:firstLine="0" w:firstLineChars="0" w:left="0" w:right="0" w:leftChars="0" w:rightChars="0" w:start="0" w:end="0"/>
               <w:jc w:val="center"/>
@@ -6882,7 +6923,7 @@
           </w:tcPr>
           <w:p>
             <w:pPr>
-              <w:keepNext/>
+              <w:keepNext w:val="0"/>
               <w:spacing w:line="360" w:lineRule="exact" w:after="40"/>
               <w:ind w:firstLine="0" w:firstLineChars="0" w:left="0" w:right="0" w:leftChars="0" w:rightChars="0" w:start="0" w:end="0"/>
               <w:jc w:val="center"/>
@@ -6901,7 +6942,7 @@
     </w:tbl>
     <w:p>
       <w:pPr>
-        <w:keepNext/>
+        <w:keepNext w:val="0"/>
         <w:keepLines w:val="0"/>
         <w:pageBreakBefore w:val="0"/>
         <w:widowControl/>
@@ -6937,47 +6978,6 @@
           <w:szCs w:val="32"/>
           <w:lang w:val="en-US" w:eastAsia="zh-CN" w:bidi="ar"/>
         </w:rPr>
-      </w:r>
-    </w:p>
-    <w:p>
-      <w:pPr>
-        <w:keepNext w:val="0"/>
-        <w:keepLines w:val="0"/>
-        <w:pageBreakBefore w:val="0"/>
-        <w:widowControl/>
-        <w:suppressLineNumbers w:val="0"/>
-        <w:kinsoku/>
-        <w:wordWrap/>
-        <w:overflowPunct/>
-        <w:topLinePunct w:val="0"/>
-        <w:autoSpaceDE/>
-        <w:autoSpaceDN/>
-        <w:bidi w:val="0"/>
-        <w:adjustRightInd/>
-        <w:snapToGrid/>
-        <w:spacing w:line="400" w:lineRule="exact"/>
-        <w:ind w:firstLine="0" w:firstLineChars="0" w:left="0" w:right="0" w:leftChars="0" w:rightChars="0" w:start="0" w:end="0"/>
-        <w:jc w:val="center"/>
-        <w:textAlignment w:val="auto"/>
-        <w:rPr>
-          <w:rFonts w:hint="eastAsia" w:ascii="Times New Roman" w:hAnsi="Times New Roman" w:eastAsia="仿宋" w:cs="仿宋"/>
-          <w:color w:val="000000"/>
-          <w:kern w:val="0"/>
-          <w:sz w:val="32"/>
-          <w:szCs w:val="32"/>
-          <w:lang w:val="en-US" w:eastAsia="zh-CN" w:bidi="ar"/>
-        </w:rPr>
-      </w:pPr>
-      <w:r>
-        <w:rPr>
-          <w:rFonts w:hint="eastAsia" w:ascii="Times New Roman" w:hAnsi="Times New Roman" w:eastAsia="仿宋" w:cs="仿宋"/>
-          <w:color w:val="000000"/>
-          <w:kern w:val="0"/>
-          <w:sz w:val="24"/>
-          <w:szCs w:val="32"/>
-          <w:lang w:val="en-US" w:eastAsia="zh-CN" w:bidi="ar"/>
-        </w:rPr>
-        <w:t>表6  最终复核的各年级平均排队时间</w:t>
       </w:r>
     </w:p>
     <w:p>
@@ -7019,6 +7019,47 @@
           <w:lang w:val="en-US" w:eastAsia="zh-CN" w:bidi="ar"/>
         </w:rPr>
         <w:t>另外，仅按年级错峰时，将相邻年级的出发间隔分别设为5、10、15分钟，得到的平均排队时间分别为10.21、5.03、4.31分钟。这说明，拉大年级间隔也能减少排队。不过，同一年级的各班仍在同一时刻出发，到达食堂的时间较为集中。再将出发安排细化到各班，可以进一步错开这部分学生的到达时间。</w:t>
+      </w:r>
+    </w:p>
+    <w:p>
+      <w:pPr>
+        <w:keepNext/>
+        <w:keepLines w:val="0"/>
+        <w:pageBreakBefore w:val="0"/>
+        <w:widowControl/>
+        <w:suppressLineNumbers w:val="0"/>
+        <w:kinsoku/>
+        <w:wordWrap/>
+        <w:overflowPunct/>
+        <w:topLinePunct w:val="0"/>
+        <w:autoSpaceDE/>
+        <w:autoSpaceDN/>
+        <w:bidi w:val="0"/>
+        <w:adjustRightInd/>
+        <w:snapToGrid/>
+        <w:spacing w:line="400" w:lineRule="exact" w:after="120"/>
+        <w:ind w:firstLine="0" w:firstLineChars="0" w:left="0" w:right="0" w:leftChars="0" w:rightChars="0" w:start="0" w:end="0"/>
+        <w:jc w:val="center"/>
+        <w:textAlignment w:val="auto"/>
+        <w:rPr>
+          <w:rFonts w:hint="eastAsia" w:ascii="Times New Roman" w:hAnsi="Times New Roman" w:eastAsia="仿宋" w:cs="仿宋"/>
+          <w:color w:val="000000"/>
+          <w:kern w:val="0"/>
+          <w:sz w:val="32"/>
+          <w:szCs w:val="32"/>
+          <w:lang w:val="en-US" w:eastAsia="zh-CN" w:bidi="ar"/>
+        </w:rPr>
+      </w:pPr>
+      <w:r>
+        <w:rPr>
+          <w:rFonts w:hint="eastAsia" w:ascii="Times New Roman" w:hAnsi="Times New Roman" w:eastAsia="仿宋" w:cs="仿宋"/>
+          <w:color w:val="000000"/>
+          <w:kern w:val="0"/>
+          <w:sz w:val="24"/>
+          <w:szCs w:val="32"/>
+          <w:lang w:val="en-US" w:eastAsia="zh-CN" w:bidi="ar"/>
+        </w:rPr>
+        <w:t>表7  所选方案前三轮班组出发时刻</w:t>
       </w:r>
     </w:p>
     <w:tbl>
@@ -7420,7 +7461,7 @@
           </w:tcPr>
           <w:p>
             <w:pPr>
-              <w:keepNext/>
+              <w:keepNext w:val="0"/>
               <w:spacing w:line="360" w:lineRule="exact" w:after="40"/>
               <w:ind w:firstLine="0" w:firstLineChars="0" w:left="0" w:right="0" w:leftChars="0" w:rightChars="0" w:start="0" w:end="0"/>
               <w:jc w:val="left"/>
@@ -7448,7 +7489,7 @@
           </w:tcPr>
           <w:p>
             <w:pPr>
-              <w:keepNext/>
+              <w:keepNext w:val="0"/>
               <w:spacing w:line="360" w:lineRule="exact" w:after="40"/>
               <w:ind w:firstLine="0" w:firstLineChars="0" w:left="0" w:right="0" w:leftChars="0" w:rightChars="0" w:start="0" w:end="0"/>
               <w:jc w:val="center"/>
@@ -7476,7 +7517,7 @@
           </w:tcPr>
           <w:p>
             <w:pPr>
-              <w:keepNext/>
+              <w:keepNext w:val="0"/>
               <w:spacing w:line="360" w:lineRule="exact" w:after="40"/>
               <w:ind w:firstLine="0" w:firstLineChars="0" w:left="0" w:right="0" w:leftChars="0" w:rightChars="0" w:start="0" w:end="0"/>
               <w:jc w:val="center"/>
@@ -7504,7 +7545,7 @@
           </w:tcPr>
           <w:p>
             <w:pPr>
-              <w:keepNext/>
+              <w:keepNext w:val="0"/>
               <w:spacing w:line="360" w:lineRule="exact" w:after="40"/>
               <w:ind w:firstLine="0" w:firstLineChars="0" w:left="0" w:right="0" w:leftChars="0" w:rightChars="0" w:start="0" w:end="0"/>
               <w:jc w:val="center"/>
@@ -7523,7 +7564,7 @@
     </w:tbl>
     <w:p>
       <w:pPr>
-        <w:keepNext/>
+        <w:keepNext w:val="0"/>
         <w:keepLines w:val="0"/>
         <w:pageBreakBefore w:val="0"/>
         <w:widowControl/>
@@ -7559,47 +7600,6 @@
           <w:szCs w:val="32"/>
           <w:lang w:val="en-US" w:eastAsia="zh-CN" w:bidi="ar"/>
         </w:rPr>
-      </w:r>
-    </w:p>
-    <w:p>
-      <w:pPr>
-        <w:keepNext w:val="0"/>
-        <w:keepLines w:val="0"/>
-        <w:pageBreakBefore w:val="0"/>
-        <w:widowControl/>
-        <w:suppressLineNumbers w:val="0"/>
-        <w:kinsoku/>
-        <w:wordWrap/>
-        <w:overflowPunct/>
-        <w:topLinePunct w:val="0"/>
-        <w:autoSpaceDE/>
-        <w:autoSpaceDN/>
-        <w:bidi w:val="0"/>
-        <w:adjustRightInd/>
-        <w:snapToGrid/>
-        <w:spacing w:line="400" w:lineRule="exact"/>
-        <w:ind w:firstLine="0" w:firstLineChars="0" w:left="0" w:right="0" w:leftChars="0" w:rightChars="0" w:start="0" w:end="0"/>
-        <w:jc w:val="center"/>
-        <w:textAlignment w:val="auto"/>
-        <w:rPr>
-          <w:rFonts w:hint="eastAsia" w:ascii="Times New Roman" w:hAnsi="Times New Roman" w:eastAsia="仿宋" w:cs="仿宋"/>
-          <w:color w:val="000000"/>
-          <w:kern w:val="0"/>
-          <w:sz w:val="32"/>
-          <w:szCs w:val="32"/>
-          <w:lang w:val="en-US" w:eastAsia="zh-CN" w:bidi="ar"/>
-        </w:rPr>
-      </w:pPr>
-      <w:r>
-        <w:rPr>
-          <w:rFonts w:hint="eastAsia" w:ascii="Times New Roman" w:hAnsi="Times New Roman" w:eastAsia="仿宋" w:cs="仿宋"/>
-          <w:color w:val="000000"/>
-          <w:kern w:val="0"/>
-          <w:sz w:val="24"/>
-          <w:szCs w:val="32"/>
-          <w:lang w:val="en-US" w:eastAsia="zh-CN" w:bidi="ar"/>
-        </w:rPr>
-        <w:t>表7  所选方案前三轮班组出发时刻</w:t>
       </w:r>
     </w:p>
     <w:p>
@@ -8063,338 +8063,6 @@
     </w:p>
     <w:p>
       <w:pPr>
-        <w:keepNext/>
-        <w:keepLines w:val="0"/>
-        <w:pageBreakBefore/>
-        <w:widowControl/>
-        <w:numPr>
-          <w:ilvl w:val="0"/>
-          <w:numId w:val="0"/>
-        </w:numPr>
-        <w:suppressLineNumbers w:val="0"/>
-        <w:kinsoku/>
-        <w:wordWrap/>
-        <w:overflowPunct/>
-        <w:topLinePunct w:val="0"/>
-        <w:autoSpaceDE/>
-        <w:autoSpaceDN/>
-        <w:bidi w:val="0"/>
-        <w:adjustRightInd/>
-        <w:snapToGrid/>
-        <w:spacing w:line="560" w:lineRule="exact"/>
-        <w:ind w:firstLine="632" w:firstLineChars="200"/>
-        <w:jc w:val="both"/>
-        <w:textAlignment w:val="auto"/>
-        <w:rPr>
-          <w:rFonts w:hint="eastAsia" w:ascii="黑体" w:hAnsi="宋体" w:eastAsia="黑体" w:cs="黑体"/>
-          <w:color w:val="000000"/>
-          <w:kern w:val="0"/>
-          <w:sz w:val="32"/>
-          <w:szCs w:val="32"/>
-          <w:lang w:val="en-US" w:eastAsia="zh-CN" w:bidi="ar"/>
-        </w:rPr>
-      </w:pPr>
-      <w:r>
-        <w:rPr>
-          <w:rFonts w:hint="eastAsia" w:ascii="黑体" w:hAnsi="宋体" w:eastAsia="黑体" w:cs="黑体"/>
-          <w:color w:val="000000"/>
-          <w:kern w:val="0"/>
-          <w:sz w:val="32"/>
-          <w:szCs w:val="32"/>
-          <w:lang w:val="en-US" w:eastAsia="zh-CN" w:bidi="ar"/>
-        </w:rPr>
-        <w:t>参考资料</w:t>
-      </w:r>
-    </w:p>
-    <w:p>
-      <w:pPr>
-        <w:keepNext w:val="0"/>
-        <w:keepLines w:val="0"/>
-        <w:pageBreakBefore w:val="0"/>
-        <w:widowControl/>
-        <w:suppressLineNumbers w:val="0"/>
-        <w:kinsoku/>
-        <w:wordWrap/>
-        <w:overflowPunct/>
-        <w:topLinePunct w:val="0"/>
-        <w:autoSpaceDE/>
-        <w:autoSpaceDN/>
-        <w:bidi w:val="0"/>
-        <w:adjustRightInd/>
-        <w:snapToGrid/>
-        <w:spacing w:line="360" w:lineRule="exact" w:after="0"/>
-        <w:ind w:firstLine="0" w:firstLineChars="0" w:left="0" w:right="0" w:leftChars="0" w:rightChars="0" w:start="0" w:end="0"/>
-        <w:jc w:val="left"/>
-        <w:textAlignment w:val="auto"/>
-        <w:rPr>
-          <w:rFonts w:hint="eastAsia" w:ascii="Times New Roman" w:hAnsi="Times New Roman" w:eastAsia="仿宋" w:cs="仿宋"/>
-          <w:color w:val="000000"/>
-          <w:kern w:val="0"/>
-          <w:sz w:val="32"/>
-          <w:szCs w:val="32"/>
-          <w:lang w:val="en-US" w:eastAsia="zh-CN" w:bidi="ar"/>
-        </w:rPr>
-      </w:pPr>
-      <w:r>
-        <w:rPr>
-          <w:rFonts w:hint="eastAsia" w:ascii="Times New Roman" w:hAnsi="Times New Roman" w:eastAsia="仿宋" w:cs="仿宋"/>
-          <w:color w:val="000000"/>
-          <w:kern w:val="0"/>
-          <w:sz w:val="24"/>
-          <w:szCs w:val="32"/>
-          <w:lang w:val="en-US" w:eastAsia="zh-CN" w:bidi="ar"/>
-        </w:rPr>
-        <w:t>[1] 北京外国语大学附属外国语学校．2013—2014学年第一学期中学生用餐管理方案．2013-08-30．https://bwfxnw.bfsu.edu.cn/info/1153/5926.htm</w:t>
-      </w:r>
-    </w:p>
-    <w:p>
-      <w:pPr>
-        <w:keepNext w:val="0"/>
-        <w:keepLines w:val="0"/>
-        <w:pageBreakBefore w:val="0"/>
-        <w:widowControl/>
-        <w:suppressLineNumbers w:val="0"/>
-        <w:kinsoku/>
-        <w:wordWrap/>
-        <w:overflowPunct/>
-        <w:topLinePunct w:val="0"/>
-        <w:autoSpaceDE/>
-        <w:autoSpaceDN/>
-        <w:bidi w:val="0"/>
-        <w:adjustRightInd/>
-        <w:snapToGrid/>
-        <w:spacing w:line="360" w:lineRule="exact" w:after="0"/>
-        <w:ind w:firstLine="0" w:firstLineChars="0" w:left="0" w:right="0" w:leftChars="0" w:rightChars="0" w:start="0" w:end="0"/>
-        <w:jc w:val="left"/>
-        <w:textAlignment w:val="auto"/>
-        <w:rPr>
-          <w:rFonts w:hint="eastAsia" w:ascii="Times New Roman" w:hAnsi="Times New Roman" w:eastAsia="仿宋" w:cs="仿宋"/>
-          <w:color w:val="000000"/>
-          <w:kern w:val="0"/>
-          <w:sz w:val="32"/>
-          <w:szCs w:val="32"/>
-          <w:lang w:val="en-US" w:eastAsia="zh-CN" w:bidi="ar"/>
-        </w:rPr>
-      </w:pPr>
-      <w:r>
-        <w:rPr>
-          <w:rFonts w:hint="eastAsia" w:ascii="Times New Roman" w:hAnsi="Times New Roman" w:eastAsia="仿宋" w:cs="仿宋"/>
-          <w:color w:val="000000"/>
-          <w:kern w:val="0"/>
-          <w:sz w:val="24"/>
-          <w:szCs w:val="32"/>
-          <w:lang w:val="en-US" w:eastAsia="zh-CN" w:bidi="ar"/>
-        </w:rPr>
-        <w:t>[2] 辽宁师范大学附属中学．德育工作简报第74期．2022-10-28．https://lsdfz.lnnu.edu.cn/info/1039/1829.htm</w:t>
-      </w:r>
-    </w:p>
-    <w:p>
-      <w:pPr>
-        <w:keepNext w:val="0"/>
-        <w:keepLines w:val="0"/>
-        <w:pageBreakBefore w:val="0"/>
-        <w:widowControl/>
-        <w:suppressLineNumbers w:val="0"/>
-        <w:kinsoku/>
-        <w:wordWrap/>
-        <w:overflowPunct/>
-        <w:topLinePunct w:val="0"/>
-        <w:autoSpaceDE/>
-        <w:autoSpaceDN/>
-        <w:bidi w:val="0"/>
-        <w:adjustRightInd/>
-        <w:snapToGrid/>
-        <w:spacing w:line="360" w:lineRule="exact" w:after="0"/>
-        <w:ind w:firstLine="0" w:firstLineChars="0" w:left="0" w:right="0" w:leftChars="0" w:rightChars="0" w:start="0" w:end="0"/>
-        <w:jc w:val="left"/>
-        <w:textAlignment w:val="auto"/>
-        <w:rPr>
-          <w:rFonts w:hint="eastAsia" w:ascii="Times New Roman" w:hAnsi="Times New Roman" w:eastAsia="仿宋" w:cs="仿宋"/>
-          <w:color w:val="000000"/>
-          <w:kern w:val="0"/>
-          <w:sz w:val="32"/>
-          <w:szCs w:val="32"/>
-          <w:lang w:val="en-US" w:eastAsia="zh-CN" w:bidi="ar"/>
-        </w:rPr>
-      </w:pPr>
-      <w:r>
-        <w:rPr>
-          <w:rFonts w:hint="eastAsia" w:ascii="Times New Roman" w:hAnsi="Times New Roman" w:eastAsia="仿宋" w:cs="仿宋"/>
-          <w:color w:val="000000"/>
-          <w:kern w:val="0"/>
-          <w:sz w:val="24"/>
-          <w:szCs w:val="32"/>
-          <w:lang w:val="en-US" w:eastAsia="zh-CN" w:bidi="ar"/>
-        </w:rPr>
-        <w:t>[3] 高渝淳，尹楷，罗添，李阳，张慧．关于国内高校食堂设计的研究：文献综述——基于数学模型的食堂设计研究[J]．应用数学进展，2019，8(5)：1036—1041．DOI：10.12677/aam.2019.85118．</w:t>
-      </w:r>
-    </w:p>
-    <w:p>
-      <w:pPr>
-        <w:keepNext w:val="0"/>
-        <w:keepLines w:val="0"/>
-        <w:pageBreakBefore w:val="0"/>
-        <w:widowControl/>
-        <w:suppressLineNumbers w:val="0"/>
-        <w:kinsoku/>
-        <w:wordWrap/>
-        <w:overflowPunct/>
-        <w:topLinePunct w:val="0"/>
-        <w:autoSpaceDE/>
-        <w:autoSpaceDN/>
-        <w:bidi w:val="0"/>
-        <w:adjustRightInd/>
-        <w:snapToGrid/>
-        <w:spacing w:line="360" w:lineRule="exact" w:after="0"/>
-        <w:ind w:firstLine="0" w:firstLineChars="0" w:left="0" w:right="0" w:leftChars="0" w:rightChars="0" w:start="0" w:end="0"/>
-        <w:jc w:val="left"/>
-        <w:textAlignment w:val="auto"/>
-        <w:rPr>
-          <w:rFonts w:hint="eastAsia" w:ascii="Times New Roman" w:hAnsi="Times New Roman" w:eastAsia="仿宋" w:cs="仿宋"/>
-          <w:color w:val="000000"/>
-          <w:kern w:val="0"/>
-          <w:sz w:val="32"/>
-          <w:szCs w:val="32"/>
-          <w:lang w:val="en-US" w:eastAsia="zh-CN" w:bidi="ar"/>
-        </w:rPr>
-      </w:pPr>
-      <w:r>
-        <w:rPr>
-          <w:rFonts w:hint="eastAsia" w:ascii="Times New Roman" w:hAnsi="Times New Roman" w:eastAsia="仿宋" w:cs="仿宋"/>
-          <w:color w:val="000000"/>
-          <w:kern w:val="0"/>
-          <w:sz w:val="24"/>
-          <w:szCs w:val="32"/>
-          <w:lang w:val="en-US" w:eastAsia="zh-CN" w:bidi="ar"/>
-        </w:rPr>
-        <w:t>[4] 何恒，胡钟敏，张顶立．基于Flexsim仿真的快餐厅系统改进研究[J]．广西科技大学学报，2019，30(3)：70—75．DOI：10.16375/j.cnki.cn45-1395/t.2019.03.012．</w:t>
-      </w:r>
-    </w:p>
-    <w:p>
-      <w:pPr>
-        <w:keepNext w:val="0"/>
-        <w:keepLines w:val="0"/>
-        <w:pageBreakBefore w:val="0"/>
-        <w:widowControl/>
-        <w:suppressLineNumbers w:val="0"/>
-        <w:kinsoku/>
-        <w:wordWrap/>
-        <w:overflowPunct/>
-        <w:topLinePunct w:val="0"/>
-        <w:autoSpaceDE/>
-        <w:autoSpaceDN/>
-        <w:bidi w:val="0"/>
-        <w:adjustRightInd/>
-        <w:snapToGrid/>
-        <w:spacing w:line="360" w:lineRule="exact" w:after="0"/>
-        <w:ind w:firstLine="0" w:firstLineChars="0" w:left="0" w:right="0" w:leftChars="0" w:rightChars="0" w:start="0" w:end="0"/>
-        <w:jc w:val="left"/>
-        <w:textAlignment w:val="auto"/>
-        <w:rPr>
-          <w:rFonts w:hint="eastAsia" w:ascii="Times New Roman" w:hAnsi="Times New Roman" w:eastAsia="仿宋" w:cs="仿宋"/>
-          <w:color w:val="000000"/>
-          <w:kern w:val="0"/>
-          <w:sz w:val="32"/>
-          <w:szCs w:val="32"/>
-          <w:lang w:val="en-US" w:eastAsia="zh-CN" w:bidi="ar"/>
-        </w:rPr>
-      </w:pPr>
-      <w:r>
-        <w:rPr>
-          <w:rFonts w:hint="eastAsia" w:ascii="Times New Roman" w:hAnsi="Times New Roman" w:eastAsia="仿宋" w:cs="仿宋"/>
-          <w:color w:val="000000"/>
-          <w:kern w:val="0"/>
-          <w:sz w:val="24"/>
-          <w:szCs w:val="32"/>
-          <w:lang w:val="en-US" w:eastAsia="zh-CN" w:bidi="ar"/>
-        </w:rPr>
-        <w:t>[5] 刘兴果，李思怡，宋思瑶．时变排队模型下的高校食堂排队预测研究[J]．计算机科学与应用，2026，16(9)：62—73．DOI：10.12677/csa.2026.169289．</w:t>
-      </w:r>
-    </w:p>
-    <w:p>
-      <w:pPr>
-        <w:keepNext w:val="0"/>
-        <w:keepLines w:val="0"/>
-        <w:pageBreakBefore w:val="0"/>
-        <w:widowControl/>
-        <w:suppressLineNumbers w:val="0"/>
-        <w:kinsoku/>
-        <w:wordWrap/>
-        <w:overflowPunct/>
-        <w:topLinePunct w:val="0"/>
-        <w:autoSpaceDE/>
-        <w:autoSpaceDN/>
-        <w:bidi w:val="0"/>
-        <w:adjustRightInd/>
-        <w:snapToGrid/>
-        <w:spacing w:line="360" w:lineRule="exact" w:after="0"/>
-        <w:ind w:firstLine="0" w:firstLineChars="0" w:left="0" w:right="0" w:leftChars="0" w:rightChars="0" w:start="0" w:end="0"/>
-        <w:jc w:val="left"/>
-        <w:textAlignment w:val="auto"/>
-        <w:rPr>
-          <w:rFonts w:hint="eastAsia" w:ascii="Times New Roman" w:hAnsi="Times New Roman" w:eastAsia="仿宋" w:cs="仿宋"/>
-          <w:color w:val="000000"/>
-          <w:kern w:val="0"/>
-          <w:sz w:val="32"/>
-          <w:szCs w:val="32"/>
-          <w:lang w:val="en-US" w:eastAsia="zh-CN" w:bidi="ar"/>
-        </w:rPr>
-      </w:pPr>
-      <w:r>
-        <w:rPr>
-          <w:rFonts w:hint="eastAsia" w:ascii="Times New Roman" w:hAnsi="Times New Roman" w:eastAsia="仿宋" w:cs="仿宋"/>
-          <w:color w:val="000000"/>
-          <w:kern w:val="0"/>
-          <w:sz w:val="24"/>
-          <w:szCs w:val="32"/>
-          <w:lang w:val="en-US" w:eastAsia="zh-CN" w:bidi="ar"/>
-        </w:rPr>
-        <w:t>[6] 科学传播网．竞赛干货｜青少年科技创新大赛研究报告怎么写？2022-11-29．（报告结构参考）</w:t>
-      </w:r>
-    </w:p>
-    <w:p>
-      <w:pPr>
-        <w:keepNext w:val="0"/>
-        <w:keepLines w:val="0"/>
-        <w:pageBreakBefore w:val="0"/>
-        <w:widowControl/>
-        <w:suppressLineNumbers w:val="0"/>
-        <w:kinsoku/>
-        <w:wordWrap/>
-        <w:overflowPunct/>
-        <w:topLinePunct w:val="0"/>
-        <w:autoSpaceDE/>
-        <w:autoSpaceDN/>
-        <w:bidi w:val="0"/>
-        <w:adjustRightInd/>
-        <w:snapToGrid/>
-        <w:spacing w:line="360" w:lineRule="exact" w:after="0"/>
-        <w:ind w:firstLine="0" w:firstLineChars="0" w:left="0" w:right="0" w:leftChars="0" w:rightChars="0" w:start="0" w:end="0"/>
-        <w:jc w:val="left"/>
-        <w:textAlignment w:val="auto"/>
-        <w:rPr>
-          <w:rFonts w:hint="eastAsia" w:ascii="Times New Roman" w:hAnsi="Times New Roman" w:eastAsia="仿宋" w:cs="仿宋"/>
-          <w:color w:val="000000"/>
-          <w:kern w:val="0"/>
-          <w:sz w:val="32"/>
-          <w:szCs w:val="32"/>
-          <w:lang w:val="en-US" w:eastAsia="zh-CN" w:bidi="ar"/>
-        </w:rPr>
-      </w:pPr>
-      <w:r>
-        <w:rPr>
-          <w:rFonts w:hint="eastAsia" w:ascii="Times New Roman" w:hAnsi="Times New Roman" w:eastAsia="仿宋" w:cs="仿宋"/>
-          <w:color w:val="000000"/>
-          <w:kern w:val="0"/>
-          <w:sz w:val="24"/>
-          <w:szCs w:val="32"/>
-          <w:lang w:val="en-US" w:eastAsia="zh-CN" w:bidi="ar"/>
-        </w:rPr>
-        <w:t>[7] 青少年科技创新大赛获奖案例分析（附历届获奖作品集）．（案例写法参考）</w:t>
-      </w:r>
-    </w:p>
-    <w:p>
-      <w:pPr>
         <w:keepNext w:val="0"/>
         <w:keepLines w:val="0"/>
         <w:pageBreakBefore w:val="0"/>
@@ -8431,7 +8099,7 @@
           <w:szCs w:val="32"/>
           <w:lang w:val="en-US" w:eastAsia="zh-CN" w:bidi="ar"/>
         </w:rPr>
-        <w:t>程序、检索、绘图和文字整理使用AI辅助，记录另附。</w:t>
+        <w:t>程序、绘图和文字整理使用AI辅助，记录另附。</w:t>
       </w:r>
     </w:p>
     <w:sectPr>

</xml_diff>

<commit_message>
Simplify navigation and improve key metric readability
</commit_message>
<xml_diff>
--- a/data/report.docx
+++ b/data/report.docx
@@ -1540,7 +1540,7 @@
           <w:szCs w:val="32"/>
           <w:lang w:val="en-US" w:eastAsia="zh-CN" w:bidi="ar"/>
         </w:rPr>
-        <w:t>软件按“选择方案—过程展示—结果展示”三个步骤组织。使用者先选择一种预设安排，填写各年级人数、班级数、开放窗口数量和可用座位数量，也可微调出发间隔。点击“查看就餐过程”后，软件按所填参数计算并展示学生就餐过程；再点击“查看结果”，即可查看平均排队时间、各年级结果和排队人数曲线。结果页还提供三种安排比较和出发间隔比较，选定方案后可导出班级放行表。</w:t>
+        <w:t>软件按“选择方案—运行过程—仿真结果”三个步骤组织。使用者先选择一种预设安排，填写各年级人数、班级数、开放窗口数量和可用座位数量，也可微调出发间隔。点击“开始仿真”后，软件按所填参数计算并展示学生就餐过程；再点击“查看结果”，即可查看平均排队时间、各年级结果和排队人数曲线。结果页还提供三种安排比较和出发间隔比较，选定方案后可导出班级放行表。</w:t>
       </w:r>
     </w:p>
     <w:p>
@@ -1552,7 +1552,7 @@
       <w:r>
         <w:drawing>
           <wp:inline xmlns:a="http://schemas.openxmlformats.org/drawingml/2006/main" xmlns:pic="http://schemas.openxmlformats.org/drawingml/2006/picture">
-            <wp:extent cx="5472000" cy="4280362"/>
+            <wp:extent cx="5472000" cy="4604488"/>
             <wp:docPr id="2" name="Picture 2"/>
             <wp:cNvGraphicFramePr>
               <a:graphicFrameLocks noChangeAspect="1"/>
@@ -1573,7 +1573,7 @@
                   <pic:spPr>
                     <a:xfrm>
                       <a:off x="0" y="0"/>
-                      <a:ext cx="5472000" cy="4280362"/>
+                      <a:ext cx="5472000" cy="4604488"/>
                     </a:xfrm>
                     <a:prstGeom prst="rect"/>
                   </pic:spPr>
@@ -1675,7 +1675,7 @@
       <w:r>
         <w:drawing>
           <wp:inline xmlns:a="http://schemas.openxmlformats.org/drawingml/2006/main" xmlns:pic="http://schemas.openxmlformats.org/drawingml/2006/picture">
-            <wp:extent cx="5472000" cy="3569968"/>
+            <wp:extent cx="5472000" cy="3577283"/>
             <wp:docPr id="3" name="Picture 3"/>
             <wp:cNvGraphicFramePr>
               <a:graphicFrameLocks noChangeAspect="1"/>
@@ -1696,7 +1696,7 @@
                   <pic:spPr>
                     <a:xfrm>
                       <a:off x="0" y="0"/>
-                      <a:ext cx="5472000" cy="3569968"/>
+                      <a:ext cx="5472000" cy="3577283"/>
                     </a:xfrm>
                     <a:prstGeom prst="rect"/>
                   </pic:spPr>

</xml_diff>

<commit_message>
Generate exact seating and add draggable grade order
</commit_message>
<xml_diff>
--- a/data/report.docx
+++ b/data/report.docx
@@ -1552,7 +1552,7 @@
       <w:r>
         <w:drawing>
           <wp:inline xmlns:a="http://schemas.openxmlformats.org/drawingml/2006/main" xmlns:pic="http://schemas.openxmlformats.org/drawingml/2006/picture">
-            <wp:extent cx="5472000" cy="4604488"/>
+            <wp:extent cx="5472000" cy="5262272"/>
             <wp:docPr id="2" name="Picture 2"/>
             <wp:cNvGraphicFramePr>
               <a:graphicFrameLocks noChangeAspect="1"/>
@@ -1573,7 +1573,7 @@
                   <pic:spPr>
                     <a:xfrm>
                       <a:off x="0" y="0"/>
-                      <a:ext cx="5472000" cy="4604488"/>
+                      <a:ext cx="5472000" cy="5262272"/>
                     </a:xfrm>
                     <a:prstGeom prst="rect"/>
                   </pic:spPr>
@@ -1663,7 +1663,7 @@
           <w:szCs w:val="32"/>
           <w:lang w:val="en-US" w:eastAsia="zh-CN" w:bidi="ar"/>
         </w:rPr>
-        <w:t>网页界面、就餐过程计算和三维回放均用JavaScript编写。另外编写了Python工具，独立生成放行表，并与网页导出的放行表核对。网页程序记录每名学生到达窗口、开始打饭、取餐结束、入座和返回教室的时刻，据此计算排队时间和完整用时。三维页面使用这些记录，展示学生排队、取餐、端盘走到餐桌和入座的过程，使计算结果更容易理解。使用者可点击画面中的人物，或输入模拟学生编号，查看该学生的就餐记录和轨迹。</w:t>
+        <w:t>网页界面、就餐过程计算和三维回放均用JavaScript编写。另外编写了Python工具，独立生成放行表，并与网页导出的放行表核对。网页程序记录每名学生到达窗口、开始打饭、取餐结束、入座和返回教室的时刻，据此计算排队时间和完整用时。餐桌按座位数量生成，每桌最多八个座位。学生的入座位置和步行路线使用同一套布局，修改座位数量后，餐桌、椅子和路线会一起更新。三维页面根据时间记录展示排队、取餐、走到餐桌和入座的过程。使用者可点击画面中的人物，或输入模拟学生编号，查看该学生的就餐记录和轨迹。</w:t>
       </w:r>
     </w:p>
     <w:p>
@@ -1675,7 +1675,7 @@
       <w:r>
         <w:drawing>
           <wp:inline xmlns:a="http://schemas.openxmlformats.org/drawingml/2006/main" xmlns:pic="http://schemas.openxmlformats.org/drawingml/2006/picture">
-            <wp:extent cx="5472000" cy="3577283"/>
+            <wp:extent cx="5472000" cy="3569968"/>
             <wp:docPr id="3" name="Picture 3"/>
             <wp:cNvGraphicFramePr>
               <a:graphicFrameLocks noChangeAspect="1"/>
@@ -1696,7 +1696,7 @@
                   <pic:spPr>
                     <a:xfrm>
                       <a:off x="0" y="0"/>
-                      <a:ext cx="5472000" cy="3577283"/>
+                      <a:ext cx="5472000" cy="3569968"/>
                     </a:xfrm>
                     <a:prstGeom prst="rect"/>
                   </pic:spPr>
@@ -3214,7 +3214,7 @@
                 <w:color w:val="000000"/>
                 <w:sz w:val="24"/>
               </w:rPr>
-              <w:t>33.13</w:t>
+              <w:t>33.72</w:t>
             </w:r>
           </w:p>
         </w:tc>
@@ -3331,7 +3331,7 @@
                 <w:color w:val="000000"/>
                 <w:sz w:val="24"/>
               </w:rPr>
-              <w:t>33.39</w:t>
+              <w:t>33.99</w:t>
             </w:r>
           </w:p>
         </w:tc>
@@ -3448,7 +3448,7 @@
                 <w:color w:val="000000"/>
                 <w:sz w:val="24"/>
               </w:rPr>
-              <w:t>35.00</w:t>
+              <w:t>35.57</w:t>
             </w:r>
           </w:p>
         </w:tc>
@@ -4117,7 +4117,7 @@
                 <w:color w:val="000000"/>
                 <w:sz w:val="24"/>
               </w:rPr>
-              <w:t>33.15</w:t>
+              <w:t>33.73</w:t>
             </w:r>
           </w:p>
         </w:tc>
@@ -4145,7 +4145,7 @@
                 <w:color w:val="000000"/>
                 <w:sz w:val="24"/>
               </w:rPr>
-              <w:t>12:50:14</w:t>
+              <w:t>12:50:43</w:t>
             </w:r>
           </w:p>
         </w:tc>
@@ -4234,7 +4234,7 @@
                 <w:color w:val="000000"/>
                 <w:sz w:val="24"/>
               </w:rPr>
-              <w:t>33.92</w:t>
+              <w:t>34.51</w:t>
             </w:r>
           </w:p>
         </w:tc>
@@ -4262,7 +4262,7 @@
                 <w:color w:val="000000"/>
                 <w:sz w:val="24"/>
               </w:rPr>
-              <w:t>12:49:37</w:t>
+              <w:t>12:50:19</w:t>
             </w:r>
           </w:p>
         </w:tc>
@@ -4351,7 +4351,7 @@
                 <w:color w:val="000000"/>
                 <w:sz w:val="24"/>
               </w:rPr>
-              <w:t>34.17</w:t>
+              <w:t>34.76</w:t>
             </w:r>
           </w:p>
         </w:tc>
@@ -4379,7 +4379,7 @@
                 <w:color w:val="000000"/>
                 <w:sz w:val="24"/>
               </w:rPr>
-              <w:t>12:50:20</w:t>
+              <w:t>12:51:08</w:t>
             </w:r>
           </w:p>
         </w:tc>
@@ -4468,7 +4468,7 @@
                 <w:color w:val="000000"/>
                 <w:sz w:val="24"/>
               </w:rPr>
-              <w:t>34.37</w:t>
+              <w:t>34.96</w:t>
             </w:r>
           </w:p>
         </w:tc>
@@ -4496,7 +4496,7 @@
                 <w:color w:val="000000"/>
                 <w:sz w:val="24"/>
               </w:rPr>
-              <w:t>12:50:01</w:t>
+              <w:t>12:50:58</w:t>
             </w:r>
           </w:p>
         </w:tc>
@@ -4585,7 +4585,7 @@
                 <w:color w:val="000000"/>
                 <w:sz w:val="24"/>
               </w:rPr>
-              <w:t>34.47</w:t>
+              <w:t>35.06</w:t>
             </w:r>
           </w:p>
         </w:tc>
@@ -4613,7 +4613,7 @@
                 <w:color w:val="000000"/>
                 <w:sz w:val="24"/>
               </w:rPr>
-              <w:t>12:50:26</w:t>
+              <w:t>12:50:58</w:t>
             </w:r>
           </w:p>
         </w:tc>
@@ -4702,7 +4702,7 @@
                 <w:color w:val="000000"/>
                 <w:sz w:val="24"/>
               </w:rPr>
-              <w:t>34.61</w:t>
+              <w:t>35.20</w:t>
             </w:r>
           </w:p>
         </w:tc>
@@ -4730,7 +4730,7 @@
                 <w:color w:val="000000"/>
                 <w:sz w:val="24"/>
               </w:rPr>
-              <w:t>12:50:42</w:t>
+              <w:t>12:51:29</w:t>
             </w:r>
           </w:p>
         </w:tc>
@@ -4819,7 +4819,7 @@
                 <w:color w:val="000000"/>
                 <w:sz w:val="24"/>
               </w:rPr>
-              <w:t>34.92</w:t>
+              <w:t>35.49</w:t>
             </w:r>
           </w:p>
         </w:tc>
@@ -4847,7 +4847,7 @@
                 <w:color w:val="000000"/>
                 <w:sz w:val="24"/>
               </w:rPr>
-              <w:t>12:53:09</w:t>
+              <w:t>12:52:58</w:t>
             </w:r>
           </w:p>
         </w:tc>
@@ -4936,7 +4936,7 @@
                 <w:color w:val="000000"/>
                 <w:sz w:val="24"/>
               </w:rPr>
-              <w:t>35.70</w:t>
+              <w:t>36.19</w:t>
             </w:r>
           </w:p>
         </w:tc>
@@ -4964,7 +4964,7 @@
                 <w:color w:val="000000"/>
                 <w:sz w:val="24"/>
               </w:rPr>
-              <w:t>12:55:47</w:t>
+              <w:t>12:56:31</w:t>
             </w:r>
           </w:p>
         </w:tc>
@@ -5053,7 +5053,7 @@
                 <w:color w:val="000000"/>
                 <w:sz w:val="24"/>
               </w:rPr>
-              <w:t>36.86</w:t>
+              <w:t>37.23</w:t>
             </w:r>
           </w:p>
         </w:tc>
@@ -5081,7 +5081,7 @@
                 <w:color w:val="000000"/>
                 <w:sz w:val="24"/>
               </w:rPr>
-              <w:t>12:59:02</w:t>
+              <w:t>12:58:43</w:t>
             </w:r>
           </w:p>
         </w:tc>
@@ -5170,7 +5170,7 @@
                 <w:color w:val="000000"/>
                 <w:sz w:val="24"/>
               </w:rPr>
-              <w:t>38.12</w:t>
+              <w:t>38.48</w:t>
             </w:r>
           </w:p>
         </w:tc>
@@ -5198,7 +5198,7 @@
                 <w:color w:val="000000"/>
                 <w:sz w:val="24"/>
               </w:rPr>
-              <w:t>13:01:40</w:t>
+              <w:t>13:01:47</w:t>
             </w:r>
           </w:p>
         </w:tc>
@@ -5287,7 +5287,7 @@
                 <w:color w:val="000000"/>
                 <w:sz w:val="24"/>
               </w:rPr>
-              <w:t>42.03</w:t>
+              <w:t>42.38</w:t>
             </w:r>
           </w:p>
         </w:tc>
@@ -5315,7 +5315,7 @@
                 <w:color w:val="000000"/>
                 <w:sz w:val="24"/>
               </w:rPr>
-              <w:t>13:10:40</w:t>
+              <w:t>13:11:08</w:t>
             </w:r>
           </w:p>
         </w:tc>
@@ -5404,7 +5404,7 @@
                 <w:color w:val="000000"/>
                 <w:sz w:val="24"/>
               </w:rPr>
-              <w:t>45.99</w:t>
+              <w:t>46.35</w:t>
             </w:r>
           </w:p>
         </w:tc>
@@ -5432,7 +5432,7 @@
                 <w:color w:val="000000"/>
                 <w:sz w:val="24"/>
               </w:rPr>
-              <w:t>13:19:01</w:t>
+              <w:t>13:19:35</w:t>
             </w:r>
           </w:p>
         </w:tc>
@@ -5521,7 +5521,7 @@
                 <w:color w:val="000000"/>
                 <w:sz w:val="24"/>
               </w:rPr>
-              <w:t>49.98</w:t>
+              <w:t>50.34</w:t>
             </w:r>
           </w:p>
         </w:tc>
@@ -5549,7 +5549,7 @@
                 <w:color w:val="000000"/>
                 <w:sz w:val="24"/>
               </w:rPr>
-              <w:t>13:27:55</w:t>
+              <w:t>13:28:25</w:t>
             </w:r>
           </w:p>
         </w:tc>
@@ -5715,7 +5715,7 @@
           <w:szCs w:val="32"/>
           <w:lang w:val="en-US" w:eastAsia="zh-CN" w:bidi="ar"/>
         </w:rPr>
-        <w:t>相邻组间隔由60秒增加到70秒时，平均排队时间从1.07分钟减少到0.53分钟，平均完整用时则从34.92分钟增加到36.86分钟。间隔为70秒时，30次计算中最后一名学生最晚在12:59:02返回教室，早于13:00；间隔为75秒时，排队时间更短，但最晚返回教室的时刻为13:01:40，已超过13:00。因此，在本次比较的13个间隔中选择70秒。随后重新生成全体学生的集合、步行、打饭和用餐时间，再计算三种方案，检查结果是否仍然成立。</w:t>
+        <w:t>相邻组间隔由60秒增加到70秒时，平均排队时间从1.07分钟减少到0.53分钟，平均完整用时则从35.49分钟增加到37.23分钟。间隔为70秒时，30次计算中最后一名学生最晚在12:58:43返回教室，早于13:00；间隔为75秒时，排队时间更短，但最晚返回教室的时刻为13:01:47，已超过13:00。因此，在本次比较的13个间隔中选择70秒。随后重新生成全体学生的集合、步行、打饭和用餐时间，再计算三种方案，检查结果是否仍然成立。</w:t>
       </w:r>
     </w:p>
     <w:p>
@@ -6044,7 +6044,7 @@
                 <w:color w:val="000000"/>
                 <w:sz w:val="24"/>
               </w:rPr>
-              <w:t>33.19</w:t>
+              <w:t>33.77</w:t>
             </w:r>
           </w:p>
         </w:tc>
@@ -6072,7 +6072,7 @@
                 <w:color w:val="000000"/>
                 <w:sz w:val="24"/>
               </w:rPr>
-              <w:t>12:50:41</w:t>
+              <w:t>12:51:56</w:t>
             </w:r>
           </w:p>
         </w:tc>
@@ -6161,7 +6161,7 @@
                 <w:color w:val="000000"/>
                 <w:sz w:val="24"/>
               </w:rPr>
-              <w:t>33.37</w:t>
+              <w:t>33.96</w:t>
             </w:r>
           </w:p>
         </w:tc>
@@ -6189,7 +6189,7 @@
                 <w:color w:val="000000"/>
                 <w:sz w:val="24"/>
               </w:rPr>
-              <w:t>12:50:36</w:t>
+              <w:t>12:51:14</w:t>
             </w:r>
           </w:p>
         </w:tc>
@@ -6278,7 +6278,7 @@
                 <w:color w:val="000000"/>
                 <w:sz w:val="24"/>
               </w:rPr>
-              <w:t>36.90</w:t>
+              <w:t>37.27</w:t>
             </w:r>
           </w:p>
         </w:tc>
@@ -6306,7 +6306,7 @@
                 <w:color w:val="000000"/>
                 <w:sz w:val="24"/>
               </w:rPr>
-              <w:t>12:56:34</w:t>
+              <w:t>12:57:10</w:t>
             </w:r>
           </w:p>
         </w:tc>
@@ -6390,7 +6390,7 @@
           <w:szCs w:val="32"/>
           <w:lang w:val="en-US" w:eastAsia="zh-CN" w:bidi="ar"/>
         </w:rPr>
-        <w:t>重新计算后，仅按年级错峰时，学生平均排队5.05分钟；年级与班级结合错峰时，平均排队0.54分钟。两者相比，平均排队时间减少4.51分钟，约减少89.4%，平均完整用时增加3.53分钟。这是因为部分班级需要更晚出发：学生在食堂站队的时间缩短了，在教室等待出发的时间却增加了，返回教室的平均时刻也随之推后。</w:t>
+        <w:t>重新计算后，仅按年级错峰时，学生平均排队5.05分钟；年级与班级结合错峰时，平均排队0.54分钟。两者相比，平均排队时间减少4.51分钟，约减少89.4%，平均完整用时增加3.31分钟。这是因为部分班级需要更晚出发：学生在食堂站队的时间缩短了，在教室等待出发的时间却增加了，返回教室的平均时刻也随之推后。</w:t>
       </w:r>
     </w:p>
     <w:p>
@@ -7894,7 +7894,7 @@
           <w:szCs w:val="32"/>
           <w:lang w:val="en-US" w:eastAsia="zh-CN" w:bidi="ar"/>
         </w:rPr>
-        <w:t>确定相邻班级的出发间隔时，应同时考虑窗口接待速度和午间可用时间。本次比较了13个间隔，选择70秒后，重新计算时最后一名学生最晚在12:56:34返回教室，早于本次设定的13:00。相比仅按年级错峰，平均完整用时增加3.53分钟。因此，学校在缩短食堂排队时间的同时，也要给等待出发、用餐和返回教室留出足够时间。</w:t>
+        <w:t>确定相邻班级的出发间隔时，应同时考虑窗口接待速度和午间可用时间。本次比较了13个间隔，选择70秒后，重新计算时最后一名学生最晚在12:57:10返回教室，早于本次设定的13:00。相比仅按年级错峰，平均完整用时增加3.31分钟。因此，学校在缩短食堂排队时间的同时，也要给等待出发、用餐和返回教室留出足够时间。</w:t>
       </w:r>
     </w:p>
     <w:p>

</xml_diff>

<commit_message>
Add interactive queue chart and synchronize readable documents
</commit_message>
<xml_diff>
--- a/data/report.docx
+++ b/data/report.docx
@@ -13,8 +13,8 @@
         <w:wordWrap/>
         <w:overflowPunct/>
         <w:topLinePunct w:val="0"/>
-        <w:autoSpaceDE/>
-        <w:autoSpaceDN/>
+        <w:autoSpaceDE w:val="0"/>
+        <w:autoSpaceDN w:val="0"/>
         <w:bidi w:val="0"/>
         <w:adjustRightInd/>
         <w:snapToGrid/>
@@ -60,8 +60,8 @@
         <w:wordWrap/>
         <w:overflowPunct/>
         <w:topLinePunct w:val="0"/>
-        <w:autoSpaceDE/>
-        <w:autoSpaceDN/>
+        <w:autoSpaceDE w:val="0"/>
+        <w:autoSpaceDN w:val="0"/>
         <w:bidi w:val="0"/>
         <w:adjustRightInd/>
         <w:snapToGrid/>
@@ -101,8 +101,8 @@
         <w:wordWrap/>
         <w:overflowPunct/>
         <w:topLinePunct w:val="0"/>
-        <w:autoSpaceDE/>
-        <w:autoSpaceDN/>
+        <w:autoSpaceDE w:val="0"/>
+        <w:autoSpaceDN w:val="0"/>
         <w:bidi w:val="0"/>
         <w:adjustRightInd/>
         <w:snapToGrid/>
@@ -146,8 +146,8 @@
         <w:wordWrap/>
         <w:overflowPunct/>
         <w:topLinePunct w:val="0"/>
-        <w:autoSpaceDE/>
-        <w:autoSpaceDN/>
+        <w:autoSpaceDE w:val="0"/>
+        <w:autoSpaceDN w:val="0"/>
         <w:bidi w:val="0"/>
         <w:adjustRightInd/>
         <w:snapToGrid/>
@@ -187,8 +187,8 @@
         <w:wordWrap/>
         <w:overflowPunct/>
         <w:topLinePunct w:val="0"/>
-        <w:autoSpaceDE/>
-        <w:autoSpaceDN/>
+        <w:autoSpaceDE w:val="0"/>
+        <w:autoSpaceDN w:val="0"/>
         <w:bidi w:val="0"/>
         <w:adjustRightInd/>
         <w:snapToGrid/>
@@ -228,8 +228,8 @@
         <w:wordWrap/>
         <w:overflowPunct/>
         <w:topLinePunct w:val="0"/>
-        <w:autoSpaceDE/>
-        <w:autoSpaceDN/>
+        <w:autoSpaceDE w:val="0"/>
+        <w:autoSpaceDN w:val="0"/>
         <w:bidi w:val="0"/>
         <w:adjustRightInd/>
         <w:snapToGrid/>
@@ -269,8 +269,8 @@
         <w:wordWrap/>
         <w:overflowPunct/>
         <w:topLinePunct w:val="0"/>
-        <w:autoSpaceDE/>
-        <w:autoSpaceDN/>
+        <w:autoSpaceDE w:val="0"/>
+        <w:autoSpaceDN w:val="0"/>
         <w:bidi w:val="0"/>
         <w:adjustRightInd/>
         <w:snapToGrid/>
@@ -314,8 +314,8 @@
         <w:wordWrap/>
         <w:overflowPunct/>
         <w:topLinePunct w:val="0"/>
-        <w:autoSpaceDE/>
-        <w:autoSpaceDN/>
+        <w:autoSpaceDE w:val="0"/>
+        <w:autoSpaceDN w:val="0"/>
         <w:bidi w:val="0"/>
         <w:adjustRightInd/>
         <w:snapToGrid/>
@@ -355,8 +355,8 @@
         <w:wordWrap/>
         <w:overflowPunct/>
         <w:topLinePunct w:val="0"/>
-        <w:autoSpaceDE/>
-        <w:autoSpaceDN/>
+        <w:autoSpaceDE w:val="0"/>
+        <w:autoSpaceDN w:val="0"/>
         <w:bidi w:val="0"/>
         <w:adjustRightInd/>
         <w:snapToGrid/>
@@ -400,8 +400,8 @@
         <w:wordWrap/>
         <w:overflowPunct/>
         <w:topLinePunct w:val="0"/>
-        <w:autoSpaceDE/>
-        <w:autoSpaceDN/>
+        <w:autoSpaceDE w:val="0"/>
+        <w:autoSpaceDN w:val="0"/>
         <w:bidi w:val="0"/>
         <w:adjustRightInd/>
         <w:snapToGrid/>
@@ -441,8 +441,8 @@
         <w:wordWrap/>
         <w:overflowPunct/>
         <w:topLinePunct w:val="0"/>
-        <w:autoSpaceDE/>
-        <w:autoSpaceDN/>
+        <w:autoSpaceDE w:val="0"/>
+        <w:autoSpaceDN w:val="0"/>
         <w:bidi w:val="0"/>
         <w:adjustRightInd/>
         <w:snapToGrid/>
@@ -482,8 +482,8 @@
         <w:wordWrap/>
         <w:overflowPunct/>
         <w:topLinePunct w:val="0"/>
-        <w:autoSpaceDE/>
-        <w:autoSpaceDN/>
+        <w:autoSpaceDE w:val="0"/>
+        <w:autoSpaceDN w:val="0"/>
         <w:bidi w:val="0"/>
         <w:adjustRightInd/>
         <w:snapToGrid/>
@@ -527,8 +527,8 @@
         <w:wordWrap/>
         <w:overflowPunct/>
         <w:topLinePunct w:val="0"/>
-        <w:autoSpaceDE/>
-        <w:autoSpaceDN/>
+        <w:autoSpaceDE w:val="0"/>
+        <w:autoSpaceDN w:val="0"/>
         <w:bidi w:val="0"/>
         <w:adjustRightInd/>
         <w:snapToGrid/>
@@ -568,8 +568,8 @@
         <w:wordWrap/>
         <w:overflowPunct/>
         <w:topLinePunct w:val="0"/>
-        <w:autoSpaceDE/>
-        <w:autoSpaceDN/>
+        <w:autoSpaceDE w:val="0"/>
+        <w:autoSpaceDN w:val="0"/>
         <w:bidi w:val="0"/>
         <w:adjustRightInd/>
         <w:snapToGrid/>
@@ -650,8 +650,8 @@
         <w:wordWrap/>
         <w:overflowPunct/>
         <w:topLinePunct w:val="0"/>
-        <w:autoSpaceDE/>
-        <w:autoSpaceDN/>
+        <w:autoSpaceDE w:val="0"/>
+        <w:autoSpaceDN w:val="0"/>
         <w:bidi w:val="0"/>
         <w:adjustRightInd/>
         <w:snapToGrid/>
@@ -677,7 +677,7 @@
           <w:szCs w:val="32"/>
           <w:lang w:val="en-US" w:eastAsia="zh-CN" w:bidi="ar"/>
         </w:rPr>
-        <w:t>图1  学生就餐流程与时间记录环节</w:t>
+        <w:t>图1学生就餐流程与时间记录环节</w:t>
       </w:r>
     </w:p>
     <w:p>
@@ -691,8 +691,8 @@
         <w:wordWrap/>
         <w:overflowPunct/>
         <w:topLinePunct w:val="0"/>
-        <w:autoSpaceDE/>
-        <w:autoSpaceDN/>
+        <w:autoSpaceDE w:val="0"/>
+        <w:autoSpaceDN w:val="0"/>
         <w:bidi w:val="0"/>
         <w:adjustRightInd/>
         <w:snapToGrid/>
@@ -736,8 +736,8 @@
         <w:wordWrap/>
         <w:overflowPunct/>
         <w:topLinePunct w:val="0"/>
-        <w:autoSpaceDE/>
-        <w:autoSpaceDN/>
+        <w:autoSpaceDE w:val="0"/>
+        <w:autoSpaceDN w:val="0"/>
         <w:bidi w:val="0"/>
         <w:adjustRightInd/>
         <w:snapToGrid/>
@@ -781,8 +781,8 @@
         <w:wordWrap/>
         <w:overflowPunct/>
         <w:topLinePunct w:val="0"/>
-        <w:autoSpaceDE/>
-        <w:autoSpaceDN/>
+        <w:autoSpaceDE w:val="0"/>
+        <w:autoSpaceDN w:val="0"/>
         <w:bidi w:val="0"/>
         <w:adjustRightInd/>
         <w:snapToGrid/>
@@ -826,8 +826,8 @@
         <w:wordWrap/>
         <w:overflowPunct/>
         <w:topLinePunct w:val="0"/>
-        <w:autoSpaceDE/>
-        <w:autoSpaceDN/>
+        <w:autoSpaceDE w:val="0"/>
+        <w:autoSpaceDN w:val="0"/>
         <w:bidi w:val="0"/>
         <w:adjustRightInd/>
         <w:snapToGrid/>
@@ -853,7 +853,7 @@
           <w:szCs w:val="32"/>
           <w:lang w:val="en-US" w:eastAsia="zh-CN" w:bidi="ar"/>
         </w:rPr>
-        <w:t>表1  三种方案共同采用的参数</w:t>
+        <w:t>表1三种方案共同采用的参数</w:t>
       </w:r>
     </w:p>
     <w:tbl>
@@ -895,9 +895,11 @@
           </w:tcPr>
           <w:p>
             <w:pPr>
-              <w:keepNext/>
-              <w:spacing w:line="360" w:lineRule="exact" w:after="40"/>
-              <w:ind w:firstLine="0" w:firstLineChars="0" w:left="0" w:right="0" w:leftChars="0" w:rightChars="0" w:start="0" w:end="0"/>
+              <w:spacing w:line="360" w:lineRule="exact" w:after="40"/>
+              <w:ind w:firstLine="0" w:firstLineChars="0" w:left="0" w:right="0" w:leftChars="0" w:rightChars="0" w:start="0" w:end="0"/>
+              <w:autoSpaceDN w:val="0"/>
+              <w:keepNext/>
+              <w:autoSpaceDE w:val="0"/>
               <w:jc w:val="left"/>
             </w:pPr>
             <w:r>
@@ -925,9 +927,11 @@
           </w:tcPr>
           <w:p>
             <w:pPr>
-              <w:keepNext/>
-              <w:spacing w:line="360" w:lineRule="exact" w:after="40"/>
-              <w:ind w:firstLine="0" w:firstLineChars="0" w:left="0" w:right="0" w:leftChars="0" w:rightChars="0" w:start="0" w:end="0"/>
+              <w:spacing w:line="360" w:lineRule="exact" w:after="40"/>
+              <w:ind w:firstLine="0" w:firstLineChars="0" w:left="0" w:right="0" w:leftChars="0" w:rightChars="0" w:start="0" w:end="0"/>
+              <w:autoSpaceDN w:val="0"/>
+              <w:keepNext/>
+              <w:autoSpaceDE w:val="0"/>
               <w:jc w:val="center"/>
             </w:pPr>
             <w:r>
@@ -959,9 +963,11 @@
           </w:tcPr>
           <w:p>
             <w:pPr>
-              <w:keepNext/>
-              <w:spacing w:line="360" w:lineRule="exact" w:after="40"/>
-              <w:ind w:firstLine="0" w:firstLineChars="0" w:left="0" w:right="0" w:leftChars="0" w:rightChars="0" w:start="0" w:end="0"/>
+              <w:spacing w:line="360" w:lineRule="exact" w:after="40"/>
+              <w:ind w:firstLine="0" w:firstLineChars="0" w:left="0" w:right="0" w:leftChars="0" w:rightChars="0" w:start="0" w:end="0"/>
+              <w:autoSpaceDN w:val="0"/>
+              <w:keepNext/>
+              <w:autoSpaceDE w:val="0"/>
               <w:jc w:val="left"/>
             </w:pPr>
             <w:r>
@@ -987,9 +993,11 @@
           </w:tcPr>
           <w:p>
             <w:pPr>
-              <w:keepNext/>
-              <w:spacing w:line="360" w:lineRule="exact" w:after="40"/>
-              <w:ind w:firstLine="0" w:firstLineChars="0" w:left="0" w:right="0" w:leftChars="0" w:rightChars="0" w:start="0" w:end="0"/>
+              <w:spacing w:line="360" w:lineRule="exact" w:after="40"/>
+              <w:ind w:firstLine="0" w:firstLineChars="0" w:left="0" w:right="0" w:leftChars="0" w:rightChars="0" w:start="0" w:end="0"/>
+              <w:autoSpaceDN w:val="0"/>
+              <w:keepNext/>
+              <w:autoSpaceDE w:val="0"/>
               <w:jc w:val="center"/>
             </w:pPr>
             <w:r>
@@ -1020,9 +1028,11 @@
           </w:tcPr>
           <w:p>
             <w:pPr>
-              <w:keepNext/>
-              <w:spacing w:line="360" w:lineRule="exact" w:after="40"/>
-              <w:ind w:firstLine="0" w:firstLineChars="0" w:left="0" w:right="0" w:leftChars="0" w:rightChars="0" w:start="0" w:end="0"/>
+              <w:spacing w:line="360" w:lineRule="exact" w:after="40"/>
+              <w:ind w:firstLine="0" w:firstLineChars="0" w:left="0" w:right="0" w:leftChars="0" w:rightChars="0" w:start="0" w:end="0"/>
+              <w:autoSpaceDN w:val="0"/>
+              <w:keepNext/>
+              <w:autoSpaceDE w:val="0"/>
               <w:jc w:val="left"/>
             </w:pPr>
             <w:r>
@@ -1048,9 +1058,11 @@
           </w:tcPr>
           <w:p>
             <w:pPr>
-              <w:keepNext/>
-              <w:spacing w:line="360" w:lineRule="exact" w:after="40"/>
-              <w:ind w:firstLine="0" w:firstLineChars="0" w:left="0" w:right="0" w:leftChars="0" w:rightChars="0" w:start="0" w:end="0"/>
+              <w:spacing w:line="360" w:lineRule="exact" w:after="40"/>
+              <w:ind w:firstLine="0" w:firstLineChars="0" w:left="0" w:right="0" w:leftChars="0" w:rightChars="0" w:start="0" w:end="0"/>
+              <w:autoSpaceDN w:val="0"/>
+              <w:keepNext/>
+              <w:autoSpaceDE w:val="0"/>
               <w:jc w:val="center"/>
             </w:pPr>
             <w:r>
@@ -1081,9 +1093,11 @@
           </w:tcPr>
           <w:p>
             <w:pPr>
-              <w:keepNext/>
-              <w:spacing w:line="360" w:lineRule="exact" w:after="40"/>
-              <w:ind w:firstLine="0" w:firstLineChars="0" w:left="0" w:right="0" w:leftChars="0" w:rightChars="0" w:start="0" w:end="0"/>
+              <w:spacing w:line="360" w:lineRule="exact" w:after="40"/>
+              <w:ind w:firstLine="0" w:firstLineChars="0" w:left="0" w:right="0" w:leftChars="0" w:rightChars="0" w:start="0" w:end="0"/>
+              <w:autoSpaceDN w:val="0"/>
+              <w:keepNext/>
+              <w:autoSpaceDE w:val="0"/>
               <w:jc w:val="left"/>
             </w:pPr>
             <w:r>
@@ -1109,9 +1123,11 @@
           </w:tcPr>
           <w:p>
             <w:pPr>
-              <w:keepNext/>
-              <w:spacing w:line="360" w:lineRule="exact" w:after="40"/>
-              <w:ind w:firstLine="0" w:firstLineChars="0" w:left="0" w:right="0" w:leftChars="0" w:rightChars="0" w:start="0" w:end="0"/>
+              <w:spacing w:line="360" w:lineRule="exact" w:after="40"/>
+              <w:ind w:firstLine="0" w:firstLineChars="0" w:left="0" w:right="0" w:leftChars="0" w:rightChars="0" w:start="0" w:end="0"/>
+              <w:autoSpaceDN w:val="0"/>
+              <w:keepNext/>
+              <w:autoSpaceDE w:val="0"/>
               <w:jc w:val="center"/>
             </w:pPr>
             <w:r>
@@ -1142,9 +1158,11 @@
           </w:tcPr>
           <w:p>
             <w:pPr>
-              <w:keepNext/>
-              <w:spacing w:line="360" w:lineRule="exact" w:after="40"/>
-              <w:ind w:firstLine="0" w:firstLineChars="0" w:left="0" w:right="0" w:leftChars="0" w:rightChars="0" w:start="0" w:end="0"/>
+              <w:spacing w:line="360" w:lineRule="exact" w:after="40"/>
+              <w:ind w:firstLine="0" w:firstLineChars="0" w:left="0" w:right="0" w:leftChars="0" w:rightChars="0" w:start="0" w:end="0"/>
+              <w:autoSpaceDN w:val="0"/>
+              <w:keepNext/>
+              <w:autoSpaceDE w:val="0"/>
               <w:jc w:val="left"/>
             </w:pPr>
             <w:r>
@@ -1170,9 +1188,11 @@
           </w:tcPr>
           <w:p>
             <w:pPr>
-              <w:keepNext/>
-              <w:spacing w:line="360" w:lineRule="exact" w:after="40"/>
-              <w:ind w:firstLine="0" w:firstLineChars="0" w:left="0" w:right="0" w:leftChars="0" w:rightChars="0" w:start="0" w:end="0"/>
+              <w:spacing w:line="360" w:lineRule="exact" w:after="40"/>
+              <w:ind w:firstLine="0" w:firstLineChars="0" w:left="0" w:right="0" w:leftChars="0" w:rightChars="0" w:start="0" w:end="0"/>
+              <w:autoSpaceDN w:val="0"/>
+              <w:keepNext/>
+              <w:autoSpaceDE w:val="0"/>
               <w:jc w:val="center"/>
             </w:pPr>
             <w:r>
@@ -1203,9 +1223,11 @@
           </w:tcPr>
           <w:p>
             <w:pPr>
-              <w:keepNext/>
-              <w:spacing w:line="360" w:lineRule="exact" w:after="40"/>
-              <w:ind w:firstLine="0" w:firstLineChars="0" w:left="0" w:right="0" w:leftChars="0" w:rightChars="0" w:start="0" w:end="0"/>
+              <w:spacing w:line="360" w:lineRule="exact" w:after="40"/>
+              <w:ind w:firstLine="0" w:firstLineChars="0" w:left="0" w:right="0" w:leftChars="0" w:rightChars="0" w:start="0" w:end="0"/>
+              <w:autoSpaceDN w:val="0"/>
+              <w:keepNext/>
+              <w:autoSpaceDE w:val="0"/>
               <w:jc w:val="left"/>
             </w:pPr>
             <w:r>
@@ -1231,9 +1253,11 @@
           </w:tcPr>
           <w:p>
             <w:pPr>
-              <w:keepNext/>
-              <w:spacing w:line="360" w:lineRule="exact" w:after="40"/>
-              <w:ind w:firstLine="0" w:firstLineChars="0" w:left="0" w:right="0" w:leftChars="0" w:rightChars="0" w:start="0" w:end="0"/>
+              <w:spacing w:line="360" w:lineRule="exact" w:after="40"/>
+              <w:ind w:firstLine="0" w:firstLineChars="0" w:left="0" w:right="0" w:leftChars="0" w:rightChars="0" w:start="0" w:end="0"/>
+              <w:autoSpaceDN w:val="0"/>
+              <w:keepNext/>
+              <w:autoSpaceDE w:val="0"/>
               <w:jc w:val="center"/>
             </w:pPr>
             <w:r>
@@ -1264,9 +1288,11 @@
           </w:tcPr>
           <w:p>
             <w:pPr>
-              <w:keepNext/>
-              <w:spacing w:line="360" w:lineRule="exact" w:after="40"/>
-              <w:ind w:firstLine="0" w:firstLineChars="0" w:left="0" w:right="0" w:leftChars="0" w:rightChars="0" w:start="0" w:end="0"/>
+              <w:spacing w:line="360" w:lineRule="exact" w:after="40"/>
+              <w:ind w:firstLine="0" w:firstLineChars="0" w:left="0" w:right="0" w:leftChars="0" w:rightChars="0" w:start="0" w:end="0"/>
+              <w:autoSpaceDN w:val="0"/>
+              <w:keepNext/>
+              <w:autoSpaceDE w:val="0"/>
               <w:jc w:val="left"/>
             </w:pPr>
             <w:r>
@@ -1292,9 +1318,11 @@
           </w:tcPr>
           <w:p>
             <w:pPr>
-              <w:keepNext/>
-              <w:spacing w:line="360" w:lineRule="exact" w:after="40"/>
-              <w:ind w:firstLine="0" w:firstLineChars="0" w:left="0" w:right="0" w:leftChars="0" w:rightChars="0" w:start="0" w:end="0"/>
+              <w:spacing w:line="360" w:lineRule="exact" w:after="40"/>
+              <w:ind w:firstLine="0" w:firstLineChars="0" w:left="0" w:right="0" w:leftChars="0" w:rightChars="0" w:start="0" w:end="0"/>
+              <w:autoSpaceDN w:val="0"/>
+              <w:keepNext/>
+              <w:autoSpaceDE w:val="0"/>
               <w:jc w:val="center"/>
             </w:pPr>
             <w:r>
@@ -1325,9 +1353,11 @@
           </w:tcPr>
           <w:p>
             <w:pPr>
+              <w:spacing w:line="360" w:lineRule="exact" w:after="40"/>
+              <w:ind w:firstLine="0" w:firstLineChars="0" w:left="0" w:right="0" w:leftChars="0" w:rightChars="0" w:start="0" w:end="0"/>
+              <w:autoSpaceDN w:val="0"/>
               <w:keepNext w:val="0"/>
-              <w:spacing w:line="360" w:lineRule="exact" w:after="40"/>
-              <w:ind w:firstLine="0" w:firstLineChars="0" w:left="0" w:right="0" w:leftChars="0" w:rightChars="0" w:start="0" w:end="0"/>
+              <w:autoSpaceDE w:val="0"/>
               <w:jc w:val="left"/>
             </w:pPr>
             <w:r>
@@ -1355,9 +1385,11 @@
           </w:tcPr>
           <w:p>
             <w:pPr>
+              <w:spacing w:line="360" w:lineRule="exact" w:after="40"/>
+              <w:ind w:firstLine="0" w:firstLineChars="0" w:left="0" w:right="0" w:leftChars="0" w:rightChars="0" w:start="0" w:end="0"/>
+              <w:autoSpaceDN w:val="0"/>
               <w:keepNext w:val="0"/>
-              <w:spacing w:line="360" w:lineRule="exact" w:after="40"/>
-              <w:ind w:firstLine="0" w:firstLineChars="0" w:left="0" w:right="0" w:leftChars="0" w:rightChars="0" w:start="0" w:end="0"/>
+              <w:autoSpaceDE w:val="0"/>
               <w:jc w:val="center"/>
             </w:pPr>
             <w:r>
@@ -1383,8 +1415,8 @@
         <w:wordWrap/>
         <w:overflowPunct/>
         <w:topLinePunct w:val="0"/>
-        <w:autoSpaceDE/>
-        <w:autoSpaceDN/>
+        <w:autoSpaceDE w:val="0"/>
+        <w:autoSpaceDN w:val="0"/>
         <w:bidi w:val="0"/>
         <w:adjustRightInd/>
         <w:snapToGrid/>
@@ -1423,8 +1455,8 @@
         <w:wordWrap/>
         <w:overflowPunct/>
         <w:topLinePunct w:val="0"/>
-        <w:autoSpaceDE/>
-        <w:autoSpaceDN/>
+        <w:autoSpaceDE w:val="0"/>
+        <w:autoSpaceDN w:val="0"/>
         <w:bidi w:val="0"/>
         <w:adjustRightInd/>
         <w:snapToGrid/>
@@ -1468,8 +1500,8 @@
         <w:wordWrap/>
         <w:overflowPunct/>
         <w:topLinePunct w:val="0"/>
-        <w:autoSpaceDE/>
-        <w:autoSpaceDN/>
+        <w:autoSpaceDE w:val="0"/>
+        <w:autoSpaceDN w:val="0"/>
         <w:bidi w:val="0"/>
         <w:adjustRightInd/>
         <w:snapToGrid/>
@@ -1513,8 +1545,8 @@
         <w:wordWrap/>
         <w:overflowPunct/>
         <w:topLinePunct w:val="0"/>
-        <w:autoSpaceDE/>
-        <w:autoSpaceDN/>
+        <w:autoSpaceDE w:val="0"/>
+        <w:autoSpaceDN w:val="0"/>
         <w:bidi w:val="0"/>
         <w:adjustRightInd/>
         <w:snapToGrid/>
@@ -1595,8 +1627,8 @@
         <w:wordWrap/>
         <w:overflowPunct/>
         <w:topLinePunct w:val="0"/>
-        <w:autoSpaceDE/>
-        <w:autoSpaceDN/>
+        <w:autoSpaceDE w:val="0"/>
+        <w:autoSpaceDN w:val="0"/>
         <w:bidi w:val="0"/>
         <w:adjustRightInd/>
         <w:snapToGrid/>
@@ -1622,7 +1654,7 @@
           <w:szCs w:val="32"/>
           <w:lang w:val="en-US" w:eastAsia="zh-CN" w:bidi="ar"/>
         </w:rPr>
-        <w:t>图2  软件方案选择与参数设置页面</w:t>
+        <w:t>图2软件方案选择与参数设置页面</w:t>
       </w:r>
     </w:p>
     <w:p>
@@ -1636,8 +1668,8 @@
         <w:wordWrap/>
         <w:overflowPunct/>
         <w:topLinePunct w:val="0"/>
-        <w:autoSpaceDE/>
-        <w:autoSpaceDN/>
+        <w:autoSpaceDE w:val="0"/>
+        <w:autoSpaceDN w:val="0"/>
         <w:bidi w:val="0"/>
         <w:adjustRightInd/>
         <w:snapToGrid/>
@@ -1718,8 +1750,8 @@
         <w:wordWrap/>
         <w:overflowPunct/>
         <w:topLinePunct w:val="0"/>
-        <w:autoSpaceDE/>
-        <w:autoSpaceDN/>
+        <w:autoSpaceDE w:val="0"/>
+        <w:autoSpaceDN w:val="0"/>
         <w:bidi w:val="0"/>
         <w:adjustRightInd/>
         <w:snapToGrid/>
@@ -1745,7 +1777,7 @@
           <w:szCs w:val="32"/>
           <w:lang w:val="en-US" w:eastAsia="zh-CN" w:bidi="ar"/>
         </w:rPr>
-        <w:t>图3  软件三维就餐回放场景</w:t>
+        <w:t>图3软件三维就餐回放场景</w:t>
       </w:r>
     </w:p>
     <w:p>
@@ -1759,8 +1791,8 @@
         <w:wordWrap/>
         <w:overflowPunct/>
         <w:topLinePunct w:val="0"/>
-        <w:autoSpaceDE/>
-        <w:autoSpaceDN/>
+        <w:autoSpaceDE w:val="0"/>
+        <w:autoSpaceDN w:val="0"/>
         <w:bidi w:val="0"/>
         <w:adjustRightInd/>
         <w:snapToGrid/>
@@ -1800,8 +1832,8 @@
         <w:wordWrap/>
         <w:overflowPunct/>
         <w:topLinePunct w:val="0"/>
-        <w:autoSpaceDE/>
-        <w:autoSpaceDN/>
+        <w:autoSpaceDE w:val="0"/>
+        <w:autoSpaceDN w:val="0"/>
         <w:bidi w:val="0"/>
         <w:adjustRightInd/>
         <w:snapToGrid/>
@@ -1841,8 +1873,8 @@
         <w:wordWrap/>
         <w:overflowPunct/>
         <w:topLinePunct w:val="0"/>
-        <w:autoSpaceDE/>
-        <w:autoSpaceDN/>
+        <w:autoSpaceDE w:val="0"/>
+        <w:autoSpaceDN w:val="0"/>
         <w:bidi w:val="0"/>
         <w:adjustRightInd/>
         <w:snapToGrid/>
@@ -1882,8 +1914,8 @@
         <w:wordWrap/>
         <w:overflowPunct/>
         <w:topLinePunct w:val="0"/>
-        <w:autoSpaceDE/>
-        <w:autoSpaceDN/>
+        <w:autoSpaceDE w:val="0"/>
+        <w:autoSpaceDN w:val="0"/>
         <w:bidi w:val="0"/>
         <w:adjustRightInd/>
         <w:snapToGrid/>
@@ -1923,8 +1955,8 @@
         <w:wordWrap/>
         <w:overflowPunct/>
         <w:topLinePunct w:val="0"/>
-        <w:autoSpaceDE/>
-        <w:autoSpaceDN/>
+        <w:autoSpaceDE w:val="0"/>
+        <w:autoSpaceDN w:val="0"/>
         <w:bidi w:val="0"/>
         <w:adjustRightInd/>
         <w:snapToGrid/>
@@ -1964,8 +1996,8 @@
         <w:wordWrap/>
         <w:overflowPunct/>
         <w:topLinePunct w:val="0"/>
-        <w:autoSpaceDE/>
-        <w:autoSpaceDN/>
+        <w:autoSpaceDE w:val="0"/>
+        <w:autoSpaceDN w:val="0"/>
         <w:bidi w:val="0"/>
         <w:adjustRightInd/>
         <w:snapToGrid/>
@@ -2005,8 +2037,8 @@
         <w:wordWrap/>
         <w:overflowPunct/>
         <w:topLinePunct w:val="0"/>
-        <w:autoSpaceDE/>
-        <w:autoSpaceDN/>
+        <w:autoSpaceDE w:val="0"/>
+        <w:autoSpaceDN w:val="0"/>
         <w:bidi w:val="0"/>
         <w:adjustRightInd/>
         <w:snapToGrid/>
@@ -2046,8 +2078,8 @@
         <w:wordWrap/>
         <w:overflowPunct/>
         <w:topLinePunct w:val="0"/>
-        <w:autoSpaceDE/>
-        <w:autoSpaceDN/>
+        <w:autoSpaceDE w:val="0"/>
+        <w:autoSpaceDN w:val="0"/>
         <w:bidi w:val="0"/>
         <w:adjustRightInd/>
         <w:snapToGrid/>
@@ -2091,8 +2123,8 @@
         <w:wordWrap/>
         <w:overflowPunct/>
         <w:topLinePunct w:val="0"/>
-        <w:autoSpaceDE/>
-        <w:autoSpaceDN/>
+        <w:autoSpaceDE w:val="0"/>
+        <w:autoSpaceDN w:val="0"/>
         <w:bidi w:val="0"/>
         <w:adjustRightInd/>
         <w:snapToGrid/>
@@ -2136,8 +2168,8 @@
         <w:wordWrap/>
         <w:overflowPunct/>
         <w:topLinePunct w:val="0"/>
-        <w:autoSpaceDE/>
-        <w:autoSpaceDN/>
+        <w:autoSpaceDE w:val="0"/>
+        <w:autoSpaceDN w:val="0"/>
         <w:bidi w:val="0"/>
         <w:adjustRightInd/>
         <w:snapToGrid/>
@@ -2177,8 +2209,8 @@
         <w:wordWrap/>
         <w:overflowPunct/>
         <w:topLinePunct w:val="0"/>
-        <w:autoSpaceDE/>
-        <w:autoSpaceDN/>
+        <w:autoSpaceDE w:val="0"/>
+        <w:autoSpaceDN w:val="0"/>
         <w:bidi w:val="0"/>
         <w:adjustRightInd/>
         <w:snapToGrid/>
@@ -2218,8 +2250,8 @@
         <w:wordWrap/>
         <w:overflowPunct/>
         <w:topLinePunct w:val="0"/>
-        <w:autoSpaceDE/>
-        <w:autoSpaceDN/>
+        <w:autoSpaceDE w:val="0"/>
+        <w:autoSpaceDN w:val="0"/>
         <w:bidi w:val="0"/>
         <w:adjustRightInd/>
         <w:snapToGrid/>
@@ -2259,8 +2291,8 @@
         <w:wordWrap/>
         <w:overflowPunct/>
         <w:topLinePunct w:val="0"/>
-        <w:autoSpaceDE/>
-        <w:autoSpaceDN/>
+        <w:autoSpaceDE w:val="0"/>
+        <w:autoSpaceDN w:val="0"/>
         <w:bidi w:val="0"/>
         <w:adjustRightInd/>
         <w:snapToGrid/>
@@ -2300,8 +2332,8 @@
         <w:wordWrap/>
         <w:overflowPunct/>
         <w:topLinePunct w:val="0"/>
-        <w:autoSpaceDE/>
-        <w:autoSpaceDN/>
+        <w:autoSpaceDE w:val="0"/>
+        <w:autoSpaceDN w:val="0"/>
         <w:bidi w:val="0"/>
         <w:adjustRightInd/>
         <w:snapToGrid/>
@@ -2382,8 +2414,8 @@
         <w:wordWrap/>
         <w:overflowPunct/>
         <w:topLinePunct w:val="0"/>
-        <w:autoSpaceDE/>
-        <w:autoSpaceDN/>
+        <w:autoSpaceDE w:val="0"/>
+        <w:autoSpaceDN w:val="0"/>
         <w:bidi w:val="0"/>
         <w:adjustRightInd/>
         <w:snapToGrid/>
@@ -2409,7 +2441,7 @@
           <w:szCs w:val="32"/>
           <w:lang w:val="en-US" w:eastAsia="zh-CN" w:bidi="ar"/>
         </w:rPr>
-        <w:t>图4  窗口预计取餐耗时比较</w:t>
+        <w:t>图4窗口预计取餐耗时比较</w:t>
       </w:r>
     </w:p>
     <w:p>
@@ -2423,8 +2455,8 @@
         <w:wordWrap/>
         <w:overflowPunct/>
         <w:topLinePunct w:val="0"/>
-        <w:autoSpaceDE/>
-        <w:autoSpaceDN/>
+        <w:autoSpaceDE w:val="0"/>
+        <w:autoSpaceDN w:val="0"/>
         <w:bidi w:val="0"/>
         <w:adjustRightInd/>
         <w:snapToGrid/>
@@ -2464,8 +2496,8 @@
         <w:wordWrap/>
         <w:overflowPunct/>
         <w:topLinePunct w:val="0"/>
-        <w:autoSpaceDE/>
-        <w:autoSpaceDN/>
+        <w:autoSpaceDE w:val="0"/>
+        <w:autoSpaceDN w:val="0"/>
         <w:bidi w:val="0"/>
         <w:adjustRightInd/>
         <w:snapToGrid/>
@@ -2509,8 +2541,8 @@
         <w:wordWrap/>
         <w:overflowPunct/>
         <w:topLinePunct w:val="0"/>
-        <w:autoSpaceDE/>
-        <w:autoSpaceDN/>
+        <w:autoSpaceDE w:val="0"/>
+        <w:autoSpaceDN w:val="0"/>
         <w:bidi w:val="0"/>
         <w:adjustRightInd/>
         <w:snapToGrid/>
@@ -2554,8 +2586,8 @@
         <w:wordWrap/>
         <w:overflowPunct/>
         <w:topLinePunct w:val="0"/>
-        <w:autoSpaceDE/>
-        <w:autoSpaceDN/>
+        <w:autoSpaceDE w:val="0"/>
+        <w:autoSpaceDN w:val="0"/>
         <w:bidi w:val="0"/>
         <w:adjustRightInd/>
         <w:snapToGrid/>
@@ -2581,7 +2613,7 @@
           <w:szCs w:val="32"/>
           <w:lang w:val="en-US" w:eastAsia="zh-CN" w:bidi="ar"/>
         </w:rPr>
-        <w:t>表2  三种方案的初始出发规则</w:t>
+        <w:t>表2三种方案的初始出发规则</w:t>
       </w:r>
     </w:p>
     <w:tbl>
@@ -2623,9 +2655,11 @@
           </w:tcPr>
           <w:p>
             <w:pPr>
-              <w:keepNext/>
-              <w:spacing w:line="360" w:lineRule="exact" w:after="40"/>
-              <w:ind w:firstLine="0" w:firstLineChars="0" w:left="0" w:right="0" w:leftChars="0" w:rightChars="0" w:start="0" w:end="0"/>
+              <w:spacing w:line="360" w:lineRule="exact" w:after="40"/>
+              <w:ind w:firstLine="0" w:firstLineChars="0" w:left="0" w:right="0" w:leftChars="0" w:rightChars="0" w:start="0" w:end="0"/>
+              <w:autoSpaceDN w:val="0"/>
+              <w:keepNext/>
+              <w:autoSpaceDE w:val="0"/>
               <w:jc w:val="left"/>
             </w:pPr>
             <w:r>
@@ -2653,9 +2687,11 @@
           </w:tcPr>
           <w:p>
             <w:pPr>
-              <w:keepNext/>
-              <w:spacing w:line="360" w:lineRule="exact" w:after="40"/>
-              <w:ind w:firstLine="0" w:firstLineChars="0" w:left="0" w:right="0" w:leftChars="0" w:rightChars="0" w:start="0" w:end="0"/>
+              <w:spacing w:line="360" w:lineRule="exact" w:after="40"/>
+              <w:ind w:firstLine="0" w:firstLineChars="0" w:left="0" w:right="0" w:leftChars="0" w:rightChars="0" w:start="0" w:end="0"/>
+              <w:autoSpaceDN w:val="0"/>
+              <w:keepNext/>
+              <w:autoSpaceDE w:val="0"/>
               <w:jc w:val="center"/>
             </w:pPr>
             <w:r>
@@ -2687,9 +2723,11 @@
           </w:tcPr>
           <w:p>
             <w:pPr>
-              <w:keepNext/>
-              <w:spacing w:line="360" w:lineRule="exact" w:after="40"/>
-              <w:ind w:firstLine="0" w:firstLineChars="0" w:left="0" w:right="0" w:leftChars="0" w:rightChars="0" w:start="0" w:end="0"/>
+              <w:spacing w:line="360" w:lineRule="exact" w:after="40"/>
+              <w:ind w:firstLine="0" w:firstLineChars="0" w:left="0" w:right="0" w:leftChars="0" w:rightChars="0" w:start="0" w:end="0"/>
+              <w:autoSpaceDN w:val="0"/>
+              <w:keepNext/>
+              <w:autoSpaceDE w:val="0"/>
               <w:jc w:val="left"/>
             </w:pPr>
             <w:r>
@@ -2715,9 +2753,11 @@
           </w:tcPr>
           <w:p>
             <w:pPr>
-              <w:keepNext/>
-              <w:spacing w:line="360" w:lineRule="exact" w:after="40"/>
-              <w:ind w:firstLine="0" w:firstLineChars="0" w:left="0" w:right="0" w:leftChars="0" w:rightChars="0" w:start="0" w:end="0"/>
+              <w:spacing w:line="360" w:lineRule="exact" w:after="40"/>
+              <w:ind w:firstLine="0" w:firstLineChars="0" w:left="0" w:right="0" w:leftChars="0" w:rightChars="0" w:start="0" w:end="0"/>
+              <w:autoSpaceDN w:val="0"/>
+              <w:keepNext/>
+              <w:autoSpaceDE w:val="0"/>
               <w:jc w:val="center"/>
             </w:pPr>
             <w:r>
@@ -2748,9 +2788,11 @@
           </w:tcPr>
           <w:p>
             <w:pPr>
-              <w:keepNext/>
-              <w:spacing w:line="360" w:lineRule="exact" w:after="40"/>
-              <w:ind w:firstLine="0" w:firstLineChars="0" w:left="0" w:right="0" w:leftChars="0" w:rightChars="0" w:start="0" w:end="0"/>
+              <w:spacing w:line="360" w:lineRule="exact" w:after="40"/>
+              <w:ind w:firstLine="0" w:firstLineChars="0" w:left="0" w:right="0" w:leftChars="0" w:rightChars="0" w:start="0" w:end="0"/>
+              <w:autoSpaceDN w:val="0"/>
+              <w:keepNext/>
+              <w:autoSpaceDE w:val="0"/>
               <w:jc w:val="left"/>
             </w:pPr>
             <w:r>
@@ -2776,9 +2818,11 @@
           </w:tcPr>
           <w:p>
             <w:pPr>
-              <w:keepNext/>
-              <w:spacing w:line="360" w:lineRule="exact" w:after="40"/>
-              <w:ind w:firstLine="0" w:firstLineChars="0" w:left="0" w:right="0" w:leftChars="0" w:rightChars="0" w:start="0" w:end="0"/>
+              <w:spacing w:line="360" w:lineRule="exact" w:after="40"/>
+              <w:ind w:firstLine="0" w:firstLineChars="0" w:left="0" w:right="0" w:leftChars="0" w:rightChars="0" w:start="0" w:end="0"/>
+              <w:autoSpaceDN w:val="0"/>
+              <w:keepNext/>
+              <w:autoSpaceDE w:val="0"/>
               <w:jc w:val="center"/>
             </w:pPr>
             <w:r>
@@ -2809,9 +2853,11 @@
           </w:tcPr>
           <w:p>
             <w:pPr>
+              <w:spacing w:line="360" w:lineRule="exact" w:after="40"/>
+              <w:ind w:firstLine="0" w:firstLineChars="0" w:left="0" w:right="0" w:leftChars="0" w:rightChars="0" w:start="0" w:end="0"/>
+              <w:autoSpaceDN w:val="0"/>
               <w:keepNext w:val="0"/>
-              <w:spacing w:line="360" w:lineRule="exact" w:after="40"/>
-              <w:ind w:firstLine="0" w:firstLineChars="0" w:left="0" w:right="0" w:leftChars="0" w:rightChars="0" w:start="0" w:end="0"/>
+              <w:autoSpaceDE w:val="0"/>
               <w:jc w:val="left"/>
             </w:pPr>
             <w:r>
@@ -2837,9 +2883,11 @@
           </w:tcPr>
           <w:p>
             <w:pPr>
+              <w:spacing w:line="360" w:lineRule="exact" w:after="40"/>
+              <w:ind w:firstLine="0" w:firstLineChars="0" w:left="0" w:right="0" w:leftChars="0" w:rightChars="0" w:start="0" w:end="0"/>
+              <w:autoSpaceDN w:val="0"/>
               <w:keepNext w:val="0"/>
-              <w:spacing w:line="360" w:lineRule="exact" w:after="40"/>
-              <w:ind w:firstLine="0" w:firstLineChars="0" w:left="0" w:right="0" w:leftChars="0" w:rightChars="0" w:start="0" w:end="0"/>
+              <w:autoSpaceDE w:val="0"/>
               <w:jc w:val="center"/>
             </w:pPr>
             <w:r>
@@ -2865,8 +2913,8 @@
         <w:wordWrap/>
         <w:overflowPunct/>
         <w:topLinePunct w:val="0"/>
-        <w:autoSpaceDE/>
-        <w:autoSpaceDN/>
+        <w:autoSpaceDE w:val="0"/>
+        <w:autoSpaceDN w:val="0"/>
         <w:bidi w:val="0"/>
         <w:adjustRightInd/>
         <w:snapToGrid/>
@@ -2905,8 +2953,8 @@
         <w:wordWrap/>
         <w:overflowPunct/>
         <w:topLinePunct w:val="0"/>
-        <w:autoSpaceDE/>
-        <w:autoSpaceDN/>
+        <w:autoSpaceDE w:val="0"/>
+        <w:autoSpaceDN w:val="0"/>
         <w:bidi w:val="0"/>
         <w:adjustRightInd/>
         <w:snapToGrid/>
@@ -2946,8 +2994,8 @@
         <w:wordWrap/>
         <w:overflowPunct/>
         <w:topLinePunct w:val="0"/>
-        <w:autoSpaceDE/>
-        <w:autoSpaceDN/>
+        <w:autoSpaceDE w:val="0"/>
+        <w:autoSpaceDN w:val="0"/>
         <w:bidi w:val="0"/>
         <w:adjustRightInd/>
         <w:snapToGrid/>
@@ -2973,7 +3021,7 @@
           <w:szCs w:val="32"/>
           <w:lang w:val="en-US" w:eastAsia="zh-CN" w:bidi="ar"/>
         </w:rPr>
-        <w:t>表3  三种初始方案各计算30次的平均结果</w:t>
+        <w:t>表3三种初始方案各计算30次的平均结果</w:t>
       </w:r>
     </w:p>
     <w:tbl>
@@ -3017,9 +3065,11 @@
           </w:tcPr>
           <w:p>
             <w:pPr>
-              <w:keepNext/>
-              <w:spacing w:line="360" w:lineRule="exact" w:after="40"/>
-              <w:ind w:firstLine="0" w:firstLineChars="0" w:left="0" w:right="0" w:leftChars="0" w:rightChars="0" w:start="0" w:end="0"/>
+              <w:spacing w:line="360" w:lineRule="exact" w:after="40"/>
+              <w:ind w:firstLine="0" w:firstLineChars="0" w:left="0" w:right="0" w:leftChars="0" w:rightChars="0" w:start="0" w:end="0"/>
+              <w:autoSpaceDN w:val="0"/>
+              <w:keepNext/>
+              <w:autoSpaceDE w:val="0"/>
               <w:jc w:val="left"/>
             </w:pPr>
             <w:r>
@@ -3047,9 +3097,11 @@
           </w:tcPr>
           <w:p>
             <w:pPr>
-              <w:keepNext/>
-              <w:spacing w:line="360" w:lineRule="exact" w:after="40"/>
-              <w:ind w:firstLine="0" w:firstLineChars="0" w:left="0" w:right="0" w:leftChars="0" w:rightChars="0" w:start="0" w:end="0"/>
+              <w:spacing w:line="360" w:lineRule="exact" w:after="40"/>
+              <w:ind w:firstLine="0" w:firstLineChars="0" w:left="0" w:right="0" w:leftChars="0" w:rightChars="0" w:start="0" w:end="0"/>
+              <w:autoSpaceDN w:val="0"/>
+              <w:keepNext/>
+              <w:autoSpaceDE w:val="0"/>
               <w:jc w:val="center"/>
             </w:pPr>
             <w:r>
@@ -3079,9 +3131,11 @@
           </w:tcPr>
           <w:p>
             <w:pPr>
-              <w:keepNext/>
-              <w:spacing w:line="360" w:lineRule="exact" w:after="40"/>
-              <w:ind w:firstLine="0" w:firstLineChars="0" w:left="0" w:right="0" w:leftChars="0" w:rightChars="0" w:start="0" w:end="0"/>
+              <w:spacing w:line="360" w:lineRule="exact" w:after="40"/>
+              <w:ind w:firstLine="0" w:firstLineChars="0" w:left="0" w:right="0" w:leftChars="0" w:rightChars="0" w:start="0" w:end="0"/>
+              <w:autoSpaceDN w:val="0"/>
+              <w:keepNext/>
+              <w:autoSpaceDE w:val="0"/>
               <w:jc w:val="center"/>
             </w:pPr>
             <w:r>
@@ -3111,9 +3165,11 @@
           </w:tcPr>
           <w:p>
             <w:pPr>
-              <w:keepNext/>
-              <w:spacing w:line="360" w:lineRule="exact" w:after="40"/>
-              <w:ind w:firstLine="0" w:firstLineChars="0" w:left="0" w:right="0" w:leftChars="0" w:rightChars="0" w:start="0" w:end="0"/>
+              <w:spacing w:line="360" w:lineRule="exact" w:after="40"/>
+              <w:ind w:firstLine="0" w:firstLineChars="0" w:left="0" w:right="0" w:leftChars="0" w:rightChars="0" w:start="0" w:end="0"/>
+              <w:autoSpaceDN w:val="0"/>
+              <w:keepNext/>
+              <w:autoSpaceDE w:val="0"/>
               <w:jc w:val="center"/>
             </w:pPr>
             <w:r>
@@ -3147,9 +3203,11 @@
           </w:tcPr>
           <w:p>
             <w:pPr>
-              <w:keepNext/>
-              <w:spacing w:line="360" w:lineRule="exact" w:after="40"/>
-              <w:ind w:firstLine="0" w:firstLineChars="0" w:left="0" w:right="0" w:leftChars="0" w:rightChars="0" w:start="0" w:end="0"/>
+              <w:spacing w:line="360" w:lineRule="exact" w:after="40"/>
+              <w:ind w:firstLine="0" w:firstLineChars="0" w:left="0" w:right="0" w:leftChars="0" w:rightChars="0" w:start="0" w:end="0"/>
+              <w:autoSpaceDN w:val="0"/>
+              <w:keepNext/>
+              <w:autoSpaceDE w:val="0"/>
               <w:jc w:val="left"/>
             </w:pPr>
             <w:r>
@@ -3175,9 +3233,11 @@
           </w:tcPr>
           <w:p>
             <w:pPr>
-              <w:keepNext/>
-              <w:spacing w:line="360" w:lineRule="exact" w:after="40"/>
-              <w:ind w:firstLine="0" w:firstLineChars="0" w:left="0" w:right="0" w:leftChars="0" w:rightChars="0" w:start="0" w:end="0"/>
+              <w:spacing w:line="360" w:lineRule="exact" w:after="40"/>
+              <w:ind w:firstLine="0" w:firstLineChars="0" w:left="0" w:right="0" w:leftChars="0" w:rightChars="0" w:start="0" w:end="0"/>
+              <w:autoSpaceDN w:val="0"/>
+              <w:keepNext/>
+              <w:autoSpaceDE w:val="0"/>
               <w:jc w:val="center"/>
             </w:pPr>
             <w:r>
@@ -3203,9 +3263,11 @@
           </w:tcPr>
           <w:p>
             <w:pPr>
-              <w:keepNext/>
-              <w:spacing w:line="360" w:lineRule="exact" w:after="40"/>
-              <w:ind w:firstLine="0" w:firstLineChars="0" w:left="0" w:right="0" w:leftChars="0" w:rightChars="0" w:start="0" w:end="0"/>
+              <w:spacing w:line="360" w:lineRule="exact" w:after="40"/>
+              <w:ind w:firstLine="0" w:firstLineChars="0" w:left="0" w:right="0" w:leftChars="0" w:rightChars="0" w:start="0" w:end="0"/>
+              <w:autoSpaceDN w:val="0"/>
+              <w:keepNext/>
+              <w:autoSpaceDE w:val="0"/>
               <w:jc w:val="center"/>
             </w:pPr>
             <w:r>
@@ -3231,9 +3293,11 @@
           </w:tcPr>
           <w:p>
             <w:pPr>
-              <w:keepNext/>
-              <w:spacing w:line="360" w:lineRule="exact" w:after="40"/>
-              <w:ind w:firstLine="0" w:firstLineChars="0" w:left="0" w:right="0" w:leftChars="0" w:rightChars="0" w:start="0" w:end="0"/>
+              <w:spacing w:line="360" w:lineRule="exact" w:after="40"/>
+              <w:ind w:firstLine="0" w:firstLineChars="0" w:left="0" w:right="0" w:leftChars="0" w:rightChars="0" w:start="0" w:end="0"/>
+              <w:autoSpaceDN w:val="0"/>
+              <w:keepNext/>
+              <w:autoSpaceDE w:val="0"/>
               <w:jc w:val="center"/>
             </w:pPr>
             <w:r>
@@ -3264,9 +3328,11 @@
           </w:tcPr>
           <w:p>
             <w:pPr>
-              <w:keepNext/>
-              <w:spacing w:line="360" w:lineRule="exact" w:after="40"/>
-              <w:ind w:firstLine="0" w:firstLineChars="0" w:left="0" w:right="0" w:leftChars="0" w:rightChars="0" w:start="0" w:end="0"/>
+              <w:spacing w:line="360" w:lineRule="exact" w:after="40"/>
+              <w:ind w:firstLine="0" w:firstLineChars="0" w:left="0" w:right="0" w:leftChars="0" w:rightChars="0" w:start="0" w:end="0"/>
+              <w:autoSpaceDN w:val="0"/>
+              <w:keepNext/>
+              <w:autoSpaceDE w:val="0"/>
               <w:jc w:val="left"/>
             </w:pPr>
             <w:r>
@@ -3292,9 +3358,11 @@
           </w:tcPr>
           <w:p>
             <w:pPr>
-              <w:keepNext/>
-              <w:spacing w:line="360" w:lineRule="exact" w:after="40"/>
-              <w:ind w:firstLine="0" w:firstLineChars="0" w:left="0" w:right="0" w:leftChars="0" w:rightChars="0" w:start="0" w:end="0"/>
+              <w:spacing w:line="360" w:lineRule="exact" w:after="40"/>
+              <w:ind w:firstLine="0" w:firstLineChars="0" w:left="0" w:right="0" w:leftChars="0" w:rightChars="0" w:start="0" w:end="0"/>
+              <w:autoSpaceDN w:val="0"/>
+              <w:keepNext/>
+              <w:autoSpaceDE w:val="0"/>
               <w:jc w:val="center"/>
             </w:pPr>
             <w:r>
@@ -3320,9 +3388,11 @@
           </w:tcPr>
           <w:p>
             <w:pPr>
-              <w:keepNext/>
-              <w:spacing w:line="360" w:lineRule="exact" w:after="40"/>
-              <w:ind w:firstLine="0" w:firstLineChars="0" w:left="0" w:right="0" w:leftChars="0" w:rightChars="0" w:start="0" w:end="0"/>
+              <w:spacing w:line="360" w:lineRule="exact" w:after="40"/>
+              <w:ind w:firstLine="0" w:firstLineChars="0" w:left="0" w:right="0" w:leftChars="0" w:rightChars="0" w:start="0" w:end="0"/>
+              <w:autoSpaceDN w:val="0"/>
+              <w:keepNext/>
+              <w:autoSpaceDE w:val="0"/>
               <w:jc w:val="center"/>
             </w:pPr>
             <w:r>
@@ -3348,9 +3418,11 @@
           </w:tcPr>
           <w:p>
             <w:pPr>
-              <w:keepNext/>
-              <w:spacing w:line="360" w:lineRule="exact" w:after="40"/>
-              <w:ind w:firstLine="0" w:firstLineChars="0" w:left="0" w:right="0" w:leftChars="0" w:rightChars="0" w:start="0" w:end="0"/>
+              <w:spacing w:line="360" w:lineRule="exact" w:after="40"/>
+              <w:ind w:firstLine="0" w:firstLineChars="0" w:left="0" w:right="0" w:leftChars="0" w:rightChars="0" w:start="0" w:end="0"/>
+              <w:autoSpaceDN w:val="0"/>
+              <w:keepNext/>
+              <w:autoSpaceDE w:val="0"/>
               <w:jc w:val="center"/>
             </w:pPr>
             <w:r>
@@ -3381,9 +3453,11 @@
           </w:tcPr>
           <w:p>
             <w:pPr>
+              <w:spacing w:line="360" w:lineRule="exact" w:after="40"/>
+              <w:ind w:firstLine="0" w:firstLineChars="0" w:left="0" w:right="0" w:leftChars="0" w:rightChars="0" w:start="0" w:end="0"/>
+              <w:autoSpaceDN w:val="0"/>
               <w:keepNext w:val="0"/>
-              <w:spacing w:line="360" w:lineRule="exact" w:after="40"/>
-              <w:ind w:firstLine="0" w:firstLineChars="0" w:left="0" w:right="0" w:leftChars="0" w:rightChars="0" w:start="0" w:end="0"/>
+              <w:autoSpaceDE w:val="0"/>
               <w:jc w:val="left"/>
             </w:pPr>
             <w:r>
@@ -3409,9 +3483,11 @@
           </w:tcPr>
           <w:p>
             <w:pPr>
+              <w:spacing w:line="360" w:lineRule="exact" w:after="40"/>
+              <w:ind w:firstLine="0" w:firstLineChars="0" w:left="0" w:right="0" w:leftChars="0" w:rightChars="0" w:start="0" w:end="0"/>
+              <w:autoSpaceDN w:val="0"/>
               <w:keepNext w:val="0"/>
-              <w:spacing w:line="360" w:lineRule="exact" w:after="40"/>
-              <w:ind w:firstLine="0" w:firstLineChars="0" w:left="0" w:right="0" w:leftChars="0" w:rightChars="0" w:start="0" w:end="0"/>
+              <w:autoSpaceDE w:val="0"/>
               <w:jc w:val="center"/>
             </w:pPr>
             <w:r>
@@ -3437,9 +3513,11 @@
           </w:tcPr>
           <w:p>
             <w:pPr>
+              <w:spacing w:line="360" w:lineRule="exact" w:after="40"/>
+              <w:ind w:firstLine="0" w:firstLineChars="0" w:left="0" w:right="0" w:leftChars="0" w:rightChars="0" w:start="0" w:end="0"/>
+              <w:autoSpaceDN w:val="0"/>
               <w:keepNext w:val="0"/>
-              <w:spacing w:line="360" w:lineRule="exact" w:after="40"/>
-              <w:ind w:firstLine="0" w:firstLineChars="0" w:left="0" w:right="0" w:leftChars="0" w:rightChars="0" w:start="0" w:end="0"/>
+              <w:autoSpaceDE w:val="0"/>
               <w:jc w:val="center"/>
             </w:pPr>
             <w:r>
@@ -3465,9 +3543,11 @@
           </w:tcPr>
           <w:p>
             <w:pPr>
+              <w:spacing w:line="360" w:lineRule="exact" w:after="40"/>
+              <w:ind w:firstLine="0" w:firstLineChars="0" w:left="0" w:right="0" w:leftChars="0" w:rightChars="0" w:start="0" w:end="0"/>
+              <w:autoSpaceDN w:val="0"/>
               <w:keepNext w:val="0"/>
-              <w:spacing w:line="360" w:lineRule="exact" w:after="40"/>
-              <w:ind w:firstLine="0" w:firstLineChars="0" w:left="0" w:right="0" w:leftChars="0" w:rightChars="0" w:start="0" w:end="0"/>
+              <w:autoSpaceDE w:val="0"/>
               <w:jc w:val="center"/>
             </w:pPr>
             <w:r>
@@ -3493,8 +3573,8 @@
         <w:wordWrap/>
         <w:overflowPunct/>
         <w:topLinePunct w:val="0"/>
-        <w:autoSpaceDE/>
-        <w:autoSpaceDN/>
+        <w:autoSpaceDE w:val="0"/>
+        <w:autoSpaceDN w:val="0"/>
         <w:bidi w:val="0"/>
         <w:adjustRightInd/>
         <w:snapToGrid/>
@@ -3574,8 +3654,8 @@
         <w:wordWrap/>
         <w:overflowPunct/>
         <w:topLinePunct w:val="0"/>
-        <w:autoSpaceDE/>
-        <w:autoSpaceDN/>
+        <w:autoSpaceDE w:val="0"/>
+        <w:autoSpaceDN w:val="0"/>
         <w:bidi w:val="0"/>
         <w:adjustRightInd/>
         <w:snapToGrid/>
@@ -3601,7 +3681,7 @@
           <w:szCs w:val="32"/>
           <w:lang w:val="en-US" w:eastAsia="zh-CN" w:bidi="ar"/>
         </w:rPr>
-        <w:t>图5  三种初始安排的平均排队时间与完整用时</w:t>
+        <w:t>图5三种初始安排的平均排队时间与完整用时</w:t>
       </w:r>
     </w:p>
     <w:p>
@@ -3615,8 +3695,8 @@
         <w:wordWrap/>
         <w:overflowPunct/>
         <w:topLinePunct w:val="0"/>
-        <w:autoSpaceDE/>
-        <w:autoSpaceDN/>
+        <w:autoSpaceDE w:val="0"/>
+        <w:autoSpaceDN w:val="0"/>
         <w:bidi w:val="0"/>
         <w:adjustRightInd/>
         <w:snapToGrid/>
@@ -3660,8 +3740,8 @@
         <w:wordWrap/>
         <w:overflowPunct/>
         <w:topLinePunct w:val="0"/>
-        <w:autoSpaceDE/>
-        <w:autoSpaceDN/>
+        <w:autoSpaceDE w:val="0"/>
+        <w:autoSpaceDN w:val="0"/>
         <w:bidi w:val="0"/>
         <w:adjustRightInd/>
         <w:snapToGrid/>
@@ -3705,8 +3785,8 @@
         <w:wordWrap/>
         <w:overflowPunct/>
         <w:topLinePunct w:val="0"/>
-        <w:autoSpaceDE/>
-        <w:autoSpaceDN/>
+        <w:autoSpaceDE w:val="0"/>
+        <w:autoSpaceDN w:val="0"/>
         <w:bidi w:val="0"/>
         <w:adjustRightInd/>
         <w:snapToGrid/>
@@ -3746,8 +3826,8 @@
         <w:wordWrap/>
         <w:overflowPunct/>
         <w:topLinePunct w:val="0"/>
-        <w:autoSpaceDE/>
-        <w:autoSpaceDN/>
+        <w:autoSpaceDE w:val="0"/>
+        <w:autoSpaceDN w:val="0"/>
         <w:bidi w:val="0"/>
         <w:adjustRightInd/>
         <w:snapToGrid/>
@@ -3808,8 +3888,8 @@
         <w:wordWrap/>
         <w:overflowPunct/>
         <w:topLinePunct w:val="0"/>
-        <w:autoSpaceDE/>
-        <w:autoSpaceDN/>
+        <w:autoSpaceDE w:val="0"/>
+        <w:autoSpaceDN w:val="0"/>
         <w:bidi w:val="0"/>
         <w:adjustRightInd/>
         <w:snapToGrid/>
@@ -3849,8 +3929,8 @@
         <w:wordWrap/>
         <w:overflowPunct/>
         <w:topLinePunct w:val="0"/>
-        <w:autoSpaceDE/>
-        <w:autoSpaceDN/>
+        <w:autoSpaceDE w:val="0"/>
+        <w:autoSpaceDN w:val="0"/>
         <w:bidi w:val="0"/>
         <w:adjustRightInd/>
         <w:snapToGrid/>
@@ -3876,7 +3956,7 @@
           <w:szCs w:val="32"/>
           <w:lang w:val="en-US" w:eastAsia="zh-CN" w:bidi="ar"/>
         </w:rPr>
-        <w:t>表4  不同相邻组间隔各计算30次的结果</w:t>
+        <w:t>表4不同相邻组间隔各计算30次的结果</w:t>
       </w:r>
     </w:p>
     <w:tbl>
@@ -3920,9 +4000,11 @@
           </w:tcPr>
           <w:p>
             <w:pPr>
-              <w:keepNext/>
-              <w:spacing w:line="360" w:lineRule="exact" w:after="40"/>
-              <w:ind w:firstLine="0" w:firstLineChars="0" w:left="0" w:right="0" w:leftChars="0" w:rightChars="0" w:start="0" w:end="0"/>
+              <w:spacing w:line="360" w:lineRule="exact" w:after="40"/>
+              <w:ind w:firstLine="0" w:firstLineChars="0" w:left="0" w:right="0" w:leftChars="0" w:rightChars="0" w:start="0" w:end="0"/>
+              <w:autoSpaceDN w:val="0"/>
+              <w:keepNext/>
+              <w:autoSpaceDE w:val="0"/>
               <w:jc w:val="left"/>
             </w:pPr>
             <w:r>
@@ -3952,9 +4034,11 @@
           </w:tcPr>
           <w:p>
             <w:pPr>
-              <w:keepNext/>
-              <w:spacing w:line="360" w:lineRule="exact" w:after="40"/>
-              <w:ind w:firstLine="0" w:firstLineChars="0" w:left="0" w:right="0" w:leftChars="0" w:rightChars="0" w:start="0" w:end="0"/>
+              <w:spacing w:line="360" w:lineRule="exact" w:after="40"/>
+              <w:ind w:firstLine="0" w:firstLineChars="0" w:left="0" w:right="0" w:leftChars="0" w:rightChars="0" w:start="0" w:end="0"/>
+              <w:autoSpaceDN w:val="0"/>
+              <w:keepNext/>
+              <w:autoSpaceDE w:val="0"/>
               <w:jc w:val="center"/>
             </w:pPr>
             <w:r>
@@ -3984,9 +4068,11 @@
           </w:tcPr>
           <w:p>
             <w:pPr>
-              <w:keepNext/>
-              <w:spacing w:line="360" w:lineRule="exact" w:after="40"/>
-              <w:ind w:firstLine="0" w:firstLineChars="0" w:left="0" w:right="0" w:leftChars="0" w:rightChars="0" w:start="0" w:end="0"/>
+              <w:spacing w:line="360" w:lineRule="exact" w:after="40"/>
+              <w:ind w:firstLine="0" w:firstLineChars="0" w:left="0" w:right="0" w:leftChars="0" w:rightChars="0" w:start="0" w:end="0"/>
+              <w:autoSpaceDN w:val="0"/>
+              <w:keepNext/>
+              <w:autoSpaceDE w:val="0"/>
               <w:jc w:val="center"/>
             </w:pPr>
             <w:r>
@@ -4016,9 +4102,11 @@
           </w:tcPr>
           <w:p>
             <w:pPr>
-              <w:keepNext/>
-              <w:spacing w:line="360" w:lineRule="exact" w:after="40"/>
-              <w:ind w:firstLine="0" w:firstLineChars="0" w:left="0" w:right="0" w:leftChars="0" w:rightChars="0" w:start="0" w:end="0"/>
+              <w:spacing w:line="360" w:lineRule="exact" w:after="40"/>
+              <w:ind w:firstLine="0" w:firstLineChars="0" w:left="0" w:right="0" w:leftChars="0" w:rightChars="0" w:start="0" w:end="0"/>
+              <w:autoSpaceDN w:val="0"/>
+              <w:keepNext/>
+              <w:autoSpaceDE w:val="0"/>
               <w:jc w:val="center"/>
             </w:pPr>
             <w:r>
@@ -4050,9 +4138,11 @@
           </w:tcPr>
           <w:p>
             <w:pPr>
-              <w:keepNext/>
-              <w:spacing w:line="360" w:lineRule="exact" w:after="40"/>
-              <w:ind w:firstLine="0" w:firstLineChars="0" w:left="0" w:right="0" w:leftChars="0" w:rightChars="0" w:start="0" w:end="0"/>
+              <w:spacing w:line="360" w:lineRule="exact" w:after="40"/>
+              <w:ind w:firstLine="0" w:firstLineChars="0" w:left="0" w:right="0" w:leftChars="0" w:rightChars="0" w:start="0" w:end="0"/>
+              <w:autoSpaceDN w:val="0"/>
+              <w:keepNext/>
+              <w:autoSpaceDE w:val="0"/>
               <w:jc w:val="left"/>
             </w:pPr>
             <w:r>
@@ -4078,9 +4168,11 @@
           </w:tcPr>
           <w:p>
             <w:pPr>
-              <w:keepNext/>
-              <w:spacing w:line="360" w:lineRule="exact" w:after="40"/>
-              <w:ind w:firstLine="0" w:firstLineChars="0" w:left="0" w:right="0" w:leftChars="0" w:rightChars="0" w:start="0" w:end="0"/>
+              <w:spacing w:line="360" w:lineRule="exact" w:after="40"/>
+              <w:ind w:firstLine="0" w:firstLineChars="0" w:left="0" w:right="0" w:leftChars="0" w:rightChars="0" w:start="0" w:end="0"/>
+              <w:autoSpaceDN w:val="0"/>
+              <w:keepNext/>
+              <w:autoSpaceDE w:val="0"/>
               <w:jc w:val="center"/>
             </w:pPr>
             <w:r>
@@ -4106,9 +4198,11 @@
           </w:tcPr>
           <w:p>
             <w:pPr>
-              <w:keepNext/>
-              <w:spacing w:line="360" w:lineRule="exact" w:after="40"/>
-              <w:ind w:firstLine="0" w:firstLineChars="0" w:left="0" w:right="0" w:leftChars="0" w:rightChars="0" w:start="0" w:end="0"/>
+              <w:spacing w:line="360" w:lineRule="exact" w:after="40"/>
+              <w:ind w:firstLine="0" w:firstLineChars="0" w:left="0" w:right="0" w:leftChars="0" w:rightChars="0" w:start="0" w:end="0"/>
+              <w:autoSpaceDN w:val="0"/>
+              <w:keepNext/>
+              <w:autoSpaceDE w:val="0"/>
               <w:jc w:val="center"/>
             </w:pPr>
             <w:r>
@@ -4134,9 +4228,11 @@
           </w:tcPr>
           <w:p>
             <w:pPr>
-              <w:keepNext/>
-              <w:spacing w:line="360" w:lineRule="exact" w:after="40"/>
-              <w:ind w:firstLine="0" w:firstLineChars="0" w:left="0" w:right="0" w:leftChars="0" w:rightChars="0" w:start="0" w:end="0"/>
+              <w:spacing w:line="360" w:lineRule="exact" w:after="40"/>
+              <w:ind w:firstLine="0" w:firstLineChars="0" w:left="0" w:right="0" w:leftChars="0" w:rightChars="0" w:start="0" w:end="0"/>
+              <w:autoSpaceDN w:val="0"/>
+              <w:keepNext/>
+              <w:autoSpaceDE w:val="0"/>
               <w:jc w:val="center"/>
             </w:pPr>
             <w:r>
@@ -4167,9 +4263,11 @@
           </w:tcPr>
           <w:p>
             <w:pPr>
-              <w:keepNext/>
-              <w:spacing w:line="360" w:lineRule="exact" w:after="40"/>
-              <w:ind w:firstLine="0" w:firstLineChars="0" w:left="0" w:right="0" w:leftChars="0" w:rightChars="0" w:start="0" w:end="0"/>
+              <w:spacing w:line="360" w:lineRule="exact" w:after="40"/>
+              <w:ind w:firstLine="0" w:firstLineChars="0" w:left="0" w:right="0" w:leftChars="0" w:rightChars="0" w:start="0" w:end="0"/>
+              <w:autoSpaceDN w:val="0"/>
+              <w:keepNext/>
+              <w:autoSpaceDE w:val="0"/>
               <w:jc w:val="left"/>
             </w:pPr>
             <w:r>
@@ -4195,9 +4293,11 @@
           </w:tcPr>
           <w:p>
             <w:pPr>
-              <w:keepNext/>
-              <w:spacing w:line="360" w:lineRule="exact" w:after="40"/>
-              <w:ind w:firstLine="0" w:firstLineChars="0" w:left="0" w:right="0" w:leftChars="0" w:rightChars="0" w:start="0" w:end="0"/>
+              <w:spacing w:line="360" w:lineRule="exact" w:after="40"/>
+              <w:ind w:firstLine="0" w:firstLineChars="0" w:left="0" w:right="0" w:leftChars="0" w:rightChars="0" w:start="0" w:end="0"/>
+              <w:autoSpaceDN w:val="0"/>
+              <w:keepNext/>
+              <w:autoSpaceDE w:val="0"/>
               <w:jc w:val="center"/>
             </w:pPr>
             <w:r>
@@ -4223,9 +4323,11 @@
           </w:tcPr>
           <w:p>
             <w:pPr>
-              <w:keepNext/>
-              <w:spacing w:line="360" w:lineRule="exact" w:after="40"/>
-              <w:ind w:firstLine="0" w:firstLineChars="0" w:left="0" w:right="0" w:leftChars="0" w:rightChars="0" w:start="0" w:end="0"/>
+              <w:spacing w:line="360" w:lineRule="exact" w:after="40"/>
+              <w:ind w:firstLine="0" w:firstLineChars="0" w:left="0" w:right="0" w:leftChars="0" w:rightChars="0" w:start="0" w:end="0"/>
+              <w:autoSpaceDN w:val="0"/>
+              <w:keepNext/>
+              <w:autoSpaceDE w:val="0"/>
               <w:jc w:val="center"/>
             </w:pPr>
             <w:r>
@@ -4251,9 +4353,11 @@
           </w:tcPr>
           <w:p>
             <w:pPr>
-              <w:keepNext/>
-              <w:spacing w:line="360" w:lineRule="exact" w:after="40"/>
-              <w:ind w:firstLine="0" w:firstLineChars="0" w:left="0" w:right="0" w:leftChars="0" w:rightChars="0" w:start="0" w:end="0"/>
+              <w:spacing w:line="360" w:lineRule="exact" w:after="40"/>
+              <w:ind w:firstLine="0" w:firstLineChars="0" w:left="0" w:right="0" w:leftChars="0" w:rightChars="0" w:start="0" w:end="0"/>
+              <w:autoSpaceDN w:val="0"/>
+              <w:keepNext/>
+              <w:autoSpaceDE w:val="0"/>
               <w:jc w:val="center"/>
             </w:pPr>
             <w:r>
@@ -4284,9 +4388,11 @@
           </w:tcPr>
           <w:p>
             <w:pPr>
-              <w:keepNext/>
-              <w:spacing w:line="360" w:lineRule="exact" w:after="40"/>
-              <w:ind w:firstLine="0" w:firstLineChars="0" w:left="0" w:right="0" w:leftChars="0" w:rightChars="0" w:start="0" w:end="0"/>
+              <w:spacing w:line="360" w:lineRule="exact" w:after="40"/>
+              <w:ind w:firstLine="0" w:firstLineChars="0" w:left="0" w:right="0" w:leftChars="0" w:rightChars="0" w:start="0" w:end="0"/>
+              <w:autoSpaceDN w:val="0"/>
+              <w:keepNext/>
+              <w:autoSpaceDE w:val="0"/>
               <w:jc w:val="left"/>
             </w:pPr>
             <w:r>
@@ -4312,9 +4418,11 @@
           </w:tcPr>
           <w:p>
             <w:pPr>
-              <w:keepNext/>
-              <w:spacing w:line="360" w:lineRule="exact" w:after="40"/>
-              <w:ind w:firstLine="0" w:firstLineChars="0" w:left="0" w:right="0" w:leftChars="0" w:rightChars="0" w:start="0" w:end="0"/>
+              <w:spacing w:line="360" w:lineRule="exact" w:after="40"/>
+              <w:ind w:firstLine="0" w:firstLineChars="0" w:left="0" w:right="0" w:leftChars="0" w:rightChars="0" w:start="0" w:end="0"/>
+              <w:autoSpaceDN w:val="0"/>
+              <w:keepNext/>
+              <w:autoSpaceDE w:val="0"/>
               <w:jc w:val="center"/>
             </w:pPr>
             <w:r>
@@ -4340,9 +4448,11 @@
           </w:tcPr>
           <w:p>
             <w:pPr>
-              <w:keepNext/>
-              <w:spacing w:line="360" w:lineRule="exact" w:after="40"/>
-              <w:ind w:firstLine="0" w:firstLineChars="0" w:left="0" w:right="0" w:leftChars="0" w:rightChars="0" w:start="0" w:end="0"/>
+              <w:spacing w:line="360" w:lineRule="exact" w:after="40"/>
+              <w:ind w:firstLine="0" w:firstLineChars="0" w:left="0" w:right="0" w:leftChars="0" w:rightChars="0" w:start="0" w:end="0"/>
+              <w:autoSpaceDN w:val="0"/>
+              <w:keepNext/>
+              <w:autoSpaceDE w:val="0"/>
               <w:jc w:val="center"/>
             </w:pPr>
             <w:r>
@@ -4368,9 +4478,11 @@
           </w:tcPr>
           <w:p>
             <w:pPr>
-              <w:keepNext/>
-              <w:spacing w:line="360" w:lineRule="exact" w:after="40"/>
-              <w:ind w:firstLine="0" w:firstLineChars="0" w:left="0" w:right="0" w:leftChars="0" w:rightChars="0" w:start="0" w:end="0"/>
+              <w:spacing w:line="360" w:lineRule="exact" w:after="40"/>
+              <w:ind w:firstLine="0" w:firstLineChars="0" w:left="0" w:right="0" w:leftChars="0" w:rightChars="0" w:start="0" w:end="0"/>
+              <w:autoSpaceDN w:val="0"/>
+              <w:keepNext/>
+              <w:autoSpaceDE w:val="0"/>
               <w:jc w:val="center"/>
             </w:pPr>
             <w:r>
@@ -4401,9 +4513,11 @@
           </w:tcPr>
           <w:p>
             <w:pPr>
-              <w:keepNext/>
-              <w:spacing w:line="360" w:lineRule="exact" w:after="40"/>
-              <w:ind w:firstLine="0" w:firstLineChars="0" w:left="0" w:right="0" w:leftChars="0" w:rightChars="0" w:start="0" w:end="0"/>
+              <w:spacing w:line="360" w:lineRule="exact" w:after="40"/>
+              <w:ind w:firstLine="0" w:firstLineChars="0" w:left="0" w:right="0" w:leftChars="0" w:rightChars="0" w:start="0" w:end="0"/>
+              <w:autoSpaceDN w:val="0"/>
+              <w:keepNext/>
+              <w:autoSpaceDE w:val="0"/>
               <w:jc w:val="left"/>
             </w:pPr>
             <w:r>
@@ -4429,9 +4543,11 @@
           </w:tcPr>
           <w:p>
             <w:pPr>
-              <w:keepNext/>
-              <w:spacing w:line="360" w:lineRule="exact" w:after="40"/>
-              <w:ind w:firstLine="0" w:firstLineChars="0" w:left="0" w:right="0" w:leftChars="0" w:rightChars="0" w:start="0" w:end="0"/>
+              <w:spacing w:line="360" w:lineRule="exact" w:after="40"/>
+              <w:ind w:firstLine="0" w:firstLineChars="0" w:left="0" w:right="0" w:leftChars="0" w:rightChars="0" w:start="0" w:end="0"/>
+              <w:autoSpaceDN w:val="0"/>
+              <w:keepNext/>
+              <w:autoSpaceDE w:val="0"/>
               <w:jc w:val="center"/>
             </w:pPr>
             <w:r>
@@ -4457,9 +4573,11 @@
           </w:tcPr>
           <w:p>
             <w:pPr>
-              <w:keepNext/>
-              <w:spacing w:line="360" w:lineRule="exact" w:after="40"/>
-              <w:ind w:firstLine="0" w:firstLineChars="0" w:left="0" w:right="0" w:leftChars="0" w:rightChars="0" w:start="0" w:end="0"/>
+              <w:spacing w:line="360" w:lineRule="exact" w:after="40"/>
+              <w:ind w:firstLine="0" w:firstLineChars="0" w:left="0" w:right="0" w:leftChars="0" w:rightChars="0" w:start="0" w:end="0"/>
+              <w:autoSpaceDN w:val="0"/>
+              <w:keepNext/>
+              <w:autoSpaceDE w:val="0"/>
               <w:jc w:val="center"/>
             </w:pPr>
             <w:r>
@@ -4485,9 +4603,11 @@
           </w:tcPr>
           <w:p>
             <w:pPr>
-              <w:keepNext/>
-              <w:spacing w:line="360" w:lineRule="exact" w:after="40"/>
-              <w:ind w:firstLine="0" w:firstLineChars="0" w:left="0" w:right="0" w:leftChars="0" w:rightChars="0" w:start="0" w:end="0"/>
+              <w:spacing w:line="360" w:lineRule="exact" w:after="40"/>
+              <w:ind w:firstLine="0" w:firstLineChars="0" w:left="0" w:right="0" w:leftChars="0" w:rightChars="0" w:start="0" w:end="0"/>
+              <w:autoSpaceDN w:val="0"/>
+              <w:keepNext/>
+              <w:autoSpaceDE w:val="0"/>
               <w:jc w:val="center"/>
             </w:pPr>
             <w:r>
@@ -4518,9 +4638,11 @@
           </w:tcPr>
           <w:p>
             <w:pPr>
-              <w:keepNext/>
-              <w:spacing w:line="360" w:lineRule="exact" w:after="40"/>
-              <w:ind w:firstLine="0" w:firstLineChars="0" w:left="0" w:right="0" w:leftChars="0" w:rightChars="0" w:start="0" w:end="0"/>
+              <w:spacing w:line="360" w:lineRule="exact" w:after="40"/>
+              <w:ind w:firstLine="0" w:firstLineChars="0" w:left="0" w:right="0" w:leftChars="0" w:rightChars="0" w:start="0" w:end="0"/>
+              <w:autoSpaceDN w:val="0"/>
+              <w:keepNext/>
+              <w:autoSpaceDE w:val="0"/>
               <w:jc w:val="left"/>
             </w:pPr>
             <w:r>
@@ -4546,9 +4668,11 @@
           </w:tcPr>
           <w:p>
             <w:pPr>
-              <w:keepNext/>
-              <w:spacing w:line="360" w:lineRule="exact" w:after="40"/>
-              <w:ind w:firstLine="0" w:firstLineChars="0" w:left="0" w:right="0" w:leftChars="0" w:rightChars="0" w:start="0" w:end="0"/>
+              <w:spacing w:line="360" w:lineRule="exact" w:after="40"/>
+              <w:ind w:firstLine="0" w:firstLineChars="0" w:left="0" w:right="0" w:leftChars="0" w:rightChars="0" w:start="0" w:end="0"/>
+              <w:autoSpaceDN w:val="0"/>
+              <w:keepNext/>
+              <w:autoSpaceDE w:val="0"/>
               <w:jc w:val="center"/>
             </w:pPr>
             <w:r>
@@ -4574,9 +4698,11 @@
           </w:tcPr>
           <w:p>
             <w:pPr>
-              <w:keepNext/>
-              <w:spacing w:line="360" w:lineRule="exact" w:after="40"/>
-              <w:ind w:firstLine="0" w:firstLineChars="0" w:left="0" w:right="0" w:leftChars="0" w:rightChars="0" w:start="0" w:end="0"/>
+              <w:spacing w:line="360" w:lineRule="exact" w:after="40"/>
+              <w:ind w:firstLine="0" w:firstLineChars="0" w:left="0" w:right="0" w:leftChars="0" w:rightChars="0" w:start="0" w:end="0"/>
+              <w:autoSpaceDN w:val="0"/>
+              <w:keepNext/>
+              <w:autoSpaceDE w:val="0"/>
               <w:jc w:val="center"/>
             </w:pPr>
             <w:r>
@@ -4602,9 +4728,11 @@
           </w:tcPr>
           <w:p>
             <w:pPr>
-              <w:keepNext/>
-              <w:spacing w:line="360" w:lineRule="exact" w:after="40"/>
-              <w:ind w:firstLine="0" w:firstLineChars="0" w:left="0" w:right="0" w:leftChars="0" w:rightChars="0" w:start="0" w:end="0"/>
+              <w:spacing w:line="360" w:lineRule="exact" w:after="40"/>
+              <w:ind w:firstLine="0" w:firstLineChars="0" w:left="0" w:right="0" w:leftChars="0" w:rightChars="0" w:start="0" w:end="0"/>
+              <w:autoSpaceDN w:val="0"/>
+              <w:keepNext/>
+              <w:autoSpaceDE w:val="0"/>
               <w:jc w:val="center"/>
             </w:pPr>
             <w:r>
@@ -4635,9 +4763,11 @@
           </w:tcPr>
           <w:p>
             <w:pPr>
-              <w:keepNext/>
-              <w:spacing w:line="360" w:lineRule="exact" w:after="40"/>
-              <w:ind w:firstLine="0" w:firstLineChars="0" w:left="0" w:right="0" w:leftChars="0" w:rightChars="0" w:start="0" w:end="0"/>
+              <w:spacing w:line="360" w:lineRule="exact" w:after="40"/>
+              <w:ind w:firstLine="0" w:firstLineChars="0" w:left="0" w:right="0" w:leftChars="0" w:rightChars="0" w:start="0" w:end="0"/>
+              <w:autoSpaceDN w:val="0"/>
+              <w:keepNext/>
+              <w:autoSpaceDE w:val="0"/>
               <w:jc w:val="left"/>
             </w:pPr>
             <w:r>
@@ -4663,9 +4793,11 @@
           </w:tcPr>
           <w:p>
             <w:pPr>
-              <w:keepNext/>
-              <w:spacing w:line="360" w:lineRule="exact" w:after="40"/>
-              <w:ind w:firstLine="0" w:firstLineChars="0" w:left="0" w:right="0" w:leftChars="0" w:rightChars="0" w:start="0" w:end="0"/>
+              <w:spacing w:line="360" w:lineRule="exact" w:after="40"/>
+              <w:ind w:firstLine="0" w:firstLineChars="0" w:left="0" w:right="0" w:leftChars="0" w:rightChars="0" w:start="0" w:end="0"/>
+              <w:autoSpaceDN w:val="0"/>
+              <w:keepNext/>
+              <w:autoSpaceDE w:val="0"/>
               <w:jc w:val="center"/>
             </w:pPr>
             <w:r>
@@ -4691,9 +4823,11 @@
           </w:tcPr>
           <w:p>
             <w:pPr>
-              <w:keepNext/>
-              <w:spacing w:line="360" w:lineRule="exact" w:after="40"/>
-              <w:ind w:firstLine="0" w:firstLineChars="0" w:left="0" w:right="0" w:leftChars="0" w:rightChars="0" w:start="0" w:end="0"/>
+              <w:spacing w:line="360" w:lineRule="exact" w:after="40"/>
+              <w:ind w:firstLine="0" w:firstLineChars="0" w:left="0" w:right="0" w:leftChars="0" w:rightChars="0" w:start="0" w:end="0"/>
+              <w:autoSpaceDN w:val="0"/>
+              <w:keepNext/>
+              <w:autoSpaceDE w:val="0"/>
               <w:jc w:val="center"/>
             </w:pPr>
             <w:r>
@@ -4719,9 +4853,11 @@
           </w:tcPr>
           <w:p>
             <w:pPr>
-              <w:keepNext/>
-              <w:spacing w:line="360" w:lineRule="exact" w:after="40"/>
-              <w:ind w:firstLine="0" w:firstLineChars="0" w:left="0" w:right="0" w:leftChars="0" w:rightChars="0" w:start="0" w:end="0"/>
+              <w:spacing w:line="360" w:lineRule="exact" w:after="40"/>
+              <w:ind w:firstLine="0" w:firstLineChars="0" w:left="0" w:right="0" w:leftChars="0" w:rightChars="0" w:start="0" w:end="0"/>
+              <w:autoSpaceDN w:val="0"/>
+              <w:keepNext/>
+              <w:autoSpaceDE w:val="0"/>
               <w:jc w:val="center"/>
             </w:pPr>
             <w:r>
@@ -4752,9 +4888,11 @@
           </w:tcPr>
           <w:p>
             <w:pPr>
-              <w:keepNext/>
-              <w:spacing w:line="360" w:lineRule="exact" w:after="40"/>
-              <w:ind w:firstLine="0" w:firstLineChars="0" w:left="0" w:right="0" w:leftChars="0" w:rightChars="0" w:start="0" w:end="0"/>
+              <w:spacing w:line="360" w:lineRule="exact" w:after="40"/>
+              <w:ind w:firstLine="0" w:firstLineChars="0" w:left="0" w:right="0" w:leftChars="0" w:rightChars="0" w:start="0" w:end="0"/>
+              <w:autoSpaceDN w:val="0"/>
+              <w:keepNext/>
+              <w:autoSpaceDE w:val="0"/>
               <w:jc w:val="left"/>
             </w:pPr>
             <w:r>
@@ -4780,9 +4918,11 @@
           </w:tcPr>
           <w:p>
             <w:pPr>
-              <w:keepNext/>
-              <w:spacing w:line="360" w:lineRule="exact" w:after="40"/>
-              <w:ind w:firstLine="0" w:firstLineChars="0" w:left="0" w:right="0" w:leftChars="0" w:rightChars="0" w:start="0" w:end="0"/>
+              <w:spacing w:line="360" w:lineRule="exact" w:after="40"/>
+              <w:ind w:firstLine="0" w:firstLineChars="0" w:left="0" w:right="0" w:leftChars="0" w:rightChars="0" w:start="0" w:end="0"/>
+              <w:autoSpaceDN w:val="0"/>
+              <w:keepNext/>
+              <w:autoSpaceDE w:val="0"/>
               <w:jc w:val="center"/>
             </w:pPr>
             <w:r>
@@ -4808,9 +4948,11 @@
           </w:tcPr>
           <w:p>
             <w:pPr>
-              <w:keepNext/>
-              <w:spacing w:line="360" w:lineRule="exact" w:after="40"/>
-              <w:ind w:firstLine="0" w:firstLineChars="0" w:left="0" w:right="0" w:leftChars="0" w:rightChars="0" w:start="0" w:end="0"/>
+              <w:spacing w:line="360" w:lineRule="exact" w:after="40"/>
+              <w:ind w:firstLine="0" w:firstLineChars="0" w:left="0" w:right="0" w:leftChars="0" w:rightChars="0" w:start="0" w:end="0"/>
+              <w:autoSpaceDN w:val="0"/>
+              <w:keepNext/>
+              <w:autoSpaceDE w:val="0"/>
               <w:jc w:val="center"/>
             </w:pPr>
             <w:r>
@@ -4836,9 +4978,11 @@
           </w:tcPr>
           <w:p>
             <w:pPr>
-              <w:keepNext/>
-              <w:spacing w:line="360" w:lineRule="exact" w:after="40"/>
-              <w:ind w:firstLine="0" w:firstLineChars="0" w:left="0" w:right="0" w:leftChars="0" w:rightChars="0" w:start="0" w:end="0"/>
+              <w:spacing w:line="360" w:lineRule="exact" w:after="40"/>
+              <w:ind w:firstLine="0" w:firstLineChars="0" w:left="0" w:right="0" w:leftChars="0" w:rightChars="0" w:start="0" w:end="0"/>
+              <w:autoSpaceDN w:val="0"/>
+              <w:keepNext/>
+              <w:autoSpaceDE w:val="0"/>
               <w:jc w:val="center"/>
             </w:pPr>
             <w:r>
@@ -4869,9 +5013,11 @@
           </w:tcPr>
           <w:p>
             <w:pPr>
-              <w:keepNext/>
-              <w:spacing w:line="360" w:lineRule="exact" w:after="40"/>
-              <w:ind w:firstLine="0" w:firstLineChars="0" w:left="0" w:right="0" w:leftChars="0" w:rightChars="0" w:start="0" w:end="0"/>
+              <w:spacing w:line="360" w:lineRule="exact" w:after="40"/>
+              <w:ind w:firstLine="0" w:firstLineChars="0" w:left="0" w:right="0" w:leftChars="0" w:rightChars="0" w:start="0" w:end="0"/>
+              <w:autoSpaceDN w:val="0"/>
+              <w:keepNext/>
+              <w:autoSpaceDE w:val="0"/>
               <w:jc w:val="left"/>
             </w:pPr>
             <w:r>
@@ -4897,9 +5043,11 @@
           </w:tcPr>
           <w:p>
             <w:pPr>
-              <w:keepNext/>
-              <w:spacing w:line="360" w:lineRule="exact" w:after="40"/>
-              <w:ind w:firstLine="0" w:firstLineChars="0" w:left="0" w:right="0" w:leftChars="0" w:rightChars="0" w:start="0" w:end="0"/>
+              <w:spacing w:line="360" w:lineRule="exact" w:after="40"/>
+              <w:ind w:firstLine="0" w:firstLineChars="0" w:left="0" w:right="0" w:leftChars="0" w:rightChars="0" w:start="0" w:end="0"/>
+              <w:autoSpaceDN w:val="0"/>
+              <w:keepNext/>
+              <w:autoSpaceDE w:val="0"/>
               <w:jc w:val="center"/>
             </w:pPr>
             <w:r>
@@ -4925,9 +5073,11 @@
           </w:tcPr>
           <w:p>
             <w:pPr>
-              <w:keepNext/>
-              <w:spacing w:line="360" w:lineRule="exact" w:after="40"/>
-              <w:ind w:firstLine="0" w:firstLineChars="0" w:left="0" w:right="0" w:leftChars="0" w:rightChars="0" w:start="0" w:end="0"/>
+              <w:spacing w:line="360" w:lineRule="exact" w:after="40"/>
+              <w:ind w:firstLine="0" w:firstLineChars="0" w:left="0" w:right="0" w:leftChars="0" w:rightChars="0" w:start="0" w:end="0"/>
+              <w:autoSpaceDN w:val="0"/>
+              <w:keepNext/>
+              <w:autoSpaceDE w:val="0"/>
               <w:jc w:val="center"/>
             </w:pPr>
             <w:r>
@@ -4953,9 +5103,11 @@
           </w:tcPr>
           <w:p>
             <w:pPr>
-              <w:keepNext/>
-              <w:spacing w:line="360" w:lineRule="exact" w:after="40"/>
-              <w:ind w:firstLine="0" w:firstLineChars="0" w:left="0" w:right="0" w:leftChars="0" w:rightChars="0" w:start="0" w:end="0"/>
+              <w:spacing w:line="360" w:lineRule="exact" w:after="40"/>
+              <w:ind w:firstLine="0" w:firstLineChars="0" w:left="0" w:right="0" w:leftChars="0" w:rightChars="0" w:start="0" w:end="0"/>
+              <w:autoSpaceDN w:val="0"/>
+              <w:keepNext/>
+              <w:autoSpaceDE w:val="0"/>
               <w:jc w:val="center"/>
             </w:pPr>
             <w:r>
@@ -4986,9 +5138,11 @@
           </w:tcPr>
           <w:p>
             <w:pPr>
-              <w:keepNext/>
-              <w:spacing w:line="360" w:lineRule="exact" w:after="40"/>
-              <w:ind w:firstLine="0" w:firstLineChars="0" w:left="0" w:right="0" w:leftChars="0" w:rightChars="0" w:start="0" w:end="0"/>
+              <w:spacing w:line="360" w:lineRule="exact" w:after="40"/>
+              <w:ind w:firstLine="0" w:firstLineChars="0" w:left="0" w:right="0" w:leftChars="0" w:rightChars="0" w:start="0" w:end="0"/>
+              <w:autoSpaceDN w:val="0"/>
+              <w:keepNext/>
+              <w:autoSpaceDE w:val="0"/>
               <w:jc w:val="left"/>
             </w:pPr>
             <w:r>
@@ -5014,9 +5168,11 @@
           </w:tcPr>
           <w:p>
             <w:pPr>
-              <w:keepNext/>
-              <w:spacing w:line="360" w:lineRule="exact" w:after="40"/>
-              <w:ind w:firstLine="0" w:firstLineChars="0" w:left="0" w:right="0" w:leftChars="0" w:rightChars="0" w:start="0" w:end="0"/>
+              <w:spacing w:line="360" w:lineRule="exact" w:after="40"/>
+              <w:ind w:firstLine="0" w:firstLineChars="0" w:left="0" w:right="0" w:leftChars="0" w:rightChars="0" w:start="0" w:end="0"/>
+              <w:autoSpaceDN w:val="0"/>
+              <w:keepNext/>
+              <w:autoSpaceDE w:val="0"/>
               <w:jc w:val="center"/>
             </w:pPr>
             <w:r>
@@ -5042,9 +5198,11 @@
           </w:tcPr>
           <w:p>
             <w:pPr>
-              <w:keepNext/>
-              <w:spacing w:line="360" w:lineRule="exact" w:after="40"/>
-              <w:ind w:firstLine="0" w:firstLineChars="0" w:left="0" w:right="0" w:leftChars="0" w:rightChars="0" w:start="0" w:end="0"/>
+              <w:spacing w:line="360" w:lineRule="exact" w:after="40"/>
+              <w:ind w:firstLine="0" w:firstLineChars="0" w:left="0" w:right="0" w:leftChars="0" w:rightChars="0" w:start="0" w:end="0"/>
+              <w:autoSpaceDN w:val="0"/>
+              <w:keepNext/>
+              <w:autoSpaceDE w:val="0"/>
               <w:jc w:val="center"/>
             </w:pPr>
             <w:r>
@@ -5070,9 +5228,11 @@
           </w:tcPr>
           <w:p>
             <w:pPr>
-              <w:keepNext/>
-              <w:spacing w:line="360" w:lineRule="exact" w:after="40"/>
-              <w:ind w:firstLine="0" w:firstLineChars="0" w:left="0" w:right="0" w:leftChars="0" w:rightChars="0" w:start="0" w:end="0"/>
+              <w:spacing w:line="360" w:lineRule="exact" w:after="40"/>
+              <w:ind w:firstLine="0" w:firstLineChars="0" w:left="0" w:right="0" w:leftChars="0" w:rightChars="0" w:start="0" w:end="0"/>
+              <w:autoSpaceDN w:val="0"/>
+              <w:keepNext/>
+              <w:autoSpaceDE w:val="0"/>
               <w:jc w:val="center"/>
             </w:pPr>
             <w:r>
@@ -5103,9 +5263,11 @@
           </w:tcPr>
           <w:p>
             <w:pPr>
-              <w:keepNext/>
-              <w:spacing w:line="360" w:lineRule="exact" w:after="40"/>
-              <w:ind w:firstLine="0" w:firstLineChars="0" w:left="0" w:right="0" w:leftChars="0" w:rightChars="0" w:start="0" w:end="0"/>
+              <w:spacing w:line="360" w:lineRule="exact" w:after="40"/>
+              <w:ind w:firstLine="0" w:firstLineChars="0" w:left="0" w:right="0" w:leftChars="0" w:rightChars="0" w:start="0" w:end="0"/>
+              <w:autoSpaceDN w:val="0"/>
+              <w:keepNext/>
+              <w:autoSpaceDE w:val="0"/>
               <w:jc w:val="left"/>
             </w:pPr>
             <w:r>
@@ -5131,9 +5293,11 @@
           </w:tcPr>
           <w:p>
             <w:pPr>
-              <w:keepNext/>
-              <w:spacing w:line="360" w:lineRule="exact" w:after="40"/>
-              <w:ind w:firstLine="0" w:firstLineChars="0" w:left="0" w:right="0" w:leftChars="0" w:rightChars="0" w:start="0" w:end="0"/>
+              <w:spacing w:line="360" w:lineRule="exact" w:after="40"/>
+              <w:ind w:firstLine="0" w:firstLineChars="0" w:left="0" w:right="0" w:leftChars="0" w:rightChars="0" w:start="0" w:end="0"/>
+              <w:autoSpaceDN w:val="0"/>
+              <w:keepNext/>
+              <w:autoSpaceDE w:val="0"/>
               <w:jc w:val="center"/>
             </w:pPr>
             <w:r>
@@ -5159,9 +5323,11 @@
           </w:tcPr>
           <w:p>
             <w:pPr>
-              <w:keepNext/>
-              <w:spacing w:line="360" w:lineRule="exact" w:after="40"/>
-              <w:ind w:firstLine="0" w:firstLineChars="0" w:left="0" w:right="0" w:leftChars="0" w:rightChars="0" w:start="0" w:end="0"/>
+              <w:spacing w:line="360" w:lineRule="exact" w:after="40"/>
+              <w:ind w:firstLine="0" w:firstLineChars="0" w:left="0" w:right="0" w:leftChars="0" w:rightChars="0" w:start="0" w:end="0"/>
+              <w:autoSpaceDN w:val="0"/>
+              <w:keepNext/>
+              <w:autoSpaceDE w:val="0"/>
               <w:jc w:val="center"/>
             </w:pPr>
             <w:r>
@@ -5187,9 +5353,11 @@
           </w:tcPr>
           <w:p>
             <w:pPr>
-              <w:keepNext/>
-              <w:spacing w:line="360" w:lineRule="exact" w:after="40"/>
-              <w:ind w:firstLine="0" w:firstLineChars="0" w:left="0" w:right="0" w:leftChars="0" w:rightChars="0" w:start="0" w:end="0"/>
+              <w:spacing w:line="360" w:lineRule="exact" w:after="40"/>
+              <w:ind w:firstLine="0" w:firstLineChars="0" w:left="0" w:right="0" w:leftChars="0" w:rightChars="0" w:start="0" w:end="0"/>
+              <w:autoSpaceDN w:val="0"/>
+              <w:keepNext/>
+              <w:autoSpaceDE w:val="0"/>
               <w:jc w:val="center"/>
             </w:pPr>
             <w:r>
@@ -5220,9 +5388,11 @@
           </w:tcPr>
           <w:p>
             <w:pPr>
-              <w:keepNext/>
-              <w:spacing w:line="360" w:lineRule="exact" w:after="40"/>
-              <w:ind w:firstLine="0" w:firstLineChars="0" w:left="0" w:right="0" w:leftChars="0" w:rightChars="0" w:start="0" w:end="0"/>
+              <w:spacing w:line="360" w:lineRule="exact" w:after="40"/>
+              <w:ind w:firstLine="0" w:firstLineChars="0" w:left="0" w:right="0" w:leftChars="0" w:rightChars="0" w:start="0" w:end="0"/>
+              <w:autoSpaceDN w:val="0"/>
+              <w:keepNext/>
+              <w:autoSpaceDE w:val="0"/>
               <w:jc w:val="left"/>
             </w:pPr>
             <w:r>
@@ -5248,9 +5418,11 @@
           </w:tcPr>
           <w:p>
             <w:pPr>
-              <w:keepNext/>
-              <w:spacing w:line="360" w:lineRule="exact" w:after="40"/>
-              <w:ind w:firstLine="0" w:firstLineChars="0" w:left="0" w:right="0" w:leftChars="0" w:rightChars="0" w:start="0" w:end="0"/>
+              <w:spacing w:line="360" w:lineRule="exact" w:after="40"/>
+              <w:ind w:firstLine="0" w:firstLineChars="0" w:left="0" w:right="0" w:leftChars="0" w:rightChars="0" w:start="0" w:end="0"/>
+              <w:autoSpaceDN w:val="0"/>
+              <w:keepNext/>
+              <w:autoSpaceDE w:val="0"/>
               <w:jc w:val="center"/>
             </w:pPr>
             <w:r>
@@ -5276,9 +5448,11 @@
           </w:tcPr>
           <w:p>
             <w:pPr>
-              <w:keepNext/>
-              <w:spacing w:line="360" w:lineRule="exact" w:after="40"/>
-              <w:ind w:firstLine="0" w:firstLineChars="0" w:left="0" w:right="0" w:leftChars="0" w:rightChars="0" w:start="0" w:end="0"/>
+              <w:spacing w:line="360" w:lineRule="exact" w:after="40"/>
+              <w:ind w:firstLine="0" w:firstLineChars="0" w:left="0" w:right="0" w:leftChars="0" w:rightChars="0" w:start="0" w:end="0"/>
+              <w:autoSpaceDN w:val="0"/>
+              <w:keepNext/>
+              <w:autoSpaceDE w:val="0"/>
               <w:jc w:val="center"/>
             </w:pPr>
             <w:r>
@@ -5304,9 +5478,11 @@
           </w:tcPr>
           <w:p>
             <w:pPr>
-              <w:keepNext/>
-              <w:spacing w:line="360" w:lineRule="exact" w:after="40"/>
-              <w:ind w:firstLine="0" w:firstLineChars="0" w:left="0" w:right="0" w:leftChars="0" w:rightChars="0" w:start="0" w:end="0"/>
+              <w:spacing w:line="360" w:lineRule="exact" w:after="40"/>
+              <w:ind w:firstLine="0" w:firstLineChars="0" w:left="0" w:right="0" w:leftChars="0" w:rightChars="0" w:start="0" w:end="0"/>
+              <w:autoSpaceDN w:val="0"/>
+              <w:keepNext/>
+              <w:autoSpaceDE w:val="0"/>
               <w:jc w:val="center"/>
             </w:pPr>
             <w:r>
@@ -5337,9 +5513,11 @@
           </w:tcPr>
           <w:p>
             <w:pPr>
-              <w:keepNext/>
-              <w:spacing w:line="360" w:lineRule="exact" w:after="40"/>
-              <w:ind w:firstLine="0" w:firstLineChars="0" w:left="0" w:right="0" w:leftChars="0" w:rightChars="0" w:start="0" w:end="0"/>
+              <w:spacing w:line="360" w:lineRule="exact" w:after="40"/>
+              <w:ind w:firstLine="0" w:firstLineChars="0" w:left="0" w:right="0" w:leftChars="0" w:rightChars="0" w:start="0" w:end="0"/>
+              <w:autoSpaceDN w:val="0"/>
+              <w:keepNext/>
+              <w:autoSpaceDE w:val="0"/>
               <w:jc w:val="left"/>
             </w:pPr>
             <w:r>
@@ -5365,9 +5543,11 @@
           </w:tcPr>
           <w:p>
             <w:pPr>
-              <w:keepNext/>
-              <w:spacing w:line="360" w:lineRule="exact" w:after="40"/>
-              <w:ind w:firstLine="0" w:firstLineChars="0" w:left="0" w:right="0" w:leftChars="0" w:rightChars="0" w:start="0" w:end="0"/>
+              <w:spacing w:line="360" w:lineRule="exact" w:after="40"/>
+              <w:ind w:firstLine="0" w:firstLineChars="0" w:left="0" w:right="0" w:leftChars="0" w:rightChars="0" w:start="0" w:end="0"/>
+              <w:autoSpaceDN w:val="0"/>
+              <w:keepNext/>
+              <w:autoSpaceDE w:val="0"/>
               <w:jc w:val="center"/>
             </w:pPr>
             <w:r>
@@ -5393,9 +5573,11 @@
           </w:tcPr>
           <w:p>
             <w:pPr>
-              <w:keepNext/>
-              <w:spacing w:line="360" w:lineRule="exact" w:after="40"/>
-              <w:ind w:firstLine="0" w:firstLineChars="0" w:left="0" w:right="0" w:leftChars="0" w:rightChars="0" w:start="0" w:end="0"/>
+              <w:spacing w:line="360" w:lineRule="exact" w:after="40"/>
+              <w:ind w:firstLine="0" w:firstLineChars="0" w:left="0" w:right="0" w:leftChars="0" w:rightChars="0" w:start="0" w:end="0"/>
+              <w:autoSpaceDN w:val="0"/>
+              <w:keepNext/>
+              <w:autoSpaceDE w:val="0"/>
               <w:jc w:val="center"/>
             </w:pPr>
             <w:r>
@@ -5421,9 +5603,11 @@
           </w:tcPr>
           <w:p>
             <w:pPr>
-              <w:keepNext/>
-              <w:spacing w:line="360" w:lineRule="exact" w:after="40"/>
-              <w:ind w:firstLine="0" w:firstLineChars="0" w:left="0" w:right="0" w:leftChars="0" w:rightChars="0" w:start="0" w:end="0"/>
+              <w:spacing w:line="360" w:lineRule="exact" w:after="40"/>
+              <w:ind w:firstLine="0" w:firstLineChars="0" w:left="0" w:right="0" w:leftChars="0" w:rightChars="0" w:start="0" w:end="0"/>
+              <w:autoSpaceDN w:val="0"/>
+              <w:keepNext/>
+              <w:autoSpaceDE w:val="0"/>
               <w:jc w:val="center"/>
             </w:pPr>
             <w:r>
@@ -5454,9 +5638,11 @@
           </w:tcPr>
           <w:p>
             <w:pPr>
+              <w:spacing w:line="360" w:lineRule="exact" w:after="40"/>
+              <w:ind w:firstLine="0" w:firstLineChars="0" w:left="0" w:right="0" w:leftChars="0" w:rightChars="0" w:start="0" w:end="0"/>
+              <w:autoSpaceDN w:val="0"/>
               <w:keepNext w:val="0"/>
-              <w:spacing w:line="360" w:lineRule="exact" w:after="40"/>
-              <w:ind w:firstLine="0" w:firstLineChars="0" w:left="0" w:right="0" w:leftChars="0" w:rightChars="0" w:start="0" w:end="0"/>
+              <w:autoSpaceDE w:val="0"/>
               <w:jc w:val="left"/>
             </w:pPr>
             <w:r>
@@ -5482,9 +5668,11 @@
           </w:tcPr>
           <w:p>
             <w:pPr>
+              <w:spacing w:line="360" w:lineRule="exact" w:after="40"/>
+              <w:ind w:firstLine="0" w:firstLineChars="0" w:left="0" w:right="0" w:leftChars="0" w:rightChars="0" w:start="0" w:end="0"/>
+              <w:autoSpaceDN w:val="0"/>
               <w:keepNext w:val="0"/>
-              <w:spacing w:line="360" w:lineRule="exact" w:after="40"/>
-              <w:ind w:firstLine="0" w:firstLineChars="0" w:left="0" w:right="0" w:leftChars="0" w:rightChars="0" w:start="0" w:end="0"/>
+              <w:autoSpaceDE w:val="0"/>
               <w:jc w:val="center"/>
             </w:pPr>
             <w:r>
@@ -5510,9 +5698,11 @@
           </w:tcPr>
           <w:p>
             <w:pPr>
+              <w:spacing w:line="360" w:lineRule="exact" w:after="40"/>
+              <w:ind w:firstLine="0" w:firstLineChars="0" w:left="0" w:right="0" w:leftChars="0" w:rightChars="0" w:start="0" w:end="0"/>
+              <w:autoSpaceDN w:val="0"/>
               <w:keepNext w:val="0"/>
-              <w:spacing w:line="360" w:lineRule="exact" w:after="40"/>
-              <w:ind w:firstLine="0" w:firstLineChars="0" w:left="0" w:right="0" w:leftChars="0" w:rightChars="0" w:start="0" w:end="0"/>
+              <w:autoSpaceDE w:val="0"/>
               <w:jc w:val="center"/>
             </w:pPr>
             <w:r>
@@ -5538,9 +5728,11 @@
           </w:tcPr>
           <w:p>
             <w:pPr>
+              <w:spacing w:line="360" w:lineRule="exact" w:after="40"/>
+              <w:ind w:firstLine="0" w:firstLineChars="0" w:left="0" w:right="0" w:leftChars="0" w:rightChars="0" w:start="0" w:end="0"/>
+              <w:autoSpaceDN w:val="0"/>
               <w:keepNext w:val="0"/>
-              <w:spacing w:line="360" w:lineRule="exact" w:after="40"/>
-              <w:ind w:firstLine="0" w:firstLineChars="0" w:left="0" w:right="0" w:leftChars="0" w:rightChars="0" w:start="0" w:end="0"/>
+              <w:autoSpaceDE w:val="0"/>
               <w:jc w:val="center"/>
             </w:pPr>
             <w:r>
@@ -5566,8 +5758,8 @@
         <w:wordWrap/>
         <w:overflowPunct/>
         <w:topLinePunct w:val="0"/>
-        <w:autoSpaceDE/>
-        <w:autoSpaceDN/>
+        <w:autoSpaceDE w:val="0"/>
+        <w:autoSpaceDN w:val="0"/>
         <w:bidi w:val="0"/>
         <w:adjustRightInd/>
         <w:snapToGrid/>
@@ -5647,8 +5839,8 @@
         <w:wordWrap/>
         <w:overflowPunct/>
         <w:topLinePunct w:val="0"/>
-        <w:autoSpaceDE/>
-        <w:autoSpaceDN/>
+        <w:autoSpaceDE w:val="0"/>
+        <w:autoSpaceDN w:val="0"/>
         <w:bidi w:val="0"/>
         <w:adjustRightInd/>
         <w:snapToGrid/>
@@ -5674,7 +5866,7 @@
           <w:szCs w:val="32"/>
           <w:lang w:val="en-US" w:eastAsia="zh-CN" w:bidi="ar"/>
         </w:rPr>
-        <w:t>图6  相邻组间隔、排队时间与最晚返回时刻</w:t>
+        <w:t>图6相邻组间隔、排队时间与最晚返回时刻</w:t>
       </w:r>
     </w:p>
     <w:p>
@@ -5688,8 +5880,8 @@
         <w:wordWrap/>
         <w:overflowPunct/>
         <w:topLinePunct w:val="0"/>
-        <w:autoSpaceDE/>
-        <w:autoSpaceDN/>
+        <w:autoSpaceDE w:val="0"/>
+        <w:autoSpaceDN w:val="0"/>
         <w:bidi w:val="0"/>
         <w:adjustRightInd/>
         <w:snapToGrid/>
@@ -5733,8 +5925,8 @@
         <w:wordWrap/>
         <w:overflowPunct/>
         <w:topLinePunct w:val="0"/>
-        <w:autoSpaceDE/>
-        <w:autoSpaceDN/>
+        <w:autoSpaceDE w:val="0"/>
+        <w:autoSpaceDN w:val="0"/>
         <w:bidi w:val="0"/>
         <w:adjustRightInd/>
         <w:snapToGrid/>
@@ -5778,8 +5970,8 @@
         <w:wordWrap/>
         <w:overflowPunct/>
         <w:topLinePunct w:val="0"/>
-        <w:autoSpaceDE/>
-        <w:autoSpaceDN/>
+        <w:autoSpaceDE w:val="0"/>
+        <w:autoSpaceDN w:val="0"/>
         <w:bidi w:val="0"/>
         <w:adjustRightInd/>
         <w:snapToGrid/>
@@ -5805,7 +5997,7 @@
           <w:szCs w:val="32"/>
           <w:lang w:val="en-US" w:eastAsia="zh-CN" w:bidi="ar"/>
         </w:rPr>
-        <w:t>表5  另一组随机条件下的三种方案复核结果</w:t>
+        <w:t>表5另一组随机条件下的三种方案复核结果</w:t>
       </w:r>
     </w:p>
     <w:tbl>
@@ -5849,9 +6041,11 @@
           </w:tcPr>
           <w:p>
             <w:pPr>
-              <w:keepNext/>
-              <w:spacing w:line="360" w:lineRule="exact" w:after="40"/>
-              <w:ind w:firstLine="0" w:firstLineChars="0" w:left="0" w:right="0" w:leftChars="0" w:rightChars="0" w:start="0" w:end="0"/>
+              <w:spacing w:line="360" w:lineRule="exact" w:after="40"/>
+              <w:ind w:firstLine="0" w:firstLineChars="0" w:left="0" w:right="0" w:leftChars="0" w:rightChars="0" w:start="0" w:end="0"/>
+              <w:autoSpaceDN w:val="0"/>
+              <w:keepNext/>
+              <w:autoSpaceDE w:val="0"/>
               <w:jc w:val="left"/>
             </w:pPr>
             <w:r>
@@ -5879,9 +6073,11 @@
           </w:tcPr>
           <w:p>
             <w:pPr>
-              <w:keepNext/>
-              <w:spacing w:line="360" w:lineRule="exact" w:after="40"/>
-              <w:ind w:firstLine="0" w:firstLineChars="0" w:left="0" w:right="0" w:leftChars="0" w:rightChars="0" w:start="0" w:end="0"/>
+              <w:spacing w:line="360" w:lineRule="exact" w:after="40"/>
+              <w:ind w:firstLine="0" w:firstLineChars="0" w:left="0" w:right="0" w:leftChars="0" w:rightChars="0" w:start="0" w:end="0"/>
+              <w:autoSpaceDN w:val="0"/>
+              <w:keepNext/>
+              <w:autoSpaceDE w:val="0"/>
               <w:jc w:val="center"/>
             </w:pPr>
             <w:r>
@@ -5911,9 +6107,11 @@
           </w:tcPr>
           <w:p>
             <w:pPr>
-              <w:keepNext/>
-              <w:spacing w:line="360" w:lineRule="exact" w:after="40"/>
-              <w:ind w:firstLine="0" w:firstLineChars="0" w:left="0" w:right="0" w:leftChars="0" w:rightChars="0" w:start="0" w:end="0"/>
+              <w:spacing w:line="360" w:lineRule="exact" w:after="40"/>
+              <w:ind w:firstLine="0" w:firstLineChars="0" w:left="0" w:right="0" w:leftChars="0" w:rightChars="0" w:start="0" w:end="0"/>
+              <w:autoSpaceDN w:val="0"/>
+              <w:keepNext/>
+              <w:autoSpaceDE w:val="0"/>
               <w:jc w:val="center"/>
             </w:pPr>
             <w:r>
@@ -5943,9 +6141,11 @@
           </w:tcPr>
           <w:p>
             <w:pPr>
-              <w:keepNext/>
-              <w:spacing w:line="360" w:lineRule="exact" w:after="40"/>
-              <w:ind w:firstLine="0" w:firstLineChars="0" w:left="0" w:right="0" w:leftChars="0" w:rightChars="0" w:start="0" w:end="0"/>
+              <w:spacing w:line="360" w:lineRule="exact" w:after="40"/>
+              <w:ind w:firstLine="0" w:firstLineChars="0" w:left="0" w:right="0" w:leftChars="0" w:rightChars="0" w:start="0" w:end="0"/>
+              <w:autoSpaceDN w:val="0"/>
+              <w:keepNext/>
+              <w:autoSpaceDE w:val="0"/>
               <w:jc w:val="center"/>
             </w:pPr>
             <w:r>
@@ -5977,9 +6177,11 @@
           </w:tcPr>
           <w:p>
             <w:pPr>
-              <w:keepNext/>
-              <w:spacing w:line="360" w:lineRule="exact" w:after="40"/>
-              <w:ind w:firstLine="0" w:firstLineChars="0" w:left="0" w:right="0" w:leftChars="0" w:rightChars="0" w:start="0" w:end="0"/>
+              <w:spacing w:line="360" w:lineRule="exact" w:after="40"/>
+              <w:ind w:firstLine="0" w:firstLineChars="0" w:left="0" w:right="0" w:leftChars="0" w:rightChars="0" w:start="0" w:end="0"/>
+              <w:autoSpaceDN w:val="0"/>
+              <w:keepNext/>
+              <w:autoSpaceDE w:val="0"/>
               <w:jc w:val="left"/>
             </w:pPr>
             <w:r>
@@ -6005,9 +6207,11 @@
           </w:tcPr>
           <w:p>
             <w:pPr>
-              <w:keepNext/>
-              <w:spacing w:line="360" w:lineRule="exact" w:after="40"/>
-              <w:ind w:firstLine="0" w:firstLineChars="0" w:left="0" w:right="0" w:leftChars="0" w:rightChars="0" w:start="0" w:end="0"/>
+              <w:spacing w:line="360" w:lineRule="exact" w:after="40"/>
+              <w:ind w:firstLine="0" w:firstLineChars="0" w:left="0" w:right="0" w:leftChars="0" w:rightChars="0" w:start="0" w:end="0"/>
+              <w:autoSpaceDN w:val="0"/>
+              <w:keepNext/>
+              <w:autoSpaceDE w:val="0"/>
               <w:jc w:val="center"/>
             </w:pPr>
             <w:r>
@@ -6033,9 +6237,11 @@
           </w:tcPr>
           <w:p>
             <w:pPr>
-              <w:keepNext/>
-              <w:spacing w:line="360" w:lineRule="exact" w:after="40"/>
-              <w:ind w:firstLine="0" w:firstLineChars="0" w:left="0" w:right="0" w:leftChars="0" w:rightChars="0" w:start="0" w:end="0"/>
+              <w:spacing w:line="360" w:lineRule="exact" w:after="40"/>
+              <w:ind w:firstLine="0" w:firstLineChars="0" w:left="0" w:right="0" w:leftChars="0" w:rightChars="0" w:start="0" w:end="0"/>
+              <w:autoSpaceDN w:val="0"/>
+              <w:keepNext/>
+              <w:autoSpaceDE w:val="0"/>
               <w:jc w:val="center"/>
             </w:pPr>
             <w:r>
@@ -6061,9 +6267,11 @@
           </w:tcPr>
           <w:p>
             <w:pPr>
-              <w:keepNext/>
-              <w:spacing w:line="360" w:lineRule="exact" w:after="40"/>
-              <w:ind w:firstLine="0" w:firstLineChars="0" w:left="0" w:right="0" w:leftChars="0" w:rightChars="0" w:start="0" w:end="0"/>
+              <w:spacing w:line="360" w:lineRule="exact" w:after="40"/>
+              <w:ind w:firstLine="0" w:firstLineChars="0" w:left="0" w:right="0" w:leftChars="0" w:rightChars="0" w:start="0" w:end="0"/>
+              <w:autoSpaceDN w:val="0"/>
+              <w:keepNext/>
+              <w:autoSpaceDE w:val="0"/>
               <w:jc w:val="center"/>
             </w:pPr>
             <w:r>
@@ -6094,9 +6302,11 @@
           </w:tcPr>
           <w:p>
             <w:pPr>
-              <w:keepNext/>
-              <w:spacing w:line="360" w:lineRule="exact" w:after="40"/>
-              <w:ind w:firstLine="0" w:firstLineChars="0" w:left="0" w:right="0" w:leftChars="0" w:rightChars="0" w:start="0" w:end="0"/>
+              <w:spacing w:line="360" w:lineRule="exact" w:after="40"/>
+              <w:ind w:firstLine="0" w:firstLineChars="0" w:left="0" w:right="0" w:leftChars="0" w:rightChars="0" w:start="0" w:end="0"/>
+              <w:autoSpaceDN w:val="0"/>
+              <w:keepNext/>
+              <w:autoSpaceDE w:val="0"/>
               <w:jc w:val="left"/>
             </w:pPr>
             <w:r>
@@ -6122,9 +6332,11 @@
           </w:tcPr>
           <w:p>
             <w:pPr>
-              <w:keepNext/>
-              <w:spacing w:line="360" w:lineRule="exact" w:after="40"/>
-              <w:ind w:firstLine="0" w:firstLineChars="0" w:left="0" w:right="0" w:leftChars="0" w:rightChars="0" w:start="0" w:end="0"/>
+              <w:spacing w:line="360" w:lineRule="exact" w:after="40"/>
+              <w:ind w:firstLine="0" w:firstLineChars="0" w:left="0" w:right="0" w:leftChars="0" w:rightChars="0" w:start="0" w:end="0"/>
+              <w:autoSpaceDN w:val="0"/>
+              <w:keepNext/>
+              <w:autoSpaceDE w:val="0"/>
               <w:jc w:val="center"/>
             </w:pPr>
             <w:r>
@@ -6150,9 +6362,11 @@
           </w:tcPr>
           <w:p>
             <w:pPr>
-              <w:keepNext/>
-              <w:spacing w:line="360" w:lineRule="exact" w:after="40"/>
-              <w:ind w:firstLine="0" w:firstLineChars="0" w:left="0" w:right="0" w:leftChars="0" w:rightChars="0" w:start="0" w:end="0"/>
+              <w:spacing w:line="360" w:lineRule="exact" w:after="40"/>
+              <w:ind w:firstLine="0" w:firstLineChars="0" w:left="0" w:right="0" w:leftChars="0" w:rightChars="0" w:start="0" w:end="0"/>
+              <w:autoSpaceDN w:val="0"/>
+              <w:keepNext/>
+              <w:autoSpaceDE w:val="0"/>
               <w:jc w:val="center"/>
             </w:pPr>
             <w:r>
@@ -6178,9 +6392,11 @@
           </w:tcPr>
           <w:p>
             <w:pPr>
-              <w:keepNext/>
-              <w:spacing w:line="360" w:lineRule="exact" w:after="40"/>
-              <w:ind w:firstLine="0" w:firstLineChars="0" w:left="0" w:right="0" w:leftChars="0" w:rightChars="0" w:start="0" w:end="0"/>
+              <w:spacing w:line="360" w:lineRule="exact" w:after="40"/>
+              <w:ind w:firstLine="0" w:firstLineChars="0" w:left="0" w:right="0" w:leftChars="0" w:rightChars="0" w:start="0" w:end="0"/>
+              <w:autoSpaceDN w:val="0"/>
+              <w:keepNext/>
+              <w:autoSpaceDE w:val="0"/>
               <w:jc w:val="center"/>
             </w:pPr>
             <w:r>
@@ -6211,9 +6427,11 @@
           </w:tcPr>
           <w:p>
             <w:pPr>
+              <w:spacing w:line="360" w:lineRule="exact" w:after="40"/>
+              <w:ind w:firstLine="0" w:firstLineChars="0" w:left="0" w:right="0" w:leftChars="0" w:rightChars="0" w:start="0" w:end="0"/>
+              <w:autoSpaceDN w:val="0"/>
               <w:keepNext w:val="0"/>
-              <w:spacing w:line="360" w:lineRule="exact" w:after="40"/>
-              <w:ind w:firstLine="0" w:firstLineChars="0" w:left="0" w:right="0" w:leftChars="0" w:rightChars="0" w:start="0" w:end="0"/>
+              <w:autoSpaceDE w:val="0"/>
               <w:jc w:val="left"/>
             </w:pPr>
             <w:r>
@@ -6239,9 +6457,11 @@
           </w:tcPr>
           <w:p>
             <w:pPr>
+              <w:spacing w:line="360" w:lineRule="exact" w:after="40"/>
+              <w:ind w:firstLine="0" w:firstLineChars="0" w:left="0" w:right="0" w:leftChars="0" w:rightChars="0" w:start="0" w:end="0"/>
+              <w:autoSpaceDN w:val="0"/>
               <w:keepNext w:val="0"/>
-              <w:spacing w:line="360" w:lineRule="exact" w:after="40"/>
-              <w:ind w:firstLine="0" w:firstLineChars="0" w:left="0" w:right="0" w:leftChars="0" w:rightChars="0" w:start="0" w:end="0"/>
+              <w:autoSpaceDE w:val="0"/>
               <w:jc w:val="center"/>
             </w:pPr>
             <w:r>
@@ -6267,9 +6487,11 @@
           </w:tcPr>
           <w:p>
             <w:pPr>
+              <w:spacing w:line="360" w:lineRule="exact" w:after="40"/>
+              <w:ind w:firstLine="0" w:firstLineChars="0" w:left="0" w:right="0" w:leftChars="0" w:rightChars="0" w:start="0" w:end="0"/>
+              <w:autoSpaceDN w:val="0"/>
               <w:keepNext w:val="0"/>
-              <w:spacing w:line="360" w:lineRule="exact" w:after="40"/>
-              <w:ind w:firstLine="0" w:firstLineChars="0" w:left="0" w:right="0" w:leftChars="0" w:rightChars="0" w:start="0" w:end="0"/>
+              <w:autoSpaceDE w:val="0"/>
               <w:jc w:val="center"/>
             </w:pPr>
             <w:r>
@@ -6295,9 +6517,11 @@
           </w:tcPr>
           <w:p>
             <w:pPr>
+              <w:spacing w:line="360" w:lineRule="exact" w:after="40"/>
+              <w:ind w:firstLine="0" w:firstLineChars="0" w:left="0" w:right="0" w:leftChars="0" w:rightChars="0" w:start="0" w:end="0"/>
+              <w:autoSpaceDN w:val="0"/>
               <w:keepNext w:val="0"/>
-              <w:spacing w:line="360" w:lineRule="exact" w:after="40"/>
-              <w:ind w:firstLine="0" w:firstLineChars="0" w:left="0" w:right="0" w:leftChars="0" w:rightChars="0" w:start="0" w:end="0"/>
+              <w:autoSpaceDE w:val="0"/>
               <w:jc w:val="center"/>
             </w:pPr>
             <w:r>
@@ -6323,8 +6547,8 @@
         <w:wordWrap/>
         <w:overflowPunct/>
         <w:topLinePunct w:val="0"/>
-        <w:autoSpaceDE/>
-        <w:autoSpaceDN/>
+        <w:autoSpaceDE w:val="0"/>
+        <w:autoSpaceDN w:val="0"/>
         <w:bidi w:val="0"/>
         <w:adjustRightInd/>
         <w:snapToGrid/>
@@ -6363,8 +6587,8 @@
         <w:wordWrap/>
         <w:overflowPunct/>
         <w:topLinePunct w:val="0"/>
-        <w:autoSpaceDE/>
-        <w:autoSpaceDN/>
+        <w:autoSpaceDE w:val="0"/>
+        <w:autoSpaceDN w:val="0"/>
         <w:bidi w:val="0"/>
         <w:adjustRightInd/>
         <w:snapToGrid/>
@@ -6404,8 +6628,8 @@
         <w:wordWrap/>
         <w:overflowPunct/>
         <w:topLinePunct w:val="0"/>
-        <w:autoSpaceDE/>
-        <w:autoSpaceDN/>
+        <w:autoSpaceDE w:val="0"/>
+        <w:autoSpaceDN w:val="0"/>
         <w:bidi w:val="0"/>
         <w:adjustRightInd/>
         <w:snapToGrid/>
@@ -6431,7 +6655,7 @@
           <w:szCs w:val="32"/>
           <w:lang w:val="en-US" w:eastAsia="zh-CN" w:bidi="ar"/>
         </w:rPr>
-        <w:t>表6  最终复核的各年级平均排队时间</w:t>
+        <w:t>表6最终复核的各年级平均排队时间</w:t>
       </w:r>
     </w:p>
     <w:tbl>
@@ -6475,9 +6699,11 @@
           </w:tcPr>
           <w:p>
             <w:pPr>
-              <w:keepNext/>
-              <w:spacing w:line="360" w:lineRule="exact" w:after="40"/>
-              <w:ind w:firstLine="0" w:firstLineChars="0" w:left="0" w:right="0" w:leftChars="0" w:rightChars="0" w:start="0" w:end="0"/>
+              <w:spacing w:line="360" w:lineRule="exact" w:after="40"/>
+              <w:ind w:firstLine="0" w:firstLineChars="0" w:left="0" w:right="0" w:leftChars="0" w:rightChars="0" w:start="0" w:end="0"/>
+              <w:autoSpaceDN w:val="0"/>
+              <w:keepNext/>
+              <w:autoSpaceDE w:val="0"/>
               <w:jc w:val="left"/>
             </w:pPr>
             <w:r>
@@ -6505,9 +6731,11 @@
           </w:tcPr>
           <w:p>
             <w:pPr>
-              <w:keepNext/>
-              <w:spacing w:line="360" w:lineRule="exact" w:after="40"/>
-              <w:ind w:firstLine="0" w:firstLineChars="0" w:left="0" w:right="0" w:leftChars="0" w:rightChars="0" w:start="0" w:end="0"/>
+              <w:spacing w:line="360" w:lineRule="exact" w:after="40"/>
+              <w:ind w:firstLine="0" w:firstLineChars="0" w:left="0" w:right="0" w:leftChars="0" w:rightChars="0" w:start="0" w:end="0"/>
+              <w:autoSpaceDN w:val="0"/>
+              <w:keepNext/>
+              <w:autoSpaceDE w:val="0"/>
               <w:jc w:val="center"/>
             </w:pPr>
             <w:r>
@@ -6537,9 +6765,11 @@
           </w:tcPr>
           <w:p>
             <w:pPr>
-              <w:keepNext/>
-              <w:spacing w:line="360" w:lineRule="exact" w:after="40"/>
-              <w:ind w:firstLine="0" w:firstLineChars="0" w:left="0" w:right="0" w:leftChars="0" w:rightChars="0" w:start="0" w:end="0"/>
+              <w:spacing w:line="360" w:lineRule="exact" w:after="40"/>
+              <w:ind w:firstLine="0" w:firstLineChars="0" w:left="0" w:right="0" w:leftChars="0" w:rightChars="0" w:start="0" w:end="0"/>
+              <w:autoSpaceDN w:val="0"/>
+              <w:keepNext/>
+              <w:autoSpaceDE w:val="0"/>
               <w:jc w:val="center"/>
             </w:pPr>
             <w:r>
@@ -6569,9 +6799,11 @@
           </w:tcPr>
           <w:p>
             <w:pPr>
-              <w:keepNext/>
-              <w:spacing w:line="360" w:lineRule="exact" w:after="40"/>
-              <w:ind w:firstLine="0" w:firstLineChars="0" w:left="0" w:right="0" w:leftChars="0" w:rightChars="0" w:start="0" w:end="0"/>
+              <w:spacing w:line="360" w:lineRule="exact" w:after="40"/>
+              <w:ind w:firstLine="0" w:firstLineChars="0" w:left="0" w:right="0" w:leftChars="0" w:rightChars="0" w:start="0" w:end="0"/>
+              <w:autoSpaceDN w:val="0"/>
+              <w:keepNext/>
+              <w:autoSpaceDE w:val="0"/>
               <w:jc w:val="center"/>
             </w:pPr>
             <w:r>
@@ -6605,9 +6837,11 @@
           </w:tcPr>
           <w:p>
             <w:pPr>
-              <w:keepNext/>
-              <w:spacing w:line="360" w:lineRule="exact" w:after="40"/>
-              <w:ind w:firstLine="0" w:firstLineChars="0" w:left="0" w:right="0" w:leftChars="0" w:rightChars="0" w:start="0" w:end="0"/>
+              <w:spacing w:line="360" w:lineRule="exact" w:after="40"/>
+              <w:ind w:firstLine="0" w:firstLineChars="0" w:left="0" w:right="0" w:leftChars="0" w:rightChars="0" w:start="0" w:end="0"/>
+              <w:autoSpaceDN w:val="0"/>
+              <w:keepNext/>
+              <w:autoSpaceDE w:val="0"/>
               <w:jc w:val="left"/>
             </w:pPr>
             <w:r>
@@ -6633,9 +6867,11 @@
           </w:tcPr>
           <w:p>
             <w:pPr>
-              <w:keepNext/>
-              <w:spacing w:line="360" w:lineRule="exact" w:after="40"/>
-              <w:ind w:firstLine="0" w:firstLineChars="0" w:left="0" w:right="0" w:leftChars="0" w:rightChars="0" w:start="0" w:end="0"/>
+              <w:spacing w:line="360" w:lineRule="exact" w:after="40"/>
+              <w:ind w:firstLine="0" w:firstLineChars="0" w:left="0" w:right="0" w:leftChars="0" w:rightChars="0" w:start="0" w:end="0"/>
+              <w:autoSpaceDN w:val="0"/>
+              <w:keepNext/>
+              <w:autoSpaceDE w:val="0"/>
               <w:jc w:val="center"/>
             </w:pPr>
             <w:r>
@@ -6661,9 +6897,11 @@
           </w:tcPr>
           <w:p>
             <w:pPr>
-              <w:keepNext/>
-              <w:spacing w:line="360" w:lineRule="exact" w:after="40"/>
-              <w:ind w:firstLine="0" w:firstLineChars="0" w:left="0" w:right="0" w:leftChars="0" w:rightChars="0" w:start="0" w:end="0"/>
+              <w:spacing w:line="360" w:lineRule="exact" w:after="40"/>
+              <w:ind w:firstLine="0" w:firstLineChars="0" w:left="0" w:right="0" w:leftChars="0" w:rightChars="0" w:start="0" w:end="0"/>
+              <w:autoSpaceDN w:val="0"/>
+              <w:keepNext/>
+              <w:autoSpaceDE w:val="0"/>
               <w:jc w:val="center"/>
             </w:pPr>
             <w:r>
@@ -6689,9 +6927,11 @@
           </w:tcPr>
           <w:p>
             <w:pPr>
-              <w:keepNext/>
-              <w:spacing w:line="360" w:lineRule="exact" w:after="40"/>
-              <w:ind w:firstLine="0" w:firstLineChars="0" w:left="0" w:right="0" w:leftChars="0" w:rightChars="0" w:start="0" w:end="0"/>
+              <w:spacing w:line="360" w:lineRule="exact" w:after="40"/>
+              <w:ind w:firstLine="0" w:firstLineChars="0" w:left="0" w:right="0" w:leftChars="0" w:rightChars="0" w:start="0" w:end="0"/>
+              <w:autoSpaceDN w:val="0"/>
+              <w:keepNext/>
+              <w:autoSpaceDE w:val="0"/>
               <w:jc w:val="center"/>
             </w:pPr>
             <w:r>
@@ -6722,9 +6962,11 @@
           </w:tcPr>
           <w:p>
             <w:pPr>
-              <w:keepNext/>
-              <w:spacing w:line="360" w:lineRule="exact" w:after="40"/>
-              <w:ind w:firstLine="0" w:firstLineChars="0" w:left="0" w:right="0" w:leftChars="0" w:rightChars="0" w:start="0" w:end="0"/>
+              <w:spacing w:line="360" w:lineRule="exact" w:after="40"/>
+              <w:ind w:firstLine="0" w:firstLineChars="0" w:left="0" w:right="0" w:leftChars="0" w:rightChars="0" w:start="0" w:end="0"/>
+              <w:autoSpaceDN w:val="0"/>
+              <w:keepNext/>
+              <w:autoSpaceDE w:val="0"/>
               <w:jc w:val="left"/>
             </w:pPr>
             <w:r>
@@ -6750,9 +6992,11 @@
           </w:tcPr>
           <w:p>
             <w:pPr>
-              <w:keepNext/>
-              <w:spacing w:line="360" w:lineRule="exact" w:after="40"/>
-              <w:ind w:firstLine="0" w:firstLineChars="0" w:left="0" w:right="0" w:leftChars="0" w:rightChars="0" w:start="0" w:end="0"/>
+              <w:spacing w:line="360" w:lineRule="exact" w:after="40"/>
+              <w:ind w:firstLine="0" w:firstLineChars="0" w:left="0" w:right="0" w:leftChars="0" w:rightChars="0" w:start="0" w:end="0"/>
+              <w:autoSpaceDN w:val="0"/>
+              <w:keepNext/>
+              <w:autoSpaceDE w:val="0"/>
               <w:jc w:val="center"/>
             </w:pPr>
             <w:r>
@@ -6778,9 +7022,11 @@
           </w:tcPr>
           <w:p>
             <w:pPr>
-              <w:keepNext/>
-              <w:spacing w:line="360" w:lineRule="exact" w:after="40"/>
-              <w:ind w:firstLine="0" w:firstLineChars="0" w:left="0" w:right="0" w:leftChars="0" w:rightChars="0" w:start="0" w:end="0"/>
+              <w:spacing w:line="360" w:lineRule="exact" w:after="40"/>
+              <w:ind w:firstLine="0" w:firstLineChars="0" w:left="0" w:right="0" w:leftChars="0" w:rightChars="0" w:start="0" w:end="0"/>
+              <w:autoSpaceDN w:val="0"/>
+              <w:keepNext/>
+              <w:autoSpaceDE w:val="0"/>
               <w:jc w:val="center"/>
             </w:pPr>
             <w:r>
@@ -6806,9 +7052,11 @@
           </w:tcPr>
           <w:p>
             <w:pPr>
-              <w:keepNext/>
-              <w:spacing w:line="360" w:lineRule="exact" w:after="40"/>
-              <w:ind w:firstLine="0" w:firstLineChars="0" w:left="0" w:right="0" w:leftChars="0" w:rightChars="0" w:start="0" w:end="0"/>
+              <w:spacing w:line="360" w:lineRule="exact" w:after="40"/>
+              <w:ind w:firstLine="0" w:firstLineChars="0" w:left="0" w:right="0" w:leftChars="0" w:rightChars="0" w:start="0" w:end="0"/>
+              <w:autoSpaceDN w:val="0"/>
+              <w:keepNext/>
+              <w:autoSpaceDE w:val="0"/>
               <w:jc w:val="center"/>
             </w:pPr>
             <w:r>
@@ -6839,9 +7087,11 @@
           </w:tcPr>
           <w:p>
             <w:pPr>
+              <w:spacing w:line="360" w:lineRule="exact" w:after="40"/>
+              <w:ind w:firstLine="0" w:firstLineChars="0" w:left="0" w:right="0" w:leftChars="0" w:rightChars="0" w:start="0" w:end="0"/>
+              <w:autoSpaceDN w:val="0"/>
               <w:keepNext w:val="0"/>
-              <w:spacing w:line="360" w:lineRule="exact" w:after="40"/>
-              <w:ind w:firstLine="0" w:firstLineChars="0" w:left="0" w:right="0" w:leftChars="0" w:rightChars="0" w:start="0" w:end="0"/>
+              <w:autoSpaceDE w:val="0"/>
               <w:jc w:val="left"/>
             </w:pPr>
             <w:r>
@@ -6867,9 +7117,11 @@
           </w:tcPr>
           <w:p>
             <w:pPr>
+              <w:spacing w:line="360" w:lineRule="exact" w:after="40"/>
+              <w:ind w:firstLine="0" w:firstLineChars="0" w:left="0" w:right="0" w:leftChars="0" w:rightChars="0" w:start="0" w:end="0"/>
+              <w:autoSpaceDN w:val="0"/>
               <w:keepNext w:val="0"/>
-              <w:spacing w:line="360" w:lineRule="exact" w:after="40"/>
-              <w:ind w:firstLine="0" w:firstLineChars="0" w:left="0" w:right="0" w:leftChars="0" w:rightChars="0" w:start="0" w:end="0"/>
+              <w:autoSpaceDE w:val="0"/>
               <w:jc w:val="center"/>
             </w:pPr>
             <w:r>
@@ -6895,9 +7147,11 @@
           </w:tcPr>
           <w:p>
             <w:pPr>
+              <w:spacing w:line="360" w:lineRule="exact" w:after="40"/>
+              <w:ind w:firstLine="0" w:firstLineChars="0" w:left="0" w:right="0" w:leftChars="0" w:rightChars="0" w:start="0" w:end="0"/>
+              <w:autoSpaceDN w:val="0"/>
               <w:keepNext w:val="0"/>
-              <w:spacing w:line="360" w:lineRule="exact" w:after="40"/>
-              <w:ind w:firstLine="0" w:firstLineChars="0" w:left="0" w:right="0" w:leftChars="0" w:rightChars="0" w:start="0" w:end="0"/>
+              <w:autoSpaceDE w:val="0"/>
               <w:jc w:val="center"/>
             </w:pPr>
             <w:r>
@@ -6923,9 +7177,11 @@
           </w:tcPr>
           <w:p>
             <w:pPr>
+              <w:spacing w:line="360" w:lineRule="exact" w:after="40"/>
+              <w:ind w:firstLine="0" w:firstLineChars="0" w:left="0" w:right="0" w:leftChars="0" w:rightChars="0" w:start="0" w:end="0"/>
+              <w:autoSpaceDN w:val="0"/>
               <w:keepNext w:val="0"/>
-              <w:spacing w:line="360" w:lineRule="exact" w:after="40"/>
-              <w:ind w:firstLine="0" w:firstLineChars="0" w:left="0" w:right="0" w:leftChars="0" w:rightChars="0" w:start="0" w:end="0"/>
+              <w:autoSpaceDE w:val="0"/>
               <w:jc w:val="center"/>
             </w:pPr>
             <w:r>
@@ -6951,8 +7207,8 @@
         <w:wordWrap/>
         <w:overflowPunct/>
         <w:topLinePunct w:val="0"/>
-        <w:autoSpaceDE/>
-        <w:autoSpaceDN/>
+        <w:autoSpaceDE w:val="0"/>
+        <w:autoSpaceDN w:val="0"/>
         <w:bidi w:val="0"/>
         <w:adjustRightInd/>
         <w:snapToGrid/>
@@ -6991,8 +7247,8 @@
         <w:wordWrap/>
         <w:overflowPunct/>
         <w:topLinePunct w:val="0"/>
-        <w:autoSpaceDE/>
-        <w:autoSpaceDN/>
+        <w:autoSpaceDE w:val="0"/>
+        <w:autoSpaceDN w:val="0"/>
         <w:bidi w:val="0"/>
         <w:adjustRightInd/>
         <w:snapToGrid/>
@@ -7032,8 +7288,8 @@
         <w:wordWrap/>
         <w:overflowPunct/>
         <w:topLinePunct w:val="0"/>
-        <w:autoSpaceDE/>
-        <w:autoSpaceDN/>
+        <w:autoSpaceDE w:val="0"/>
+        <w:autoSpaceDN w:val="0"/>
         <w:bidi w:val="0"/>
         <w:adjustRightInd/>
         <w:snapToGrid/>
@@ -7059,7 +7315,7 @@
           <w:szCs w:val="32"/>
           <w:lang w:val="en-US" w:eastAsia="zh-CN" w:bidi="ar"/>
         </w:rPr>
-        <w:t>表7  所选方案前三轮班组出发时刻</w:t>
+        <w:t>表7所选方案前三轮班组出发时刻</w:t>
       </w:r>
     </w:p>
     <w:tbl>
@@ -7103,9 +7359,11 @@
           </w:tcPr>
           <w:p>
             <w:pPr>
-              <w:keepNext/>
-              <w:spacing w:line="360" w:lineRule="exact" w:after="40"/>
-              <w:ind w:firstLine="0" w:firstLineChars="0" w:left="0" w:right="0" w:leftChars="0" w:rightChars="0" w:start="0" w:end="0"/>
+              <w:spacing w:line="360" w:lineRule="exact" w:after="40"/>
+              <w:ind w:firstLine="0" w:firstLineChars="0" w:left="0" w:right="0" w:leftChars="0" w:rightChars="0" w:start="0" w:end="0"/>
+              <w:autoSpaceDN w:val="0"/>
+              <w:keepNext/>
+              <w:autoSpaceDE w:val="0"/>
               <w:jc w:val="left"/>
             </w:pPr>
             <w:r>
@@ -7133,9 +7391,11 @@
           </w:tcPr>
           <w:p>
             <w:pPr>
-              <w:keepNext/>
-              <w:spacing w:line="360" w:lineRule="exact" w:after="40"/>
-              <w:ind w:firstLine="0" w:firstLineChars="0" w:left="0" w:right="0" w:leftChars="0" w:rightChars="0" w:start="0" w:end="0"/>
+              <w:spacing w:line="360" w:lineRule="exact" w:after="40"/>
+              <w:ind w:firstLine="0" w:firstLineChars="0" w:left="0" w:right="0" w:leftChars="0" w:rightChars="0" w:start="0" w:end="0"/>
+              <w:autoSpaceDN w:val="0"/>
+              <w:keepNext/>
+              <w:autoSpaceDE w:val="0"/>
               <w:jc w:val="center"/>
             </w:pPr>
             <w:r>
@@ -7163,9 +7423,11 @@
           </w:tcPr>
           <w:p>
             <w:pPr>
-              <w:keepNext/>
-              <w:spacing w:line="360" w:lineRule="exact" w:after="40"/>
-              <w:ind w:firstLine="0" w:firstLineChars="0" w:left="0" w:right="0" w:leftChars="0" w:rightChars="0" w:start="0" w:end="0"/>
+              <w:spacing w:line="360" w:lineRule="exact" w:after="40"/>
+              <w:ind w:firstLine="0" w:firstLineChars="0" w:left="0" w:right="0" w:leftChars="0" w:rightChars="0" w:start="0" w:end="0"/>
+              <w:autoSpaceDN w:val="0"/>
+              <w:keepNext/>
+              <w:autoSpaceDE w:val="0"/>
               <w:jc w:val="center"/>
             </w:pPr>
             <w:r>
@@ -7193,9 +7455,11 @@
           </w:tcPr>
           <w:p>
             <w:pPr>
-              <w:keepNext/>
-              <w:spacing w:line="360" w:lineRule="exact" w:after="40"/>
-              <w:ind w:firstLine="0" w:firstLineChars="0" w:left="0" w:right="0" w:leftChars="0" w:rightChars="0" w:start="0" w:end="0"/>
+              <w:spacing w:line="360" w:lineRule="exact" w:after="40"/>
+              <w:ind w:firstLine="0" w:firstLineChars="0" w:left="0" w:right="0" w:leftChars="0" w:rightChars="0" w:start="0" w:end="0"/>
+              <w:autoSpaceDN w:val="0"/>
+              <w:keepNext/>
+              <w:autoSpaceDE w:val="0"/>
               <w:jc w:val="center"/>
             </w:pPr>
             <w:r>
@@ -7227,9 +7491,11 @@
           </w:tcPr>
           <w:p>
             <w:pPr>
-              <w:keepNext/>
-              <w:spacing w:line="360" w:lineRule="exact" w:after="40"/>
-              <w:ind w:firstLine="0" w:firstLineChars="0" w:left="0" w:right="0" w:leftChars="0" w:rightChars="0" w:start="0" w:end="0"/>
+              <w:spacing w:line="360" w:lineRule="exact" w:after="40"/>
+              <w:ind w:firstLine="0" w:firstLineChars="0" w:left="0" w:right="0" w:leftChars="0" w:rightChars="0" w:start="0" w:end="0"/>
+              <w:autoSpaceDN w:val="0"/>
+              <w:keepNext/>
+              <w:autoSpaceDE w:val="0"/>
               <w:jc w:val="left"/>
             </w:pPr>
             <w:r>
@@ -7255,9 +7521,11 @@
           </w:tcPr>
           <w:p>
             <w:pPr>
-              <w:keepNext/>
-              <w:spacing w:line="360" w:lineRule="exact" w:after="40"/>
-              <w:ind w:firstLine="0" w:firstLineChars="0" w:left="0" w:right="0" w:leftChars="0" w:rightChars="0" w:start="0" w:end="0"/>
+              <w:spacing w:line="360" w:lineRule="exact" w:after="40"/>
+              <w:ind w:firstLine="0" w:firstLineChars="0" w:left="0" w:right="0" w:leftChars="0" w:rightChars="0" w:start="0" w:end="0"/>
+              <w:autoSpaceDN w:val="0"/>
+              <w:keepNext/>
+              <w:autoSpaceDE w:val="0"/>
               <w:jc w:val="center"/>
             </w:pPr>
             <w:r>
@@ -7283,9 +7551,11 @@
           </w:tcPr>
           <w:p>
             <w:pPr>
-              <w:keepNext/>
-              <w:spacing w:line="360" w:lineRule="exact" w:after="40"/>
-              <w:ind w:firstLine="0" w:firstLineChars="0" w:left="0" w:right="0" w:leftChars="0" w:rightChars="0" w:start="0" w:end="0"/>
+              <w:spacing w:line="360" w:lineRule="exact" w:after="40"/>
+              <w:ind w:firstLine="0" w:firstLineChars="0" w:left="0" w:right="0" w:leftChars="0" w:rightChars="0" w:start="0" w:end="0"/>
+              <w:autoSpaceDN w:val="0"/>
+              <w:keepNext/>
+              <w:autoSpaceDE w:val="0"/>
               <w:jc w:val="center"/>
             </w:pPr>
             <w:r>
@@ -7311,9 +7581,11 @@
           </w:tcPr>
           <w:p>
             <w:pPr>
-              <w:keepNext/>
-              <w:spacing w:line="360" w:lineRule="exact" w:after="40"/>
-              <w:ind w:firstLine="0" w:firstLineChars="0" w:left="0" w:right="0" w:leftChars="0" w:rightChars="0" w:start="0" w:end="0"/>
+              <w:spacing w:line="360" w:lineRule="exact" w:after="40"/>
+              <w:ind w:firstLine="0" w:firstLineChars="0" w:left="0" w:right="0" w:leftChars="0" w:rightChars="0" w:start="0" w:end="0"/>
+              <w:autoSpaceDN w:val="0"/>
+              <w:keepNext/>
+              <w:autoSpaceDE w:val="0"/>
               <w:jc w:val="center"/>
             </w:pPr>
             <w:r>
@@ -7344,9 +7616,11 @@
           </w:tcPr>
           <w:p>
             <w:pPr>
-              <w:keepNext/>
-              <w:spacing w:line="360" w:lineRule="exact" w:after="40"/>
-              <w:ind w:firstLine="0" w:firstLineChars="0" w:left="0" w:right="0" w:leftChars="0" w:rightChars="0" w:start="0" w:end="0"/>
+              <w:spacing w:line="360" w:lineRule="exact" w:after="40"/>
+              <w:ind w:firstLine="0" w:firstLineChars="0" w:left="0" w:right="0" w:leftChars="0" w:rightChars="0" w:start="0" w:end="0"/>
+              <w:autoSpaceDN w:val="0"/>
+              <w:keepNext/>
+              <w:autoSpaceDE w:val="0"/>
               <w:jc w:val="left"/>
             </w:pPr>
             <w:r>
@@ -7372,9 +7646,11 @@
           </w:tcPr>
           <w:p>
             <w:pPr>
-              <w:keepNext/>
-              <w:spacing w:line="360" w:lineRule="exact" w:after="40"/>
-              <w:ind w:firstLine="0" w:firstLineChars="0" w:left="0" w:right="0" w:leftChars="0" w:rightChars="0" w:start="0" w:end="0"/>
+              <w:spacing w:line="360" w:lineRule="exact" w:after="40"/>
+              <w:ind w:firstLine="0" w:firstLineChars="0" w:left="0" w:right="0" w:leftChars="0" w:rightChars="0" w:start="0" w:end="0"/>
+              <w:autoSpaceDN w:val="0"/>
+              <w:keepNext/>
+              <w:autoSpaceDE w:val="0"/>
               <w:jc w:val="center"/>
             </w:pPr>
             <w:r>
@@ -7400,9 +7676,11 @@
           </w:tcPr>
           <w:p>
             <w:pPr>
-              <w:keepNext/>
-              <w:spacing w:line="360" w:lineRule="exact" w:after="40"/>
-              <w:ind w:firstLine="0" w:firstLineChars="0" w:left="0" w:right="0" w:leftChars="0" w:rightChars="0" w:start="0" w:end="0"/>
+              <w:spacing w:line="360" w:lineRule="exact" w:after="40"/>
+              <w:ind w:firstLine="0" w:firstLineChars="0" w:left="0" w:right="0" w:leftChars="0" w:rightChars="0" w:start="0" w:end="0"/>
+              <w:autoSpaceDN w:val="0"/>
+              <w:keepNext/>
+              <w:autoSpaceDE w:val="0"/>
               <w:jc w:val="center"/>
             </w:pPr>
             <w:r>
@@ -7428,9 +7706,11 @@
           </w:tcPr>
           <w:p>
             <w:pPr>
-              <w:keepNext/>
-              <w:spacing w:line="360" w:lineRule="exact" w:after="40"/>
-              <w:ind w:firstLine="0" w:firstLineChars="0" w:left="0" w:right="0" w:leftChars="0" w:rightChars="0" w:start="0" w:end="0"/>
+              <w:spacing w:line="360" w:lineRule="exact" w:after="40"/>
+              <w:ind w:firstLine="0" w:firstLineChars="0" w:left="0" w:right="0" w:leftChars="0" w:rightChars="0" w:start="0" w:end="0"/>
+              <w:autoSpaceDN w:val="0"/>
+              <w:keepNext/>
+              <w:autoSpaceDE w:val="0"/>
               <w:jc w:val="center"/>
             </w:pPr>
             <w:r>
@@ -7461,9 +7741,11 @@
           </w:tcPr>
           <w:p>
             <w:pPr>
+              <w:spacing w:line="360" w:lineRule="exact" w:after="40"/>
+              <w:ind w:firstLine="0" w:firstLineChars="0" w:left="0" w:right="0" w:leftChars="0" w:rightChars="0" w:start="0" w:end="0"/>
+              <w:autoSpaceDN w:val="0"/>
               <w:keepNext w:val="0"/>
-              <w:spacing w:line="360" w:lineRule="exact" w:after="40"/>
-              <w:ind w:firstLine="0" w:firstLineChars="0" w:left="0" w:right="0" w:leftChars="0" w:rightChars="0" w:start="0" w:end="0"/>
+              <w:autoSpaceDE w:val="0"/>
               <w:jc w:val="left"/>
             </w:pPr>
             <w:r>
@@ -7489,9 +7771,11 @@
           </w:tcPr>
           <w:p>
             <w:pPr>
+              <w:spacing w:line="360" w:lineRule="exact" w:after="40"/>
+              <w:ind w:firstLine="0" w:firstLineChars="0" w:left="0" w:right="0" w:leftChars="0" w:rightChars="0" w:start="0" w:end="0"/>
+              <w:autoSpaceDN w:val="0"/>
               <w:keepNext w:val="0"/>
-              <w:spacing w:line="360" w:lineRule="exact" w:after="40"/>
-              <w:ind w:firstLine="0" w:firstLineChars="0" w:left="0" w:right="0" w:leftChars="0" w:rightChars="0" w:start="0" w:end="0"/>
+              <w:autoSpaceDE w:val="0"/>
               <w:jc w:val="center"/>
             </w:pPr>
             <w:r>
@@ -7517,9 +7801,11 @@
           </w:tcPr>
           <w:p>
             <w:pPr>
+              <w:spacing w:line="360" w:lineRule="exact" w:after="40"/>
+              <w:ind w:firstLine="0" w:firstLineChars="0" w:left="0" w:right="0" w:leftChars="0" w:rightChars="0" w:start="0" w:end="0"/>
+              <w:autoSpaceDN w:val="0"/>
               <w:keepNext w:val="0"/>
-              <w:spacing w:line="360" w:lineRule="exact" w:after="40"/>
-              <w:ind w:firstLine="0" w:firstLineChars="0" w:left="0" w:right="0" w:leftChars="0" w:rightChars="0" w:start="0" w:end="0"/>
+              <w:autoSpaceDE w:val="0"/>
               <w:jc w:val="center"/>
             </w:pPr>
             <w:r>
@@ -7545,9 +7831,11 @@
           </w:tcPr>
           <w:p>
             <w:pPr>
+              <w:spacing w:line="360" w:lineRule="exact" w:after="40"/>
+              <w:ind w:firstLine="0" w:firstLineChars="0" w:left="0" w:right="0" w:leftChars="0" w:rightChars="0" w:start="0" w:end="0"/>
+              <w:autoSpaceDN w:val="0"/>
               <w:keepNext w:val="0"/>
-              <w:spacing w:line="360" w:lineRule="exact" w:after="40"/>
-              <w:ind w:firstLine="0" w:firstLineChars="0" w:left="0" w:right="0" w:leftChars="0" w:rightChars="0" w:start="0" w:end="0"/>
+              <w:autoSpaceDE w:val="0"/>
               <w:jc w:val="center"/>
             </w:pPr>
             <w:r>
@@ -7573,8 +7861,8 @@
         <w:wordWrap/>
         <w:overflowPunct/>
         <w:topLinePunct w:val="0"/>
-        <w:autoSpaceDE/>
-        <w:autoSpaceDN/>
+        <w:autoSpaceDE w:val="0"/>
+        <w:autoSpaceDN w:val="0"/>
         <w:bidi w:val="0"/>
         <w:adjustRightInd/>
         <w:snapToGrid/>
@@ -7613,8 +7901,8 @@
         <w:wordWrap/>
         <w:overflowPunct/>
         <w:topLinePunct w:val="0"/>
-        <w:autoSpaceDE/>
-        <w:autoSpaceDN/>
+        <w:autoSpaceDE w:val="0"/>
+        <w:autoSpaceDN w:val="0"/>
         <w:bidi w:val="0"/>
         <w:adjustRightInd/>
         <w:snapToGrid/>
@@ -7658,8 +7946,8 @@
         <w:wordWrap/>
         <w:overflowPunct/>
         <w:topLinePunct w:val="0"/>
-        <w:autoSpaceDE/>
-        <w:autoSpaceDN/>
+        <w:autoSpaceDE w:val="0"/>
+        <w:autoSpaceDN w:val="0"/>
         <w:bidi w:val="0"/>
         <w:adjustRightInd/>
         <w:snapToGrid/>
@@ -7699,8 +7987,8 @@
         <w:wordWrap/>
         <w:overflowPunct/>
         <w:topLinePunct w:val="0"/>
-        <w:autoSpaceDE/>
-        <w:autoSpaceDN/>
+        <w:autoSpaceDE w:val="0"/>
+        <w:autoSpaceDN w:val="0"/>
         <w:bidi w:val="0"/>
         <w:adjustRightInd/>
         <w:snapToGrid/>
@@ -7740,8 +8028,8 @@
         <w:wordWrap/>
         <w:overflowPunct/>
         <w:topLinePunct w:val="0"/>
-        <w:autoSpaceDE/>
-        <w:autoSpaceDN/>
+        <w:autoSpaceDE w:val="0"/>
+        <w:autoSpaceDN w:val="0"/>
         <w:bidi w:val="0"/>
         <w:adjustRightInd/>
         <w:snapToGrid/>
@@ -7785,8 +8073,8 @@
         <w:wordWrap/>
         <w:overflowPunct/>
         <w:topLinePunct w:val="0"/>
-        <w:autoSpaceDE/>
-        <w:autoSpaceDN/>
+        <w:autoSpaceDE w:val="0"/>
+        <w:autoSpaceDN w:val="0"/>
         <w:bidi w:val="0"/>
         <w:adjustRightInd/>
         <w:snapToGrid/>
@@ -7826,8 +8114,8 @@
         <w:wordWrap/>
         <w:overflowPunct/>
         <w:topLinePunct w:val="0"/>
-        <w:autoSpaceDE/>
-        <w:autoSpaceDN/>
+        <w:autoSpaceDE w:val="0"/>
+        <w:autoSpaceDN w:val="0"/>
         <w:bidi w:val="0"/>
         <w:adjustRightInd/>
         <w:snapToGrid/>
@@ -7867,8 +8155,8 @@
         <w:wordWrap/>
         <w:overflowPunct/>
         <w:topLinePunct w:val="0"/>
-        <w:autoSpaceDE/>
-        <w:autoSpaceDN/>
+        <w:autoSpaceDE w:val="0"/>
+        <w:autoSpaceDN w:val="0"/>
         <w:bidi w:val="0"/>
         <w:adjustRightInd/>
         <w:snapToGrid/>
@@ -7908,8 +8196,8 @@
         <w:wordWrap/>
         <w:overflowPunct/>
         <w:topLinePunct w:val="0"/>
-        <w:autoSpaceDE/>
-        <w:autoSpaceDN/>
+        <w:autoSpaceDE w:val="0"/>
+        <w:autoSpaceDN w:val="0"/>
         <w:bidi w:val="0"/>
         <w:adjustRightInd/>
         <w:snapToGrid/>
@@ -7949,8 +8237,8 @@
         <w:wordWrap/>
         <w:overflowPunct/>
         <w:topLinePunct w:val="0"/>
-        <w:autoSpaceDE/>
-        <w:autoSpaceDN/>
+        <w:autoSpaceDE w:val="0"/>
+        <w:autoSpaceDN w:val="0"/>
         <w:bidi w:val="0"/>
         <w:adjustRightInd/>
         <w:snapToGrid/>
@@ -7990,8 +8278,8 @@
         <w:wordWrap/>
         <w:overflowPunct/>
         <w:topLinePunct w:val="0"/>
-        <w:autoSpaceDE/>
-        <w:autoSpaceDN/>
+        <w:autoSpaceDE w:val="0"/>
+        <w:autoSpaceDN w:val="0"/>
         <w:bidi w:val="0"/>
         <w:adjustRightInd/>
         <w:snapToGrid/>
@@ -8031,8 +8319,8 @@
         <w:wordWrap/>
         <w:overflowPunct/>
         <w:topLinePunct w:val="0"/>
-        <w:autoSpaceDE/>
-        <w:autoSpaceDN/>
+        <w:autoSpaceDE w:val="0"/>
+        <w:autoSpaceDN w:val="0"/>
         <w:bidi w:val="0"/>
         <w:adjustRightInd/>
         <w:snapToGrid/>
@@ -8059,47 +8347,6 @@
           <w:lang w:val="en-US" w:eastAsia="zh-CN" w:bidi="ar"/>
         </w:rPr>
         <w:t>推广这套方案的目的，是缩短学生在食堂站队的时间，让学生清楚本班何时前往食堂，从而改善就餐秩序，减少长时间排队带来的烦躁感。应用后，学校可以比较平均排队时间和末批学生返回时刻，也可以通过简短的匿名反馈，了解学生是否觉得等待更短、就餐更有秩序。这样，方案的效果既有时间记录可查，也能从学生每天的就餐感受中得到检验。</w:t>
-      </w:r>
-    </w:p>
-    <w:p>
-      <w:pPr>
-        <w:keepNext w:val="0"/>
-        <w:keepLines w:val="0"/>
-        <w:pageBreakBefore w:val="0"/>
-        <w:widowControl/>
-        <w:suppressLineNumbers w:val="0"/>
-        <w:kinsoku/>
-        <w:wordWrap/>
-        <w:overflowPunct/>
-        <w:topLinePunct w:val="0"/>
-        <w:autoSpaceDE/>
-        <w:autoSpaceDN/>
-        <w:bidi w:val="0"/>
-        <w:adjustRightInd/>
-        <w:snapToGrid/>
-        <w:spacing w:line="400" w:lineRule="exact"/>
-        <w:ind w:firstLine="632" w:firstLineChars="200"/>
-        <w:jc w:val="both"/>
-        <w:textAlignment w:val="auto"/>
-        <w:rPr>
-          <w:rFonts w:hint="eastAsia" w:ascii="Times New Roman" w:hAnsi="Times New Roman" w:eastAsia="仿宋" w:cs="仿宋"/>
-          <w:color w:val="000000"/>
-          <w:kern w:val="0"/>
-          <w:sz w:val="32"/>
-          <w:szCs w:val="32"/>
-          <w:lang w:val="en-US" w:eastAsia="zh-CN" w:bidi="ar"/>
-        </w:rPr>
-      </w:pPr>
-      <w:r>
-        <w:rPr>
-          <w:rFonts w:hint="eastAsia" w:ascii="Times New Roman" w:hAnsi="Times New Roman" w:eastAsia="仿宋" w:cs="仿宋"/>
-          <w:color w:val="000000"/>
-          <w:kern w:val="0"/>
-          <w:sz w:val="24"/>
-          <w:szCs w:val="32"/>
-          <w:lang w:val="en-US" w:eastAsia="zh-CN" w:bidi="ar"/>
-        </w:rPr>
-        <w:t>程序、绘图和文字整理使用AI辅助，记录另附。</w:t>
       </w:r>
     </w:p>
     <w:sectPr>

</xml_diff>

<commit_message>
Update report with software chart and self-study suggestion
</commit_message>
<xml_diff>
--- a/data/report.docx
+++ b/data/report.docx
@@ -3611,7 +3611,7 @@
       <w:r>
         <w:drawing>
           <wp:inline xmlns:a="http://schemas.openxmlformats.org/drawingml/2006/main" xmlns:pic="http://schemas.openxmlformats.org/drawingml/2006/picture">
-            <wp:extent cx="5472000" cy="2736000"/>
+            <wp:extent cx="5472000" cy="1809638"/>
             <wp:docPr id="5" name="Picture 5"/>
             <wp:cNvGraphicFramePr>
               <a:graphicFrameLocks noChangeAspect="1"/>
@@ -3620,7 +3620,7 @@
               <a:graphicData uri="http://schemas.openxmlformats.org/drawingml/2006/picture">
                 <pic:pic>
                   <pic:nvPicPr>
-                    <pic:cNvPr id="0" name="20-three-arrangements.png"/>
+                    <pic:cNvPr id="0" name="23-software-comparison.png"/>
                     <pic:cNvPicPr/>
                   </pic:nvPicPr>
                   <pic:blipFill>
@@ -3632,7 +3632,7 @@
                   <pic:spPr>
                     <a:xfrm>
                       <a:off x="0" y="0"/>
-                      <a:ext cx="5472000" cy="2736000"/>
+                      <a:ext cx="5472000" cy="1809638"/>
                     </a:xfrm>
                     <a:prstGeom prst="rect"/>
                   </pic:spPr>
@@ -3681,7 +3681,7 @@
           <w:szCs w:val="32"/>
           <w:lang w:val="en-US" w:eastAsia="zh-CN" w:bidi="ar"/>
         </w:rPr>
-        <w:t>图5三种初始安排的平均排队时间与完整用时</w:t>
+        <w:t>图5软件中三种初始安排的平均排队时间比较</w:t>
       </w:r>
     </w:p>
     <w:p>
@@ -3722,14 +3722,14 @@
           <w:szCs w:val="32"/>
           <w:lang w:val="en-US" w:eastAsia="zh-CN" w:bidi="ar"/>
         </w:rPr>
-        <w:t>初步比较结果表明，不实行错峰时，学生平均排队15.29分钟；仅按年级错峰时，平均排队5.09分钟；按年级和班级共同安排出发时刻后，平均排队1.15分钟。年级错峰先错开了三个年级的到达时间，班级错峰又进一步减少了同一时段到达的学生人数，因此窗口前的队伍更短。图中横向细线表示30次计算中平均排队时间的最小值到最大值。</w:t>
+        <w:t>初步比较结果表明，不实行错峰时，学生平均排队15.29分钟；仅按年级错峰时，平均排队5.09分钟；按年级和班级共同安排出发时刻后，平均排队1.15分钟。年级错峰先错开了三个年级的到达时间，班级错峰又进一步减少了同一时段到达的学生人数，因此窗口前的队伍更短。</w:t>
       </w:r>
     </w:p>
     <w:p>
       <w:pPr>
         <w:keepNext/>
         <w:keepLines w:val="0"/>
-        <w:pageBreakBefore w:val="0"/>
+        <w:pageBreakBefore/>
         <w:widowControl/>
         <w:numPr>
           <w:ilvl w:val="0"/>
@@ -6614,7 +6614,7 @@
           <w:szCs w:val="32"/>
           <w:lang w:val="en-US" w:eastAsia="zh-CN" w:bidi="ar"/>
         </w:rPr>
-        <w:t>重新计算后，仅按年级错峰时，学生平均排队5.05分钟；年级与班级结合错峰时，平均排队0.54分钟。两者相比，平均排队时间减少4.51分钟，约减少89.4%，平均完整用时增加3.31分钟。这是因为部分班级需要更晚出发：学生在食堂站队的时间缩短了，在教室等待出发的时间却增加了，返回教室的平均时刻也随之推后。</w:t>
+        <w:t>重新计算后，仅按年级错峰时，学生平均排队5.05分钟；年级与班级结合错峰时，平均排队0.54分钟。两者相比，平均排队时间减少4.51分钟，约减少89.4%，平均完整用时增加3.31分钟。这是因为部分班级需要更晚出发：学生在食堂站队的时间缩短了，在教室等待出发的时间却增加了，返回教室的平均时刻也随之推后。学生可以利用等待出发的时间安排自习，提高学习效率。</w:t>
       </w:r>
     </w:p>
     <w:p>

</xml_diff>

<commit_message>
Update report with illustrated school usage and rollout guide
</commit_message>
<xml_diff>
--- a/data/report.docx
+++ b/data/report.docx
@@ -677,7 +677,7 @@
           <w:szCs w:val="32"/>
           <w:lang w:val="en-US" w:eastAsia="zh-CN" w:bidi="ar"/>
         </w:rPr>
-        <w:t>图1学生就餐流程与时间记录环节</w:t>
+        <w:t>图1 学生就餐流程与时间记录环节</w:t>
       </w:r>
     </w:p>
     <w:p>
@@ -853,7 +853,7 @@
           <w:szCs w:val="32"/>
           <w:lang w:val="en-US" w:eastAsia="zh-CN" w:bidi="ar"/>
         </w:rPr>
-        <w:t>表1三种方案共同采用的参数</w:t>
+        <w:t>表1 三种方案共同采用的参数</w:t>
       </w:r>
     </w:p>
     <w:tbl>
@@ -1654,7 +1654,7 @@
           <w:szCs w:val="32"/>
           <w:lang w:val="en-US" w:eastAsia="zh-CN" w:bidi="ar"/>
         </w:rPr>
-        <w:t>图2软件方案选择与参数设置页面</w:t>
+        <w:t>图2 软件方案选择与参数设置页面</w:t>
       </w:r>
     </w:p>
     <w:p>
@@ -1777,7 +1777,7 @@
           <w:szCs w:val="32"/>
           <w:lang w:val="en-US" w:eastAsia="zh-CN" w:bidi="ar"/>
         </w:rPr>
-        <w:t>图3软件三维就餐回放场景</w:t>
+        <w:t>图3 软件三维就餐回放场景</w:t>
       </w:r>
     </w:p>
     <w:p>
@@ -2441,7 +2441,7 @@
           <w:szCs w:val="32"/>
           <w:lang w:val="en-US" w:eastAsia="zh-CN" w:bidi="ar"/>
         </w:rPr>
-        <w:t>图4窗口预计取餐耗时比较</w:t>
+        <w:t>图4 窗口预计取餐耗时比较</w:t>
       </w:r>
     </w:p>
     <w:p>
@@ -2613,7 +2613,7 @@
           <w:szCs w:val="32"/>
           <w:lang w:val="en-US" w:eastAsia="zh-CN" w:bidi="ar"/>
         </w:rPr>
-        <w:t>表2三种方案的初始出发规则</w:t>
+        <w:t>表2 三种方案的初始出发规则</w:t>
       </w:r>
     </w:p>
     <w:tbl>
@@ -3021,7 +3021,7 @@
           <w:szCs w:val="32"/>
           <w:lang w:val="en-US" w:eastAsia="zh-CN" w:bidi="ar"/>
         </w:rPr>
-        <w:t>表3三种初始方案各计算30次的平均结果</w:t>
+        <w:t>表3 三种初始方案各计算30次的平均结果</w:t>
       </w:r>
     </w:p>
     <w:tbl>
@@ -3681,7 +3681,7 @@
           <w:szCs w:val="32"/>
           <w:lang w:val="en-US" w:eastAsia="zh-CN" w:bidi="ar"/>
         </w:rPr>
-        <w:t>图5软件中三种初始安排的平均排队时间比较</w:t>
+        <w:t>图5 软件中三种初始安排的平均排队时间比较</w:t>
       </w:r>
     </w:p>
     <w:p>
@@ -3956,7 +3956,7 @@
           <w:szCs w:val="32"/>
           <w:lang w:val="en-US" w:eastAsia="zh-CN" w:bidi="ar"/>
         </w:rPr>
-        <w:t>表4不同相邻组间隔各计算30次的结果</w:t>
+        <w:t>表4 不同相邻组间隔各计算30次的结果</w:t>
       </w:r>
     </w:p>
     <w:tbl>
@@ -5866,7 +5866,7 @@
           <w:szCs w:val="32"/>
           <w:lang w:val="en-US" w:eastAsia="zh-CN" w:bidi="ar"/>
         </w:rPr>
-        <w:t>图6相邻组间隔、排队时间与最晚返回时刻</w:t>
+        <w:t>图6 相邻组间隔、排队时间与最晚返回时刻</w:t>
       </w:r>
     </w:p>
     <w:p>
@@ -5997,7 +5997,7 @@
           <w:szCs w:val="32"/>
           <w:lang w:val="en-US" w:eastAsia="zh-CN" w:bidi="ar"/>
         </w:rPr>
-        <w:t>表5另一组随机条件下的三种方案复核结果</w:t>
+        <w:t>表5 另一组随机条件下的三种方案复核结果</w:t>
       </w:r>
     </w:p>
     <w:tbl>
@@ -6655,7 +6655,7 @@
           <w:szCs w:val="32"/>
           <w:lang w:val="en-US" w:eastAsia="zh-CN" w:bidi="ar"/>
         </w:rPr>
-        <w:t>表6最终复核的各年级平均排队时间</w:t>
+        <w:t>表6 最终复核的各年级平均排队时间</w:t>
       </w:r>
     </w:p>
     <w:tbl>
@@ -7315,7 +7315,7 @@
           <w:szCs w:val="32"/>
           <w:lang w:val="en-US" w:eastAsia="zh-CN" w:bidi="ar"/>
         </w:rPr>
-        <w:t>表7所选方案前三轮班组出发时刻</w:t>
+        <w:t>表7 所选方案前三轮班组出发时刻</w:t>
       </w:r>
     </w:p>
     <w:tbl>
@@ -8100,7 +8100,7 @@
           <w:szCs w:val="32"/>
           <w:lang w:val="en-US" w:eastAsia="zh-CN" w:bidi="ar"/>
         </w:rPr>
-        <w:t>七、总结、应用和推广</w:t>
+        <w:t>七、总结</w:t>
       </w:r>
     </w:p>
     <w:p>
@@ -8228,6 +8228,51 @@
     </w:p>
     <w:p>
       <w:pPr>
+        <w:keepNext/>
+        <w:keepLines w:val="0"/>
+        <w:pageBreakBefore w:val="0"/>
+        <w:widowControl/>
+        <w:numPr>
+          <w:ilvl w:val="0"/>
+          <w:numId w:val="0"/>
+        </w:numPr>
+        <w:suppressLineNumbers w:val="0"/>
+        <w:kinsoku/>
+        <w:wordWrap/>
+        <w:overflowPunct/>
+        <w:topLinePunct w:val="0"/>
+        <w:autoSpaceDE w:val="0"/>
+        <w:autoSpaceDN w:val="0"/>
+        <w:bidi w:val="0"/>
+        <w:adjustRightInd/>
+        <w:snapToGrid/>
+        <w:spacing w:line="560" w:lineRule="exact"/>
+        <w:ind w:firstLine="632" w:firstLineChars="200"/>
+        <w:jc w:val="both"/>
+        <w:textAlignment w:val="auto"/>
+        <w:rPr>
+          <w:rFonts w:hint="eastAsia" w:ascii="黑体" w:hAnsi="宋体" w:eastAsia="黑体" w:cs="黑体"/>
+          <w:color w:val="000000"/>
+          <w:kern w:val="0"/>
+          <w:sz w:val="32"/>
+          <w:szCs w:val="32"/>
+          <w:lang w:val="en-US" w:eastAsia="zh-CN" w:bidi="ar"/>
+        </w:rPr>
+      </w:pPr>
+      <w:r>
+        <w:rPr>
+          <w:rFonts w:hint="eastAsia" w:ascii="黑体" w:hAnsi="宋体" w:eastAsia="黑体" w:cs="黑体"/>
+          <w:color w:val="000000"/>
+          <w:kern w:val="0"/>
+          <w:sz w:val="32"/>
+          <w:szCs w:val="32"/>
+          <w:lang w:val="en-US" w:eastAsia="zh-CN" w:bidi="ar"/>
+        </w:rPr>
+        <w:t>八、推广与使用方法</w:t>
+      </w:r>
+    </w:p>
+    <w:p>
+      <w:pPr>
         <w:keepNext w:val="0"/>
         <w:keepLines w:val="0"/>
         <w:pageBreakBefore w:val="0"/>
@@ -8264,7 +8309,56 @@
           <w:szCs w:val="32"/>
           <w:lang w:val="en-US" w:eastAsia="zh-CN" w:bidi="ar"/>
         </w:rPr>
-        <w:t>全国各高中可通过公开网页或Windows软件使用这套工具。学校先填入本校各年级和各班人数、开放窗口数量、平均打饭时间及座位数量，再设置允许出发的时刻和返回教室的最晚时刻。填好后，就能比较三种安排，选择出发间隔，并导出班级放行表。这些参数都能在页面中修改，不需要学校重新编写程序。规模较大的学校可先选一个相对独立的供餐区域，按照该区域的实际条件进行比较。</w:t>
+        <w:t>全国各高中可通过公开网页或Windows软件使用这套工具。学校只需填入本校的就餐人数和食堂条件，就能比较不同的就餐方案，并生成班级放行表。下面按照实际操作顺序，说明从打开软件到安排各班出发的方法。</w:t>
+      </w:r>
+    </w:p>
+    <w:p>
+      <w:pPr>
+        <w:keepNext/>
+        <w:keepLines w:val="0"/>
+        <w:pageBreakBefore w:val="0"/>
+        <w:widowControl/>
+        <w:numPr>
+          <w:ilvl w:val="0"/>
+          <w:numId w:val="0"/>
+        </w:numPr>
+        <w:suppressLineNumbers w:val="0"/>
+        <w:kinsoku/>
+        <w:wordWrap/>
+        <w:overflowPunct/>
+        <w:topLinePunct w:val="0"/>
+        <w:autoSpaceDE w:val="0"/>
+        <w:autoSpaceDN w:val="0"/>
+        <w:bidi w:val="0"/>
+        <w:adjustRightInd/>
+        <w:snapToGrid/>
+        <w:spacing w:line="560" w:lineRule="exact"/>
+        <w:ind w:firstLine="632" w:firstLineChars="200"/>
+        <w:jc w:val="both"/>
+        <w:textAlignment w:val="auto"/>
+        <w:rPr>
+          <w:rFonts w:hint="eastAsia" w:ascii="仿宋_GB2312" w:hAnsi="仿宋_GB2312" w:eastAsia="仿宋_GB2312" w:cs="仿宋_GB2312"/>
+          <w:b/>
+          <w:bCs/>
+          <w:color w:val="000000"/>
+          <w:kern w:val="0"/>
+          <w:sz w:val="32"/>
+          <w:szCs w:val="31"/>
+          <w:lang w:val="en-US" w:eastAsia="zh-CN" w:bidi="ar"/>
+        </w:rPr>
+      </w:pPr>
+      <w:r>
+        <w:rPr>
+          <w:rFonts w:hint="eastAsia" w:ascii="楷体" w:hAnsi="楷体" w:eastAsia="楷体" w:cs="楷体"/>
+          <w:b/>
+          <w:bCs/>
+          <w:color w:val="000000"/>
+          <w:kern w:val="0"/>
+          <w:sz w:val="32"/>
+          <w:szCs w:val="31"/>
+          <w:lang w:val="en-US" w:eastAsia="zh-CN" w:bidi="ar"/>
+        </w:rPr>
+        <w:t>（一）打开软件，选择就餐方案</w:t>
       </w:r>
     </w:p>
     <w:p>
@@ -8305,7 +8399,7 @@
           <w:szCs w:val="32"/>
           <w:lang w:val="en-US" w:eastAsia="zh-CN" w:bidi="ar"/>
         </w:rPr>
-        <w:t>推广时，可将软件、使用指南、空白记录表和示例结果一起提供给学校。年级教师和食堂工作人员共同商定各班的出发时刻后，将放行表张贴在班级，或通过校内通知发布。各班按表依次前往食堂，再根据每天记录的排队时间和末批学生返回时刻调整间隔，使安排更符合本校的实际情况。</w:t>
+        <w:t>联网使用时，在浏览器中打开公开网页即可。使用Windows版时，先将软件包完整解压，再双击“启动软件.cmd”，也可以打开DiningLab文件夹中的DiningLab.exe。两种方式使用相同的计算代码；Windows版可在断网时使用。</w:t>
       </w:r>
     </w:p>
     <w:p>
@@ -8346,7 +8440,777 @@
           <w:szCs w:val="32"/>
           <w:lang w:val="en-US" w:eastAsia="zh-CN" w:bidi="ar"/>
         </w:rPr>
-        <w:t>推广这套方案的目的，是缩短学生在食堂站队的时间，让学生清楚本班何时前往食堂，从而改善就餐秩序，减少长时间排队带来的烦躁感。应用后，学校可以比较平均排队时间和末批学生返回时刻，也可以通过简短的匿名反馈，了解学生是否觉得等待更短、就餐更有秩序。这样，方案的效果既有时间记录可查，也能从学生每天的就餐感受中得到检验。</w:t>
+        <w:t>进入“选择方案”页面后，可选择不实行错峰、仅按年级错峰或年级与班级结合错峰。软件默认选择第三种。页面中的人数、窗口和座位均可修改，学校可先按照现行安排填写，再尝试调整后的方案。</w:t>
+      </w:r>
+    </w:p>
+    <w:p>
+      <w:pPr>
+        <w:keepNext/>
+        <w:keepLines w:val="0"/>
+        <w:pageBreakBefore w:val="0"/>
+        <w:widowControl/>
+        <w:numPr>
+          <w:ilvl w:val="0"/>
+          <w:numId w:val="0"/>
+        </w:numPr>
+        <w:suppressLineNumbers w:val="0"/>
+        <w:kinsoku/>
+        <w:wordWrap/>
+        <w:overflowPunct/>
+        <w:topLinePunct w:val="0"/>
+        <w:autoSpaceDE w:val="0"/>
+        <w:autoSpaceDN w:val="0"/>
+        <w:bidi w:val="0"/>
+        <w:adjustRightInd/>
+        <w:snapToGrid/>
+        <w:spacing w:line="560" w:lineRule="exact"/>
+        <w:ind w:firstLine="632" w:firstLineChars="200"/>
+        <w:jc w:val="both"/>
+        <w:textAlignment w:val="auto"/>
+        <w:rPr>
+          <w:rFonts w:hint="eastAsia" w:ascii="仿宋_GB2312" w:hAnsi="仿宋_GB2312" w:eastAsia="仿宋_GB2312" w:cs="仿宋_GB2312"/>
+          <w:b/>
+          <w:bCs/>
+          <w:color w:val="000000"/>
+          <w:kern w:val="0"/>
+          <w:sz w:val="32"/>
+          <w:szCs w:val="31"/>
+          <w:lang w:val="en-US" w:eastAsia="zh-CN" w:bidi="ar"/>
+        </w:rPr>
+      </w:pPr>
+      <w:r>
+        <w:rPr>
+          <w:rFonts w:hint="eastAsia" w:ascii="楷体" w:hAnsi="楷体" w:eastAsia="楷体" w:cs="楷体"/>
+          <w:b/>
+          <w:bCs/>
+          <w:color w:val="000000"/>
+          <w:kern w:val="0"/>
+          <w:sz w:val="32"/>
+          <w:szCs w:val="31"/>
+          <w:lang w:val="en-US" w:eastAsia="zh-CN" w:bidi="ar"/>
+        </w:rPr>
+        <w:t>（二）填写本校人数和食堂参数</w:t>
+      </w:r>
+    </w:p>
+    <w:p>
+      <w:pPr>
+        <w:keepNext w:val="0"/>
+        <w:keepLines w:val="0"/>
+        <w:pageBreakBefore w:val="0"/>
+        <w:widowControl/>
+        <w:suppressLineNumbers w:val="0"/>
+        <w:kinsoku/>
+        <w:wordWrap/>
+        <w:overflowPunct/>
+        <w:topLinePunct w:val="0"/>
+        <w:autoSpaceDE w:val="0"/>
+        <w:autoSpaceDN w:val="0"/>
+        <w:bidi w:val="0"/>
+        <w:adjustRightInd/>
+        <w:snapToGrid/>
+        <w:spacing w:line="560" w:lineRule="exact"/>
+        <w:ind w:firstLine="632" w:firstLineChars="200"/>
+        <w:jc w:val="both"/>
+        <w:textAlignment w:val="auto"/>
+        <w:rPr>
+          <w:rFonts w:hint="eastAsia" w:ascii="Times New Roman" w:hAnsi="Times New Roman" w:eastAsia="仿宋" w:cs="仿宋"/>
+          <w:color w:val="000000"/>
+          <w:kern w:val="0"/>
+          <w:sz w:val="32"/>
+          <w:szCs w:val="32"/>
+          <w:lang w:val="en-US" w:eastAsia="zh-CN" w:bidi="ar"/>
+        </w:rPr>
+      </w:pPr>
+      <w:r>
+        <w:rPr>
+          <w:rFonts w:hint="eastAsia" w:ascii="Times New Roman" w:hAnsi="Times New Roman" w:eastAsia="仿宋" w:cs="仿宋"/>
+          <w:color w:val="000000"/>
+          <w:kern w:val="0"/>
+          <w:sz w:val="32"/>
+          <w:szCs w:val="32"/>
+          <w:lang w:val="en-US" w:eastAsia="zh-CN" w:bidi="ar"/>
+        </w:rPr>
+        <w:t>在“参数设置”中，分别填写高一、高二和高三的就餐人数、班级数，以及开放窗口数量、可用座位数量和平均打饭时间。随后填写允许开始出发的时刻、返回教室的最晚时刻和相邻组出发间隔。拖动下方的年级色块，可以调整三个年级的先后顺序，页面位置见图2。</w:t>
+      </w:r>
+    </w:p>
+    <w:p>
+      <w:pPr>
+        <w:keepNext w:val="0"/>
+        <w:keepLines w:val="0"/>
+        <w:pageBreakBefore w:val="0"/>
+        <w:widowControl/>
+        <w:suppressLineNumbers w:val="0"/>
+        <w:kinsoku/>
+        <w:wordWrap/>
+        <w:overflowPunct/>
+        <w:topLinePunct w:val="0"/>
+        <w:autoSpaceDE w:val="0"/>
+        <w:autoSpaceDN w:val="0"/>
+        <w:bidi w:val="0"/>
+        <w:adjustRightInd/>
+        <w:snapToGrid/>
+        <w:spacing w:line="560" w:lineRule="exact"/>
+        <w:ind w:firstLine="632" w:firstLineChars="200"/>
+        <w:jc w:val="both"/>
+        <w:textAlignment w:val="auto"/>
+        <w:rPr>
+          <w:rFonts w:hint="eastAsia" w:ascii="Times New Roman" w:hAnsi="Times New Roman" w:eastAsia="仿宋" w:cs="仿宋"/>
+          <w:color w:val="000000"/>
+          <w:kern w:val="0"/>
+          <w:sz w:val="32"/>
+          <w:szCs w:val="32"/>
+          <w:lang w:val="en-US" w:eastAsia="zh-CN" w:bidi="ar"/>
+        </w:rPr>
+      </w:pPr>
+      <w:r>
+        <w:rPr>
+          <w:rFonts w:hint="eastAsia" w:ascii="Times New Roman" w:hAnsi="Times New Roman" w:eastAsia="仿宋" w:cs="仿宋"/>
+          <w:color w:val="000000"/>
+          <w:kern w:val="0"/>
+          <w:sz w:val="32"/>
+          <w:szCs w:val="32"/>
+          <w:lang w:val="en-US" w:eastAsia="zh-CN" w:bidi="ar"/>
+        </w:rPr>
+        <w:t>各班人数不相同时，点击“全部参数”，展开“班级安排与时间限制”，在“各班人数”中按班级顺序填写，用英文逗号分隔。填写的项数应与班级数相同，合计人数应等于该年级的就餐人数；留空时，软件按年级总人数均分。图7展示了高一的填写位置，高二、高三采用相同方法。</w:t>
+      </w:r>
+    </w:p>
+    <w:p>
+      <w:pPr>
+        <w:keepNext/>
+        <w:ind w:firstLine="0" w:firstLineChars="0" w:left="0" w:right="0" w:leftChars="0" w:rightChars="0" w:start="0" w:end="0"/>
+        <w:jc w:val="center"/>
+      </w:pPr>
+      <w:r>
+        <w:drawing>
+          <wp:inline xmlns:a="http://schemas.openxmlformats.org/drawingml/2006/main" xmlns:pic="http://schemas.openxmlformats.org/drawingml/2006/picture">
+            <wp:extent cx="5472000" cy="3891200"/>
+            <wp:docPr id="7" name="Picture 7"/>
+            <wp:cNvGraphicFramePr>
+              <a:graphicFrameLocks noChangeAspect="1"/>
+            </wp:cNvGraphicFramePr>
+            <a:graphic>
+              <a:graphicData uri="http://schemas.openxmlformats.org/drawingml/2006/picture">
+                <pic:pic>
+                  <pic:nvPicPr>
+                    <pic:cNvPr id="0" name="24-class-parameters.png"/>
+                    <pic:cNvPicPr/>
+                  </pic:nvPicPr>
+                  <pic:blipFill>
+                    <a:blip r:embed="rId13"/>
+                    <a:stretch>
+                      <a:fillRect/>
+                    </a:stretch>
+                  </pic:blipFill>
+                  <pic:spPr>
+                    <a:xfrm>
+                      <a:off x="0" y="0"/>
+                      <a:ext cx="5472000" cy="3891200"/>
+                    </a:xfrm>
+                    <a:prstGeom prst="rect"/>
+                  </pic:spPr>
+                </pic:pic>
+              </a:graphicData>
+            </a:graphic>
+          </wp:inline>
+        </w:drawing>
+      </w:r>
+    </w:p>
+    <w:p>
+      <w:pPr>
+        <w:keepNext w:val="0"/>
+        <w:keepLines w:val="0"/>
+        <w:pageBreakBefore w:val="0"/>
+        <w:widowControl/>
+        <w:suppressLineNumbers w:val="0"/>
+        <w:kinsoku/>
+        <w:wordWrap/>
+        <w:overflowPunct/>
+        <w:topLinePunct w:val="0"/>
+        <w:autoSpaceDE w:val="0"/>
+        <w:autoSpaceDN w:val="0"/>
+        <w:bidi w:val="0"/>
+        <w:adjustRightInd/>
+        <w:snapToGrid/>
+        <w:spacing w:line="400" w:lineRule="exact"/>
+        <w:ind w:firstLine="0" w:firstLineChars="0" w:left="0" w:right="0" w:leftChars="0" w:rightChars="0" w:start="0" w:end="0"/>
+        <w:jc w:val="center"/>
+        <w:textAlignment w:val="auto"/>
+        <w:rPr>
+          <w:rFonts w:hint="eastAsia" w:ascii="Times New Roman" w:hAnsi="Times New Roman" w:eastAsia="仿宋" w:cs="仿宋"/>
+          <w:color w:val="000000"/>
+          <w:kern w:val="0"/>
+          <w:sz w:val="32"/>
+          <w:szCs w:val="32"/>
+          <w:lang w:val="en-US" w:eastAsia="zh-CN" w:bidi="ar"/>
+        </w:rPr>
+      </w:pPr>
+      <w:r>
+        <w:rPr>
+          <w:rFonts w:hint="eastAsia" w:ascii="Times New Roman" w:hAnsi="Times New Roman" w:eastAsia="仿宋" w:cs="仿宋"/>
+          <w:color w:val="000000"/>
+          <w:kern w:val="0"/>
+          <w:sz w:val="24"/>
+          <w:szCs w:val="32"/>
+          <w:lang w:val="en-US" w:eastAsia="zh-CN" w:bidi="ar"/>
+        </w:rPr>
+        <w:t>图7 各班人数与放行时间设置</w:t>
+      </w:r>
+    </w:p>
+    <w:p>
+      <w:pPr>
+        <w:keepNext w:val="0"/>
+        <w:keepLines w:val="0"/>
+        <w:pageBreakBefore w:val="0"/>
+        <w:widowControl/>
+        <w:suppressLineNumbers w:val="0"/>
+        <w:kinsoku/>
+        <w:wordWrap/>
+        <w:overflowPunct/>
+        <w:topLinePunct w:val="0"/>
+        <w:autoSpaceDE w:val="0"/>
+        <w:autoSpaceDN w:val="0"/>
+        <w:bidi w:val="0"/>
+        <w:adjustRightInd/>
+        <w:snapToGrid/>
+        <w:spacing w:line="560" w:lineRule="exact"/>
+        <w:ind w:firstLine="632" w:firstLineChars="200"/>
+        <w:jc w:val="both"/>
+        <w:textAlignment w:val="auto"/>
+        <w:rPr>
+          <w:rFonts w:hint="eastAsia" w:ascii="Times New Roman" w:hAnsi="Times New Roman" w:eastAsia="仿宋" w:cs="仿宋"/>
+          <w:color w:val="000000"/>
+          <w:kern w:val="0"/>
+          <w:sz w:val="32"/>
+          <w:szCs w:val="32"/>
+          <w:lang w:val="en-US" w:eastAsia="zh-CN" w:bidi="ar"/>
+        </w:rPr>
+      </w:pPr>
+      <w:r>
+        <w:rPr>
+          <w:rFonts w:hint="eastAsia" w:ascii="Times New Roman" w:hAnsi="Times New Roman" w:eastAsia="仿宋" w:cs="仿宋"/>
+          <w:color w:val="000000"/>
+          <w:kern w:val="0"/>
+          <w:sz w:val="32"/>
+          <w:szCs w:val="32"/>
+          <w:lang w:val="en-US" w:eastAsia="zh-CN" w:bidi="ar"/>
+        </w:rPr>
+        <w:t>“全部参数”还可填写平均用餐时间、步行速度和各窗口打饭时间。学校可由年级教师核对人数和课表，由食堂工作人员记录打饭时间、确认窗口和座位数量，再共同完成设置。这样，计算采用的就是本校实际就餐条件。</w:t>
+      </w:r>
+    </w:p>
+    <w:p>
+      <w:pPr>
+        <w:keepNext/>
+        <w:keepLines w:val="0"/>
+        <w:pageBreakBefore w:val="0"/>
+        <w:widowControl/>
+        <w:numPr>
+          <w:ilvl w:val="0"/>
+          <w:numId w:val="0"/>
+        </w:numPr>
+        <w:suppressLineNumbers w:val="0"/>
+        <w:kinsoku/>
+        <w:wordWrap/>
+        <w:overflowPunct/>
+        <w:topLinePunct w:val="0"/>
+        <w:autoSpaceDE w:val="0"/>
+        <w:autoSpaceDN w:val="0"/>
+        <w:bidi w:val="0"/>
+        <w:adjustRightInd/>
+        <w:snapToGrid/>
+        <w:spacing w:line="560" w:lineRule="exact"/>
+        <w:ind w:firstLine="632" w:firstLineChars="200"/>
+        <w:jc w:val="both"/>
+        <w:textAlignment w:val="auto"/>
+        <w:rPr>
+          <w:rFonts w:hint="eastAsia" w:ascii="仿宋_GB2312" w:hAnsi="仿宋_GB2312" w:eastAsia="仿宋_GB2312" w:cs="仿宋_GB2312"/>
+          <w:b/>
+          <w:bCs/>
+          <w:color w:val="000000"/>
+          <w:kern w:val="0"/>
+          <w:sz w:val="32"/>
+          <w:szCs w:val="31"/>
+          <w:lang w:val="en-US" w:eastAsia="zh-CN" w:bidi="ar"/>
+        </w:rPr>
+      </w:pPr>
+      <w:r>
+        <w:rPr>
+          <w:rFonts w:hint="eastAsia" w:ascii="楷体" w:hAnsi="楷体" w:eastAsia="楷体" w:cs="楷体"/>
+          <w:b/>
+          <w:bCs/>
+          <w:color w:val="000000"/>
+          <w:kern w:val="0"/>
+          <w:sz w:val="32"/>
+          <w:szCs w:val="31"/>
+          <w:lang w:val="en-US" w:eastAsia="zh-CN" w:bidi="ar"/>
+        </w:rPr>
+        <w:t>（三）运行方案，查看排队和返回情况</w:t>
+      </w:r>
+    </w:p>
+    <w:p>
+      <w:pPr>
+        <w:keepNext w:val="0"/>
+        <w:keepLines w:val="0"/>
+        <w:pageBreakBefore w:val="0"/>
+        <w:widowControl/>
+        <w:suppressLineNumbers w:val="0"/>
+        <w:kinsoku/>
+        <w:wordWrap/>
+        <w:overflowPunct/>
+        <w:topLinePunct w:val="0"/>
+        <w:autoSpaceDE w:val="0"/>
+        <w:autoSpaceDN w:val="0"/>
+        <w:bidi w:val="0"/>
+        <w:adjustRightInd/>
+        <w:snapToGrid/>
+        <w:spacing w:line="560" w:lineRule="exact"/>
+        <w:ind w:firstLine="632" w:firstLineChars="200"/>
+        <w:jc w:val="both"/>
+        <w:textAlignment w:val="auto"/>
+        <w:rPr>
+          <w:rFonts w:hint="eastAsia" w:ascii="Times New Roman" w:hAnsi="Times New Roman" w:eastAsia="仿宋" w:cs="仿宋"/>
+          <w:color w:val="000000"/>
+          <w:kern w:val="0"/>
+          <w:sz w:val="32"/>
+          <w:szCs w:val="32"/>
+          <w:lang w:val="en-US" w:eastAsia="zh-CN" w:bidi="ar"/>
+        </w:rPr>
+      </w:pPr>
+      <w:r>
+        <w:rPr>
+          <w:rFonts w:hint="eastAsia" w:ascii="Times New Roman" w:hAnsi="Times New Roman" w:eastAsia="仿宋" w:cs="仿宋"/>
+          <w:color w:val="000000"/>
+          <w:kern w:val="0"/>
+          <w:sz w:val="32"/>
+          <w:szCs w:val="32"/>
+          <w:lang w:val="en-US" w:eastAsia="zh-CN" w:bidi="ar"/>
+        </w:rPr>
+        <w:t>点击“开始仿真”后，进入“运行过程”页面。可通过三维回放观察学生排队、取餐、入座和离场，拖动时间条查看不同时刻的情况。点击“查看排队最高峰时刻”可直接定位到队伍最长的时候；点击人物可查看该学生的就餐路线。回放页面见图3。</w:t>
+      </w:r>
+    </w:p>
+    <w:p>
+      <w:pPr>
+        <w:keepNext w:val="0"/>
+        <w:keepLines w:val="0"/>
+        <w:pageBreakBefore w:val="0"/>
+        <w:widowControl/>
+        <w:suppressLineNumbers w:val="0"/>
+        <w:kinsoku/>
+        <w:wordWrap/>
+        <w:overflowPunct/>
+        <w:topLinePunct w:val="0"/>
+        <w:autoSpaceDE w:val="0"/>
+        <w:autoSpaceDN w:val="0"/>
+        <w:bidi w:val="0"/>
+        <w:adjustRightInd/>
+        <w:snapToGrid/>
+        <w:spacing w:line="560" w:lineRule="exact"/>
+        <w:ind w:firstLine="632" w:firstLineChars="200"/>
+        <w:jc w:val="both"/>
+        <w:textAlignment w:val="auto"/>
+        <w:rPr>
+          <w:rFonts w:hint="eastAsia" w:ascii="Times New Roman" w:hAnsi="Times New Roman" w:eastAsia="仿宋" w:cs="仿宋"/>
+          <w:color w:val="000000"/>
+          <w:kern w:val="0"/>
+          <w:sz w:val="32"/>
+          <w:szCs w:val="32"/>
+          <w:lang w:val="en-US" w:eastAsia="zh-CN" w:bidi="ar"/>
+        </w:rPr>
+      </w:pPr>
+      <w:r>
+        <w:rPr>
+          <w:rFonts w:hint="eastAsia" w:ascii="Times New Roman" w:hAnsi="Times New Roman" w:eastAsia="仿宋" w:cs="仿宋"/>
+          <w:color w:val="000000"/>
+          <w:kern w:val="0"/>
+          <w:sz w:val="32"/>
+          <w:szCs w:val="32"/>
+          <w:lang w:val="en-US" w:eastAsia="zh-CN" w:bidi="ar"/>
+        </w:rPr>
+        <w:t>点击“查看结果”进入“仿真结果”页面。先查看平均就餐排队时间，再检查各年级是否按时返回、最后一名学生何时返回教室。图8中的年级统计可帮助学校判断，是否有某个年级等待较久。页面下方还可查看排队人数曲线，鼠标移到曲线上即可读取对应时刻的人数。</w:t>
+      </w:r>
+    </w:p>
+    <w:p>
+      <w:pPr>
+        <w:keepNext/>
+        <w:ind w:firstLine="0" w:firstLineChars="0" w:left="0" w:right="0" w:leftChars="0" w:rightChars="0" w:start="0" w:end="0"/>
+        <w:jc w:val="center"/>
+      </w:pPr>
+      <w:r>
+        <w:drawing>
+          <wp:inline xmlns:a="http://schemas.openxmlformats.org/drawingml/2006/main" xmlns:pic="http://schemas.openxmlformats.org/drawingml/2006/picture">
+            <wp:extent cx="5472000" cy="2736000"/>
+            <wp:docPr id="8" name="Picture 8"/>
+            <wp:cNvGraphicFramePr>
+              <a:graphicFrameLocks noChangeAspect="1"/>
+            </wp:cNvGraphicFramePr>
+            <a:graphic>
+              <a:graphicData uri="http://schemas.openxmlformats.org/drawingml/2006/picture">
+                <pic:pic>
+                  <pic:nvPicPr>
+                    <pic:cNvPr id="0" name="25-usage-results.png"/>
+                    <pic:cNvPicPr/>
+                  </pic:nvPicPr>
+                  <pic:blipFill>
+                    <a:blip r:embed="rId14"/>
+                    <a:stretch>
+                      <a:fillRect/>
+                    </a:stretch>
+                  </pic:blipFill>
+                  <pic:spPr>
+                    <a:xfrm>
+                      <a:off x="0" y="0"/>
+                      <a:ext cx="5472000" cy="2736000"/>
+                    </a:xfrm>
+                    <a:prstGeom prst="rect"/>
+                  </pic:spPr>
+                </pic:pic>
+              </a:graphicData>
+            </a:graphic>
+          </wp:inline>
+        </w:drawing>
+      </w:r>
+    </w:p>
+    <w:p>
+      <w:pPr>
+        <w:keepNext w:val="0"/>
+        <w:keepLines w:val="0"/>
+        <w:pageBreakBefore w:val="0"/>
+        <w:widowControl/>
+        <w:suppressLineNumbers w:val="0"/>
+        <w:kinsoku/>
+        <w:wordWrap/>
+        <w:overflowPunct/>
+        <w:topLinePunct w:val="0"/>
+        <w:autoSpaceDE w:val="0"/>
+        <w:autoSpaceDN w:val="0"/>
+        <w:bidi w:val="0"/>
+        <w:adjustRightInd/>
+        <w:snapToGrid/>
+        <w:spacing w:line="400" w:lineRule="exact"/>
+        <w:ind w:firstLine="0" w:firstLineChars="0" w:left="0" w:right="0" w:leftChars="0" w:rightChars="0" w:start="0" w:end="0"/>
+        <w:jc w:val="center"/>
+        <w:textAlignment w:val="auto"/>
+        <w:rPr>
+          <w:rFonts w:hint="eastAsia" w:ascii="Times New Roman" w:hAnsi="Times New Roman" w:eastAsia="仿宋" w:cs="仿宋"/>
+          <w:color w:val="000000"/>
+          <w:kern w:val="0"/>
+          <w:sz w:val="32"/>
+          <w:szCs w:val="32"/>
+          <w:lang w:val="en-US" w:eastAsia="zh-CN" w:bidi="ar"/>
+        </w:rPr>
+      </w:pPr>
+      <w:r>
+        <w:rPr>
+          <w:rFonts w:hint="eastAsia" w:ascii="Times New Roman" w:hAnsi="Times New Roman" w:eastAsia="仿宋" w:cs="仿宋"/>
+          <w:color w:val="000000"/>
+          <w:kern w:val="0"/>
+          <w:sz w:val="24"/>
+          <w:szCs w:val="32"/>
+          <w:lang w:val="en-US" w:eastAsia="zh-CN" w:bidi="ar"/>
+        </w:rPr>
+        <w:t>图8 就餐结果与各年级用时统计</w:t>
+      </w:r>
+    </w:p>
+    <w:p>
+      <w:pPr>
+        <w:keepNext/>
+        <w:keepLines w:val="0"/>
+        <w:pageBreakBefore w:val="0"/>
+        <w:widowControl/>
+        <w:numPr>
+          <w:ilvl w:val="0"/>
+          <w:numId w:val="0"/>
+        </w:numPr>
+        <w:suppressLineNumbers w:val="0"/>
+        <w:kinsoku/>
+        <w:wordWrap/>
+        <w:overflowPunct/>
+        <w:topLinePunct w:val="0"/>
+        <w:autoSpaceDE w:val="0"/>
+        <w:autoSpaceDN w:val="0"/>
+        <w:bidi w:val="0"/>
+        <w:adjustRightInd/>
+        <w:snapToGrid/>
+        <w:spacing w:line="560" w:lineRule="exact"/>
+        <w:ind w:firstLine="632" w:firstLineChars="200"/>
+        <w:jc w:val="both"/>
+        <w:textAlignment w:val="auto"/>
+        <w:rPr>
+          <w:rFonts w:hint="eastAsia" w:ascii="仿宋_GB2312" w:hAnsi="仿宋_GB2312" w:eastAsia="仿宋_GB2312" w:cs="仿宋_GB2312"/>
+          <w:b/>
+          <w:bCs/>
+          <w:color w:val="000000"/>
+          <w:kern w:val="0"/>
+          <w:sz w:val="32"/>
+          <w:szCs w:val="31"/>
+          <w:lang w:val="en-US" w:eastAsia="zh-CN" w:bidi="ar"/>
+        </w:rPr>
+      </w:pPr>
+      <w:r>
+        <w:rPr>
+          <w:rFonts w:hint="eastAsia" w:ascii="楷体" w:hAnsi="楷体" w:eastAsia="楷体" w:cs="楷体"/>
+          <w:b/>
+          <w:bCs/>
+          <w:color w:val="000000"/>
+          <w:kern w:val="0"/>
+          <w:sz w:val="32"/>
+          <w:szCs w:val="31"/>
+          <w:lang w:val="en-US" w:eastAsia="zh-CN" w:bidi="ar"/>
+        </w:rPr>
+        <w:t>（四）比较方案，导出班级放行表</w:t>
+      </w:r>
+    </w:p>
+    <w:p>
+      <w:pPr>
+        <w:keepNext w:val="0"/>
+        <w:keepLines w:val="0"/>
+        <w:pageBreakBefore w:val="0"/>
+        <w:widowControl/>
+        <w:suppressLineNumbers w:val="0"/>
+        <w:kinsoku/>
+        <w:wordWrap/>
+        <w:overflowPunct/>
+        <w:topLinePunct w:val="0"/>
+        <w:autoSpaceDE w:val="0"/>
+        <w:autoSpaceDN w:val="0"/>
+        <w:bidi w:val="0"/>
+        <w:adjustRightInd/>
+        <w:snapToGrid/>
+        <w:spacing w:line="560" w:lineRule="exact"/>
+        <w:ind w:firstLine="632" w:firstLineChars="200"/>
+        <w:jc w:val="both"/>
+        <w:textAlignment w:val="auto"/>
+        <w:rPr>
+          <w:rFonts w:hint="eastAsia" w:ascii="Times New Roman" w:hAnsi="Times New Roman" w:eastAsia="仿宋" w:cs="仿宋"/>
+          <w:color w:val="000000"/>
+          <w:kern w:val="0"/>
+          <w:sz w:val="32"/>
+          <w:szCs w:val="32"/>
+          <w:lang w:val="en-US" w:eastAsia="zh-CN" w:bidi="ar"/>
+        </w:rPr>
+      </w:pPr>
+      <w:r>
+        <w:rPr>
+          <w:rFonts w:hint="eastAsia" w:ascii="Times New Roman" w:hAnsi="Times New Roman" w:eastAsia="仿宋" w:cs="仿宋"/>
+          <w:color w:val="000000"/>
+          <w:kern w:val="0"/>
+          <w:sz w:val="32"/>
+          <w:szCs w:val="32"/>
+          <w:lang w:val="en-US" w:eastAsia="zh-CN" w:bidi="ar"/>
+        </w:rPr>
+        <w:t>在结果页展开“比较方案与出发间隔”，点击“比较三种安排”。软件会在相同人数、窗口和座位条件下，计算三种安排的平均排队时间，比较结果见图5。随后点击“确定出发间隔”，填写准备比较的间隔秒数，再点击“比较出发间隔”，查看哪一种间隔既能缩短排队，又能让学生按时返回，结果形式见图6。</w:t>
+      </w:r>
+    </w:p>
+    <w:p>
+      <w:pPr>
+        <w:keepNext w:val="0"/>
+        <w:keepLines w:val="0"/>
+        <w:pageBreakBefore w:val="0"/>
+        <w:widowControl/>
+        <w:suppressLineNumbers w:val="0"/>
+        <w:kinsoku/>
+        <w:wordWrap/>
+        <w:overflowPunct/>
+        <w:topLinePunct w:val="0"/>
+        <w:autoSpaceDE w:val="0"/>
+        <w:autoSpaceDN w:val="0"/>
+        <w:bidi w:val="0"/>
+        <w:adjustRightInd/>
+        <w:snapToGrid/>
+        <w:spacing w:line="560" w:lineRule="exact"/>
+        <w:ind w:firstLine="632" w:firstLineChars="200"/>
+        <w:jc w:val="both"/>
+        <w:textAlignment w:val="auto"/>
+        <w:rPr>
+          <w:rFonts w:hint="eastAsia" w:ascii="Times New Roman" w:hAnsi="Times New Roman" w:eastAsia="仿宋" w:cs="仿宋"/>
+          <w:color w:val="000000"/>
+          <w:kern w:val="0"/>
+          <w:sz w:val="32"/>
+          <w:szCs w:val="32"/>
+          <w:lang w:val="en-US" w:eastAsia="zh-CN" w:bidi="ar"/>
+        </w:rPr>
+      </w:pPr>
+      <w:r>
+        <w:rPr>
+          <w:rFonts w:hint="eastAsia" w:ascii="Times New Roman" w:hAnsi="Times New Roman" w:eastAsia="仿宋" w:cs="仿宋"/>
+          <w:color w:val="000000"/>
+          <w:kern w:val="0"/>
+          <w:sz w:val="32"/>
+          <w:szCs w:val="32"/>
+          <w:lang w:val="en-US" w:eastAsia="zh-CN" w:bidi="ar"/>
+        </w:rPr>
+        <w:t>完成比较后，点击“导出所选方案班级放行表”，即可保存包含年级、班序、人数和出发时刻的CSV文件，用Excel打开查看。学校应先核对班序与实际班级的对应关系，再由年级教师和食堂工作人员确认，形成可发布的就餐安排。若人数或食堂条件改变，修改参数后重新计算并导出即可。</w:t>
+      </w:r>
+    </w:p>
+    <w:p>
+      <w:pPr>
+        <w:keepNext/>
+        <w:keepLines w:val="0"/>
+        <w:pageBreakBefore w:val="0"/>
+        <w:widowControl/>
+        <w:numPr>
+          <w:ilvl w:val="0"/>
+          <w:numId w:val="0"/>
+        </w:numPr>
+        <w:suppressLineNumbers w:val="0"/>
+        <w:kinsoku/>
+        <w:wordWrap/>
+        <w:overflowPunct/>
+        <w:topLinePunct w:val="0"/>
+        <w:autoSpaceDE w:val="0"/>
+        <w:autoSpaceDN w:val="0"/>
+        <w:bidi w:val="0"/>
+        <w:adjustRightInd/>
+        <w:snapToGrid/>
+        <w:spacing w:line="560" w:lineRule="exact"/>
+        <w:ind w:firstLine="632" w:firstLineChars="200"/>
+        <w:jc w:val="both"/>
+        <w:textAlignment w:val="auto"/>
+        <w:rPr>
+          <w:rFonts w:hint="eastAsia" w:ascii="仿宋_GB2312" w:hAnsi="仿宋_GB2312" w:eastAsia="仿宋_GB2312" w:cs="仿宋_GB2312"/>
+          <w:b/>
+          <w:bCs/>
+          <w:color w:val="000000"/>
+          <w:kern w:val="0"/>
+          <w:sz w:val="32"/>
+          <w:szCs w:val="31"/>
+          <w:lang w:val="en-US" w:eastAsia="zh-CN" w:bidi="ar"/>
+        </w:rPr>
+      </w:pPr>
+      <w:r>
+        <w:rPr>
+          <w:rFonts w:hint="eastAsia" w:ascii="楷体" w:hAnsi="楷体" w:eastAsia="楷体" w:cs="楷体"/>
+          <w:b/>
+          <w:bCs/>
+          <w:color w:val="000000"/>
+          <w:kern w:val="0"/>
+          <w:sz w:val="32"/>
+          <w:szCs w:val="31"/>
+          <w:lang w:val="en-US" w:eastAsia="zh-CN" w:bidi="ar"/>
+        </w:rPr>
+        <w:t>（五）在学校推广和持续使用</w:t>
+      </w:r>
+    </w:p>
+    <w:p>
+      <w:pPr>
+        <w:keepNext w:val="0"/>
+        <w:keepLines w:val="0"/>
+        <w:pageBreakBefore w:val="0"/>
+        <w:widowControl/>
+        <w:suppressLineNumbers w:val="0"/>
+        <w:kinsoku/>
+        <w:wordWrap/>
+        <w:overflowPunct/>
+        <w:topLinePunct w:val="0"/>
+        <w:autoSpaceDE w:val="0"/>
+        <w:autoSpaceDN w:val="0"/>
+        <w:bidi w:val="0"/>
+        <w:adjustRightInd/>
+        <w:snapToGrid/>
+        <w:spacing w:line="560" w:lineRule="exact"/>
+        <w:ind w:firstLine="632" w:firstLineChars="200"/>
+        <w:jc w:val="both"/>
+        <w:textAlignment w:val="auto"/>
+        <w:rPr>
+          <w:rFonts w:hint="eastAsia" w:ascii="Times New Roman" w:hAnsi="Times New Roman" w:eastAsia="仿宋" w:cs="仿宋"/>
+          <w:color w:val="000000"/>
+          <w:kern w:val="0"/>
+          <w:sz w:val="32"/>
+          <w:szCs w:val="32"/>
+          <w:lang w:val="en-US" w:eastAsia="zh-CN" w:bidi="ar"/>
+        </w:rPr>
+      </w:pPr>
+      <w:r>
+        <w:rPr>
+          <w:rFonts w:hint="eastAsia" w:ascii="Times New Roman" w:hAnsi="Times New Roman" w:eastAsia="仿宋" w:cs="仿宋"/>
+          <w:color w:val="000000"/>
+          <w:kern w:val="0"/>
+          <w:sz w:val="32"/>
+          <w:szCs w:val="32"/>
+          <w:lang w:val="en-US" w:eastAsia="zh-CN" w:bidi="ar"/>
+        </w:rPr>
+        <w:t>推广时，可向学校提供公开网页地址、Windows软件包、使用指南和空白记录表。由一名教师负责维护参数和放行表，食堂工作人员配合更新窗口数量与打饭时间。学校有多个供餐区域时，可先选择一个区域，按该区域的就餐人数和资源进行比较，再逐步应用到其他区域。</w:t>
+      </w:r>
+    </w:p>
+    <w:p>
+      <w:pPr>
+        <w:keepNext w:val="0"/>
+        <w:keepLines w:val="0"/>
+        <w:pageBreakBefore w:val="0"/>
+        <w:widowControl/>
+        <w:suppressLineNumbers w:val="0"/>
+        <w:kinsoku/>
+        <w:wordWrap/>
+        <w:overflowPunct/>
+        <w:topLinePunct w:val="0"/>
+        <w:autoSpaceDE w:val="0"/>
+        <w:autoSpaceDN w:val="0"/>
+        <w:bidi w:val="0"/>
+        <w:adjustRightInd/>
+        <w:snapToGrid/>
+        <w:spacing w:line="560" w:lineRule="exact"/>
+        <w:ind w:firstLine="632" w:firstLineChars="200"/>
+        <w:jc w:val="both"/>
+        <w:textAlignment w:val="auto"/>
+        <w:rPr>
+          <w:rFonts w:hint="eastAsia" w:ascii="Times New Roman" w:hAnsi="Times New Roman" w:eastAsia="仿宋" w:cs="仿宋"/>
+          <w:color w:val="000000"/>
+          <w:kern w:val="0"/>
+          <w:sz w:val="32"/>
+          <w:szCs w:val="32"/>
+          <w:lang w:val="en-US" w:eastAsia="zh-CN" w:bidi="ar"/>
+        </w:rPr>
+      </w:pPr>
+      <w:r>
+        <w:rPr>
+          <w:rFonts w:hint="eastAsia" w:ascii="Times New Roman" w:hAnsi="Times New Roman" w:eastAsia="仿宋" w:cs="仿宋"/>
+          <w:color w:val="000000"/>
+          <w:kern w:val="0"/>
+          <w:sz w:val="32"/>
+          <w:szCs w:val="32"/>
+          <w:lang w:val="en-US" w:eastAsia="zh-CN" w:bidi="ar"/>
+        </w:rPr>
+        <w:t>方案确定后，各班按放行表依次出发，等待出发的学生可在教室安排自习。学校可在就餐人数和菜品相近的午餐日，记录调整前后的排队时间及末批学生返回时刻，并通过简短的匿名反馈了解学生的就餐感受。</w:t>
+      </w:r>
+    </w:p>
+    <w:p>
+      <w:pPr>
+        <w:keepNext w:val="0"/>
+        <w:keepLines w:val="0"/>
+        <w:pageBreakBefore w:val="0"/>
+        <w:widowControl/>
+        <w:suppressLineNumbers w:val="0"/>
+        <w:kinsoku/>
+        <w:wordWrap/>
+        <w:overflowPunct/>
+        <w:topLinePunct w:val="0"/>
+        <w:autoSpaceDE w:val="0"/>
+        <w:autoSpaceDN w:val="0"/>
+        <w:bidi w:val="0"/>
+        <w:adjustRightInd/>
+        <w:snapToGrid/>
+        <w:spacing w:line="560" w:lineRule="exact"/>
+        <w:ind w:firstLine="632" w:firstLineChars="200"/>
+        <w:jc w:val="both"/>
+        <w:textAlignment w:val="auto"/>
+        <w:rPr>
+          <w:rFonts w:hint="eastAsia" w:ascii="Times New Roman" w:hAnsi="Times New Roman" w:eastAsia="仿宋" w:cs="仿宋"/>
+          <w:color w:val="000000"/>
+          <w:kern w:val="0"/>
+          <w:sz w:val="32"/>
+          <w:szCs w:val="32"/>
+          <w:lang w:val="en-US" w:eastAsia="zh-CN" w:bidi="ar"/>
+        </w:rPr>
+      </w:pPr>
+      <w:r>
+        <w:rPr>
+          <w:rFonts w:hint="eastAsia" w:ascii="Times New Roman" w:hAnsi="Times New Roman" w:eastAsia="仿宋" w:cs="仿宋"/>
+          <w:color w:val="000000"/>
+          <w:kern w:val="0"/>
+          <w:sz w:val="32"/>
+          <w:szCs w:val="32"/>
+          <w:lang w:val="en-US" w:eastAsia="zh-CN" w:bidi="ar"/>
+        </w:rPr>
+        <w:t>推广的目标是让学生少排队、有序就餐，把原本用于站队的时间留给自习和休息，减少长时间等待带来的烦躁感。学校根据每天的记录调整间隔，就能持续改进就餐安排；其他高中也可使用同一套工具，填入自己的数据，制定适合本校的方案。</w:t>
       </w:r>
     </w:p>
     <w:sectPr>

</xml_diff>